<commit_message>
Added 2 more major features. Added scope, env, bo&sc sections.
</commit_message>
<xml_diff>
--- a/ReqRepo - Vision and Scope.docx
+++ b/ReqRepo - Vision and Scope.docx
@@ -83,7 +83,7 @@
           <w:r>
             <w:fldChar w:fldCharType="separate"/>
           </w:r>
-          <w:hyperlink w:anchor="_Toc303022329" w:history="1">
+          <w:hyperlink w:anchor="_Toc303807206" w:history="1">
             <w:r>
               <w:rPr>
                 <w:rStyle w:val="Hyperlink"/>
@@ -123,7 +123,7 @@
                 <w:noProof/>
                 <w:webHidden/>
               </w:rPr>
-              <w:instrText xml:space="preserve"> PAGEREF _Toc303022329 \h </w:instrText>
+              <w:instrText xml:space="preserve"> PAGEREF _Toc303807206 \h </w:instrText>
             </w:r>
             <w:r>
               <w:rPr>
@@ -165,7 +165,7 @@
               <w:noProof/>
             </w:rPr>
           </w:pPr>
-          <w:hyperlink w:anchor="_Toc303022330" w:history="1">
+          <w:hyperlink w:anchor="_Toc303807207" w:history="1">
             <w:r>
               <w:rPr>
                 <w:rStyle w:val="Hyperlink"/>
@@ -205,7 +205,7 @@
                 <w:noProof/>
                 <w:webHidden/>
               </w:rPr>
-              <w:instrText xml:space="preserve"> PAGEREF _Toc303022330 \h </w:instrText>
+              <w:instrText xml:space="preserve"> PAGEREF _Toc303807207 \h </w:instrText>
             </w:r>
             <w:r>
               <w:rPr>
@@ -247,7 +247,7 @@
               <w:noProof/>
             </w:rPr>
           </w:pPr>
-          <w:hyperlink w:anchor="_Toc303022331" w:history="1">
+          <w:hyperlink w:anchor="_Toc303807208" w:history="1">
             <w:r>
               <w:rPr>
                 <w:rStyle w:val="Hyperlink"/>
@@ -287,7 +287,7 @@
                 <w:noProof/>
                 <w:webHidden/>
               </w:rPr>
-              <w:instrText xml:space="preserve"> PAGEREF _Toc303022331 \h </w:instrText>
+              <w:instrText xml:space="preserve"> PAGEREF _Toc303807208 \h </w:instrText>
             </w:r>
             <w:r>
               <w:rPr>
@@ -329,7 +329,7 @@
               <w:noProof/>
             </w:rPr>
           </w:pPr>
-          <w:hyperlink w:anchor="_Toc303022332" w:history="1">
+          <w:hyperlink w:anchor="_Toc303807209" w:history="1">
             <w:r>
               <w:rPr>
                 <w:rStyle w:val="Hyperlink"/>
@@ -369,7 +369,7 @@
                 <w:noProof/>
                 <w:webHidden/>
               </w:rPr>
-              <w:instrText xml:space="preserve"> PAGEREF _Toc303022332 \h </w:instrText>
+              <w:instrText xml:space="preserve"> PAGEREF _Toc303807209 \h </w:instrText>
             </w:r>
             <w:r>
               <w:rPr>
@@ -411,7 +411,7 @@
               <w:noProof/>
             </w:rPr>
           </w:pPr>
-          <w:hyperlink w:anchor="_Toc303022333" w:history="1">
+          <w:hyperlink w:anchor="_Toc303807210" w:history="1">
             <w:r>
               <w:rPr>
                 <w:rStyle w:val="Hyperlink"/>
@@ -451,7 +451,7 @@
                 <w:noProof/>
                 <w:webHidden/>
               </w:rPr>
-              <w:instrText xml:space="preserve"> PAGEREF _Toc303022333 \h </w:instrText>
+              <w:instrText xml:space="preserve"> PAGEREF _Toc303807210 \h </w:instrText>
             </w:r>
             <w:r>
               <w:rPr>
@@ -471,7 +471,7 @@
                 <w:noProof/>
                 <w:webHidden/>
               </w:rPr>
-              <w:t>2</w:t>
+              <w:t>3</w:t>
             </w:r>
             <w:r>
               <w:rPr>
@@ -493,7 +493,7 @@
               <w:noProof/>
             </w:rPr>
           </w:pPr>
-          <w:hyperlink w:anchor="_Toc303022334" w:history="1">
+          <w:hyperlink w:anchor="_Toc303807211" w:history="1">
             <w:r>
               <w:rPr>
                 <w:rStyle w:val="Hyperlink"/>
@@ -533,7 +533,7 @@
                 <w:noProof/>
                 <w:webHidden/>
               </w:rPr>
-              <w:instrText xml:space="preserve"> PAGEREF _Toc303022334 \h </w:instrText>
+              <w:instrText xml:space="preserve"> PAGEREF _Toc303807211 \h </w:instrText>
             </w:r>
             <w:r>
               <w:rPr>
@@ -553,7 +553,7 @@
                 <w:noProof/>
                 <w:webHidden/>
               </w:rPr>
-              <w:t>2</w:t>
+              <w:t>3</w:t>
             </w:r>
             <w:r>
               <w:rPr>
@@ -575,7 +575,7 @@
               <w:noProof/>
             </w:rPr>
           </w:pPr>
-          <w:hyperlink w:anchor="_Toc303022335" w:history="1">
+          <w:hyperlink w:anchor="_Toc303807212" w:history="1">
             <w:r>
               <w:rPr>
                 <w:rStyle w:val="Hyperlink"/>
@@ -615,7 +615,7 @@
                 <w:noProof/>
                 <w:webHidden/>
               </w:rPr>
-              <w:instrText xml:space="preserve"> PAGEREF _Toc303022335 \h </w:instrText>
+              <w:instrText xml:space="preserve"> PAGEREF _Toc303807212 \h </w:instrText>
             </w:r>
             <w:r>
               <w:rPr>
@@ -657,7 +657,7 @@
               <w:noProof/>
             </w:rPr>
           </w:pPr>
-          <w:hyperlink w:anchor="_Toc303022336" w:history="1">
+          <w:hyperlink w:anchor="_Toc303807213" w:history="1">
             <w:r>
               <w:rPr>
                 <w:rStyle w:val="Hyperlink"/>
@@ -697,7 +697,7 @@
                 <w:noProof/>
                 <w:webHidden/>
               </w:rPr>
-              <w:instrText xml:space="preserve"> PAGEREF _Toc303022336 \h </w:instrText>
+              <w:instrText xml:space="preserve"> PAGEREF _Toc303807213 \h </w:instrText>
             </w:r>
             <w:r>
               <w:rPr>
@@ -739,7 +739,7 @@
               <w:noProof/>
             </w:rPr>
           </w:pPr>
-          <w:hyperlink w:anchor="_Toc303022337" w:history="1">
+          <w:hyperlink w:anchor="_Toc303807214" w:history="1">
             <w:r>
               <w:rPr>
                 <w:rStyle w:val="Hyperlink"/>
@@ -779,7 +779,7 @@
                 <w:noProof/>
                 <w:webHidden/>
               </w:rPr>
-              <w:instrText xml:space="preserve"> PAGEREF _Toc303022337 \h </w:instrText>
+              <w:instrText xml:space="preserve"> PAGEREF _Toc303807214 \h </w:instrText>
             </w:r>
             <w:r>
               <w:rPr>
@@ -821,7 +821,7 @@
               <w:noProof/>
             </w:rPr>
           </w:pPr>
-          <w:hyperlink w:anchor="_Toc303022338" w:history="1">
+          <w:hyperlink w:anchor="_Toc303807215" w:history="1">
             <w:r>
               <w:rPr>
                 <w:rStyle w:val="Hyperlink"/>
@@ -861,7 +861,7 @@
                 <w:noProof/>
                 <w:webHidden/>
               </w:rPr>
-              <w:instrText xml:space="preserve"> PAGEREF _Toc303022338 \h </w:instrText>
+              <w:instrText xml:space="preserve"> PAGEREF _Toc303807215 \h </w:instrText>
             </w:r>
             <w:r>
               <w:rPr>
@@ -881,7 +881,7 @@
                 <w:noProof/>
                 <w:webHidden/>
               </w:rPr>
-              <w:t>3</w:t>
+              <w:t>4</w:t>
             </w:r>
             <w:r>
               <w:rPr>
@@ -903,7 +903,7 @@
               <w:noProof/>
             </w:rPr>
           </w:pPr>
-          <w:hyperlink w:anchor="_Toc303022339" w:history="1">
+          <w:hyperlink w:anchor="_Toc303807216" w:history="1">
             <w:r>
               <w:rPr>
                 <w:rStyle w:val="Hyperlink"/>
@@ -943,7 +943,7 @@
                 <w:noProof/>
                 <w:webHidden/>
               </w:rPr>
-              <w:instrText xml:space="preserve"> PAGEREF _Toc303022339 \h </w:instrText>
+              <w:instrText xml:space="preserve"> PAGEREF _Toc303807216 \h </w:instrText>
             </w:r>
             <w:r>
               <w:rPr>
@@ -985,7 +985,7 @@
               <w:noProof/>
             </w:rPr>
           </w:pPr>
-          <w:hyperlink w:anchor="_Toc303022340" w:history="1">
+          <w:hyperlink w:anchor="_Toc303807217" w:history="1">
             <w:r>
               <w:rPr>
                 <w:rStyle w:val="Hyperlink"/>
@@ -1025,7 +1025,7 @@
                 <w:noProof/>
                 <w:webHidden/>
               </w:rPr>
-              <w:instrText xml:space="preserve"> PAGEREF _Toc303022340 \h </w:instrText>
+              <w:instrText xml:space="preserve"> PAGEREF _Toc303807217 \h </w:instrText>
             </w:r>
             <w:r>
               <w:rPr>
@@ -1067,7 +1067,7 @@
               <w:noProof/>
             </w:rPr>
           </w:pPr>
-          <w:hyperlink w:anchor="_Toc303022341" w:history="1">
+          <w:hyperlink w:anchor="_Toc303807218" w:history="1">
             <w:r>
               <w:rPr>
                 <w:rStyle w:val="Hyperlink"/>
@@ -1107,7 +1107,7 @@
                 <w:noProof/>
                 <w:webHidden/>
               </w:rPr>
-              <w:instrText xml:space="preserve"> PAGEREF _Toc303022341 \h </w:instrText>
+              <w:instrText xml:space="preserve"> PAGEREF _Toc303807218 \h </w:instrText>
             </w:r>
             <w:r>
               <w:rPr>
@@ -1127,7 +1127,7 @@
                 <w:noProof/>
                 <w:webHidden/>
               </w:rPr>
-              <w:t>4</w:t>
+              <w:t>5</w:t>
             </w:r>
             <w:r>
               <w:rPr>
@@ -1149,7 +1149,7 @@
               <w:noProof/>
             </w:rPr>
           </w:pPr>
-          <w:hyperlink w:anchor="_Toc303022342" w:history="1">
+          <w:hyperlink w:anchor="_Toc303807219" w:history="1">
             <w:r>
               <w:rPr>
                 <w:rStyle w:val="Hyperlink"/>
@@ -1189,7 +1189,7 @@
                 <w:noProof/>
                 <w:webHidden/>
               </w:rPr>
-              <w:instrText xml:space="preserve"> PAGEREF _Toc303022342 \h </w:instrText>
+              <w:instrText xml:space="preserve"> PAGEREF _Toc303807219 \h </w:instrText>
             </w:r>
             <w:r>
               <w:rPr>
@@ -1209,7 +1209,7 @@
                 <w:noProof/>
                 <w:webHidden/>
               </w:rPr>
-              <w:t>4</w:t>
+              <w:t>5</w:t>
             </w:r>
             <w:r>
               <w:rPr>
@@ -1231,7 +1231,7 @@
               <w:noProof/>
             </w:rPr>
           </w:pPr>
-          <w:hyperlink w:anchor="_Toc303022343" w:history="1">
+          <w:hyperlink w:anchor="_Toc303807220" w:history="1">
             <w:r>
               <w:rPr>
                 <w:rStyle w:val="Hyperlink"/>
@@ -1271,7 +1271,7 @@
                 <w:noProof/>
                 <w:webHidden/>
               </w:rPr>
-              <w:instrText xml:space="preserve"> PAGEREF _Toc303022343 \h </w:instrText>
+              <w:instrText xml:space="preserve"> PAGEREF _Toc303807220 \h </w:instrText>
             </w:r>
             <w:r>
               <w:rPr>
@@ -1291,7 +1291,7 @@
                 <w:noProof/>
                 <w:webHidden/>
               </w:rPr>
-              <w:t>4</w:t>
+              <w:t>5</w:t>
             </w:r>
             <w:r>
               <w:rPr>
@@ -1313,7 +1313,7 @@
               <w:noProof/>
             </w:rPr>
           </w:pPr>
-          <w:hyperlink w:anchor="_Toc303022344" w:history="1">
+          <w:hyperlink w:anchor="_Toc303807221" w:history="1">
             <w:r>
               <w:rPr>
                 <w:rStyle w:val="Hyperlink"/>
@@ -1353,7 +1353,7 @@
                 <w:noProof/>
                 <w:webHidden/>
               </w:rPr>
-              <w:instrText xml:space="preserve"> PAGEREF _Toc303022344 \h </w:instrText>
+              <w:instrText xml:space="preserve"> PAGEREF _Toc303807221 \h </w:instrText>
             </w:r>
             <w:r>
               <w:rPr>
@@ -1373,7 +1373,7 @@
                 <w:noProof/>
                 <w:webHidden/>
               </w:rPr>
-              <w:t>4</w:t>
+              <w:t>5</w:t>
             </w:r>
             <w:r>
               <w:rPr>
@@ -1395,7 +1395,7 @@
               <w:noProof/>
             </w:rPr>
           </w:pPr>
-          <w:hyperlink w:anchor="_Toc303022345" w:history="1">
+          <w:hyperlink w:anchor="_Toc303807222" w:history="1">
             <w:r>
               <w:rPr>
                 <w:rStyle w:val="Hyperlink"/>
@@ -1435,7 +1435,7 @@
                 <w:noProof/>
                 <w:webHidden/>
               </w:rPr>
-              <w:instrText xml:space="preserve"> PAGEREF _Toc303022345 \h </w:instrText>
+              <w:instrText xml:space="preserve"> PAGEREF _Toc303807222 \h </w:instrText>
             </w:r>
             <w:r>
               <w:rPr>
@@ -1455,7 +1455,7 @@
                 <w:noProof/>
                 <w:webHidden/>
               </w:rPr>
-              <w:t>4</w:t>
+              <w:t>5</w:t>
             </w:r>
             <w:r>
               <w:rPr>
@@ -1503,7 +1503,7 @@
           <w:numId w:val="11"/>
         </w:numPr>
       </w:pPr>
-      <w:bookmarkStart w:id="0" w:name="_Toc303022329"/>
+      <w:bookmarkStart w:id="0" w:name="_Toc303807206"/>
       <w:r>
         <w:lastRenderedPageBreak/>
         <w:t>Business Requirements</w:t>
@@ -1519,7 +1519,7 @@
         </w:numPr>
         <w:ind w:left="431" w:hanging="431"/>
       </w:pPr>
-      <w:bookmarkStart w:id="1" w:name="_Toc303022330"/>
+      <w:bookmarkStart w:id="1" w:name="_Toc303807207"/>
       <w:r>
         <w:t>Background</w:t>
       </w:r>
@@ -1583,7 +1583,7 @@
         </w:numPr>
         <w:ind w:left="431" w:hanging="431"/>
       </w:pPr>
-      <w:bookmarkStart w:id="2" w:name="_Toc303022331"/>
+      <w:bookmarkStart w:id="2" w:name="_Toc303807208"/>
       <w:r>
         <w:t>Business Opportunity</w:t>
       </w:r>
@@ -1819,11 +1819,16 @@
         </w:numPr>
         <w:ind w:left="431" w:hanging="431"/>
       </w:pPr>
-      <w:bookmarkStart w:id="3" w:name="_Toc303022332"/>
+      <w:bookmarkStart w:id="3" w:name="_Toc303807209"/>
       <w:r>
         <w:t>Business Objectives and Success Criteria</w:t>
       </w:r>
       <w:bookmarkEnd w:id="3"/>
+    </w:p>
+    <w:p>
+      <w:r>
+        <w:t>&lt;TODO&gt;</w:t>
+      </w:r>
     </w:p>
     <w:tbl>
       <w:tblPr>
@@ -1848,7 +1853,11 @@
             </w:tcBorders>
             <w:shd w:val="clear" w:color="auto" w:fill="B8CCE4" w:themeFill="accent1" w:themeFillTint="66"/>
           </w:tcPr>
-          <w:p/>
+          <w:p>
+            <w:r>
+              <w:t>BO-1</w:t>
+            </w:r>
+          </w:p>
         </w:tc>
         <w:tc>
           <w:tcPr>
@@ -1861,6 +1870,9 @@
             <w:pPr>
               <w:cnfStyle w:val="000000100000" w:firstRow="0" w:lastRow="0" w:firstColumn="0" w:lastColumn="0" w:oddVBand="0" w:evenVBand="0" w:oddHBand="1" w:evenHBand="0" w:firstRowFirstColumn="0" w:firstRowLastColumn="0" w:lastRowFirstColumn="0" w:lastRowLastColumn="0"/>
             </w:pPr>
+            <w:r>
+              <w:t>Host online and get free users.</w:t>
+            </w:r>
           </w:p>
         </w:tc>
       </w:tr>
@@ -1876,7 +1888,11 @@
             </w:tcBorders>
             <w:shd w:val="clear" w:color="auto" w:fill="B8CCE4" w:themeFill="accent1" w:themeFillTint="66"/>
           </w:tcPr>
-          <w:p/>
+          <w:p>
+            <w:r>
+              <w:t>BO-2</w:t>
+            </w:r>
+          </w:p>
         </w:tc>
         <w:tc>
           <w:tcPr>
@@ -1889,6 +1905,13 @@
             <w:pPr>
               <w:cnfStyle w:val="000000000000" w:firstRow="0" w:lastRow="0" w:firstColumn="0" w:lastColumn="0" w:oddVBand="0" w:evenVBand="0" w:oddHBand="0" w:evenHBand="0" w:firstRowFirstColumn="0" w:firstRowLastColumn="0" w:lastRowFirstColumn="0" w:lastRowLastColumn="0"/>
             </w:pPr>
+            <w:r>
+              <w:t xml:space="preserve">Introduce multi-tier subscription model that provided limits on various metrics: </w:t>
+            </w:r>
+            <w:r>
+              <w:lastRenderedPageBreak/>
+              <w:t>&lt;TODO&gt; bandwidth, CPU, users, reviewers, editors, features, storage.</w:t>
+            </w:r>
           </w:p>
         </w:tc>
       </w:tr>
@@ -1905,7 +1928,12 @@
             </w:tcBorders>
             <w:shd w:val="clear" w:color="auto" w:fill="B8CCE4" w:themeFill="accent1" w:themeFillTint="66"/>
           </w:tcPr>
-          <w:p/>
+          <w:p>
+            <w:r>
+              <w:lastRenderedPageBreak/>
+              <w:t>BO-3</w:t>
+            </w:r>
+          </w:p>
         </w:tc>
         <w:tc>
           <w:tcPr>
@@ -1918,6 +1946,9 @@
             <w:pPr>
               <w:cnfStyle w:val="000000100000" w:firstRow="0" w:lastRow="0" w:firstColumn="0" w:lastColumn="0" w:oddVBand="0" w:evenVBand="0" w:oddHBand="1" w:evenHBand="0" w:firstRowFirstColumn="0" w:firstRowLastColumn="0" w:lastRowFirstColumn="0" w:lastRowLastColumn="0"/>
             </w:pPr>
+            <w:r>
+              <w:t>Sell software for non-public use.</w:t>
+            </w:r>
           </w:p>
         </w:tc>
       </w:tr>
@@ -1933,7 +1964,11 @@
             </w:tcBorders>
             <w:shd w:val="clear" w:color="auto" w:fill="B8CCE4" w:themeFill="accent1" w:themeFillTint="66"/>
           </w:tcPr>
-          <w:p/>
+          <w:p>
+            <w:r>
+              <w:t>SC-1</w:t>
+            </w:r>
+          </w:p>
         </w:tc>
         <w:tc>
           <w:tcPr>
@@ -1946,6 +1981,45 @@
             <w:pPr>
               <w:cnfStyle w:val="000000000000" w:firstRow="0" w:lastRow="0" w:firstColumn="0" w:lastColumn="0" w:oddVBand="0" w:evenVBand="0" w:oddHBand="0" w:evenHBand="0" w:firstRowFirstColumn="0" w:firstRowLastColumn="0" w:lastRowFirstColumn="0" w:lastRowLastColumn="0"/>
             </w:pPr>
+            <w:r>
+              <w:t>Users continue to use system 6 months after signing up.</w:t>
+            </w:r>
+          </w:p>
+        </w:tc>
+      </w:tr>
+      <w:tr>
+        <w:trPr>
+          <w:cnfStyle w:val="000000100000" w:firstRow="0" w:lastRow="0" w:firstColumn="0" w:lastColumn="0" w:oddVBand="0" w:evenVBand="0" w:oddHBand="1" w:evenHBand="0" w:firstRowFirstColumn="0" w:firstRowLastColumn="0" w:lastRowFirstColumn="0" w:lastRowLastColumn="0"/>
+        </w:trPr>
+        <w:tc>
+          <w:tcPr>
+            <w:cnfStyle w:val="001000000000" w:firstRow="0" w:lastRow="0" w:firstColumn="1" w:lastColumn="0" w:oddVBand="0" w:evenVBand="0" w:oddHBand="0" w:evenHBand="0" w:firstRowFirstColumn="0" w:firstRowLastColumn="0" w:lastRowFirstColumn="0" w:lastRowLastColumn="0"/>
+            <w:tcW w:w="817" w:type="dxa"/>
+            <w:tcBorders>
+              <w:right w:val="single" w:sz="8" w:space="0" w:color="4F81BD" w:themeColor="accent1"/>
+            </w:tcBorders>
+            <w:shd w:val="clear" w:color="auto" w:fill="B8CCE4" w:themeFill="accent1" w:themeFillTint="66"/>
+          </w:tcPr>
+          <w:p>
+            <w:r>
+              <w:t>SC-2</w:t>
+            </w:r>
+          </w:p>
+        </w:tc>
+        <w:tc>
+          <w:tcPr>
+            <w:tcW w:w="7903" w:type="dxa"/>
+            <w:tcBorders>
+              <w:left w:val="single" w:sz="8" w:space="0" w:color="4F81BD" w:themeColor="accent1"/>
+            </w:tcBorders>
+          </w:tcPr>
+          <w:p>
+            <w:pPr>
+              <w:cnfStyle w:val="000000100000" w:firstRow="0" w:lastRow="0" w:firstColumn="0" w:lastColumn="0" w:oddVBand="0" w:evenVBand="0" w:oddHBand="1" w:evenHBand="0" w:firstRowFirstColumn="0" w:firstRowLastColumn="0" w:lastRowFirstColumn="0" w:lastRowLastColumn="0"/>
+            </w:pPr>
+            <w:r>
+              <w:t>Receive more revenue from subscriptions than the cost of hosting for 6 consecutive months.</w:t>
+            </w:r>
           </w:p>
         </w:tc>
       </w:tr>
@@ -1960,7 +2034,7 @@
         </w:numPr>
         <w:ind w:left="431" w:hanging="431"/>
       </w:pPr>
-      <w:bookmarkStart w:id="4" w:name="_Toc303022333"/>
+      <w:bookmarkStart w:id="4" w:name="_Toc303807210"/>
       <w:r>
         <w:t>Customer or Market Needs</w:t>
       </w:r>
@@ -1980,7 +2054,7 @@
         </w:numPr>
         <w:ind w:left="431" w:hanging="431"/>
       </w:pPr>
-      <w:bookmarkStart w:id="5" w:name="_Toc303022334"/>
+      <w:bookmarkStart w:id="5" w:name="_Toc303807211"/>
       <w:r>
         <w:t>Business Risks</w:t>
       </w:r>
@@ -2124,6 +2198,9 @@
             <w:pPr>
               <w:cnfStyle w:val="000000000000" w:firstRow="0" w:lastRow="0" w:firstColumn="0" w:lastColumn="0" w:oddVBand="0" w:evenVBand="0" w:oddHBand="0" w:evenHBand="0" w:firstRowFirstColumn="0" w:firstRowLastColumn="0" w:lastRowFirstColumn="0" w:lastRowLastColumn="0"/>
             </w:pPr>
+            <w:r>
+              <w:t>Businesses might be dissuaded by a lack of support.</w:t>
+            </w:r>
           </w:p>
         </w:tc>
         <w:tc>
@@ -2238,7 +2315,7 @@
           <w:numId w:val="11"/>
         </w:numPr>
       </w:pPr>
-      <w:bookmarkStart w:id="6" w:name="_Toc303022335"/>
+      <w:bookmarkStart w:id="6" w:name="_Toc303807212"/>
       <w:r>
         <w:t>Vision of the Solution</w:t>
       </w:r>
@@ -2253,7 +2330,7 @@
         </w:numPr>
         <w:ind w:left="431" w:hanging="431"/>
       </w:pPr>
-      <w:bookmarkStart w:id="7" w:name="_Toc303022336"/>
+      <w:bookmarkStart w:id="7" w:name="_Toc303807213"/>
       <w:r>
         <w:t>Vision Statement</w:t>
       </w:r>
@@ -2266,6 +2343,153 @@
     </w:p>
     <w:p>
       <w:pPr>
+        <w:numPr>
+          <w:ilvl w:val="0"/>
+          <w:numId w:val="14"/>
+        </w:numPr>
+        <w:spacing w:before="100" w:beforeAutospacing="1" w:after="100" w:afterAutospacing="1" w:line="240" w:lineRule="auto"/>
+        <w:textAlignment w:val="baseline"/>
+        <w:rPr>
+          <w:rFonts w:ascii="Arial" w:eastAsia="Times New Roman" w:hAnsi="Arial" w:cs="Arial"/>
+          <w:color w:val="000000"/>
+        </w:rPr>
+      </w:pPr>
+      <w:r>
+        <w:rPr>
+          <w:rFonts w:ascii="Arial" w:eastAsia="Times New Roman" w:hAnsi="Arial" w:cs="Arial"/>
+          <w:color w:val="000000"/>
+        </w:rPr>
+        <w:t>For [target customer]</w:t>
+      </w:r>
+    </w:p>
+    <w:p>
+      <w:pPr>
+        <w:numPr>
+          <w:ilvl w:val="0"/>
+          <w:numId w:val="14"/>
+        </w:numPr>
+        <w:spacing w:before="100" w:beforeAutospacing="1" w:after="100" w:afterAutospacing="1" w:line="240" w:lineRule="auto"/>
+        <w:textAlignment w:val="baseline"/>
+        <w:rPr>
+          <w:rFonts w:ascii="Arial" w:eastAsia="Times New Roman" w:hAnsi="Arial" w:cs="Arial"/>
+          <w:color w:val="000000"/>
+        </w:rPr>
+      </w:pPr>
+      <w:r>
+        <w:rPr>
+          <w:rFonts w:ascii="Arial" w:eastAsia="Times New Roman" w:hAnsi="Arial" w:cs="Arial"/>
+          <w:color w:val="000000"/>
+        </w:rPr>
+        <w:t>Who [statement of the need or opportunity]</w:t>
+      </w:r>
+    </w:p>
+    <w:p>
+      <w:pPr>
+        <w:numPr>
+          <w:ilvl w:val="0"/>
+          <w:numId w:val="14"/>
+        </w:numPr>
+        <w:spacing w:before="100" w:beforeAutospacing="1" w:after="100" w:afterAutospacing="1" w:line="240" w:lineRule="auto"/>
+        <w:textAlignment w:val="baseline"/>
+        <w:rPr>
+          <w:rFonts w:ascii="Arial" w:eastAsia="Times New Roman" w:hAnsi="Arial" w:cs="Arial"/>
+          <w:color w:val="000000"/>
+        </w:rPr>
+      </w:pPr>
+      <w:r>
+        <w:rPr>
+          <w:rFonts w:ascii="Arial" w:eastAsia="Times New Roman" w:hAnsi="Arial" w:cs="Arial"/>
+          <w:color w:val="000000"/>
+        </w:rPr>
+        <w:t>The [product name]</w:t>
+      </w:r>
+    </w:p>
+    <w:p>
+      <w:pPr>
+        <w:numPr>
+          <w:ilvl w:val="0"/>
+          <w:numId w:val="14"/>
+        </w:numPr>
+        <w:spacing w:before="100" w:beforeAutospacing="1" w:after="100" w:afterAutospacing="1" w:line="240" w:lineRule="auto"/>
+        <w:textAlignment w:val="baseline"/>
+        <w:rPr>
+          <w:rFonts w:ascii="Arial" w:eastAsia="Times New Roman" w:hAnsi="Arial" w:cs="Arial"/>
+          <w:color w:val="000000"/>
+        </w:rPr>
+      </w:pPr>
+      <w:r>
+        <w:rPr>
+          <w:rFonts w:ascii="Arial" w:eastAsia="Times New Roman" w:hAnsi="Arial" w:cs="Arial"/>
+          <w:color w:val="000000"/>
+        </w:rPr>
+        <w:t>Is [a product category]</w:t>
+      </w:r>
+    </w:p>
+    <w:p>
+      <w:pPr>
+        <w:numPr>
+          <w:ilvl w:val="0"/>
+          <w:numId w:val="14"/>
+        </w:numPr>
+        <w:spacing w:before="100" w:beforeAutospacing="1" w:after="100" w:afterAutospacing="1" w:line="240" w:lineRule="auto"/>
+        <w:textAlignment w:val="baseline"/>
+        <w:rPr>
+          <w:rFonts w:ascii="Arial" w:eastAsia="Times New Roman" w:hAnsi="Arial" w:cs="Arial"/>
+          <w:color w:val="000000"/>
+        </w:rPr>
+      </w:pPr>
+      <w:r>
+        <w:rPr>
+          <w:rFonts w:ascii="Arial" w:eastAsia="Times New Roman" w:hAnsi="Arial" w:cs="Arial"/>
+          <w:color w:val="000000"/>
+        </w:rPr>
+        <w:t>That [key benefit, compelling reason to buy or use]</w:t>
+      </w:r>
+    </w:p>
+    <w:p>
+      <w:pPr>
+        <w:numPr>
+          <w:ilvl w:val="0"/>
+          <w:numId w:val="14"/>
+        </w:numPr>
+        <w:spacing w:before="100" w:beforeAutospacing="1" w:after="100" w:afterAutospacing="1" w:line="240" w:lineRule="auto"/>
+        <w:textAlignment w:val="baseline"/>
+        <w:rPr>
+          <w:rFonts w:ascii="Arial" w:eastAsia="Times New Roman" w:hAnsi="Arial" w:cs="Arial"/>
+          <w:color w:val="000000"/>
+        </w:rPr>
+      </w:pPr>
+      <w:r>
+        <w:rPr>
+          <w:rFonts w:ascii="Arial" w:eastAsia="Times New Roman" w:hAnsi="Arial" w:cs="Arial"/>
+          <w:color w:val="000000"/>
+        </w:rPr>
+        <w:t>Unlike [primary competitive alternative, current system, or current business process],</w:t>
+      </w:r>
+    </w:p>
+    <w:p>
+      <w:pPr>
+        <w:numPr>
+          <w:ilvl w:val="0"/>
+          <w:numId w:val="14"/>
+        </w:numPr>
+        <w:spacing w:before="100" w:beforeAutospacing="1" w:after="100" w:afterAutospacing="1" w:line="240" w:lineRule="auto"/>
+        <w:textAlignment w:val="baseline"/>
+        <w:rPr>
+          <w:rFonts w:ascii="Arial" w:eastAsia="Times New Roman" w:hAnsi="Arial" w:cs="Arial"/>
+          <w:color w:val="000000"/>
+        </w:rPr>
+      </w:pPr>
+      <w:r>
+        <w:rPr>
+          <w:rFonts w:ascii="Arial" w:eastAsia="Times New Roman" w:hAnsi="Arial" w:cs="Arial"/>
+          <w:color w:val="000000"/>
+        </w:rPr>
+        <w:t>Our product [statement of primary differentiation and advantages of new product].</w:t>
+      </w:r>
+    </w:p>
+    <w:p>
+      <w:pPr>
         <w:pStyle w:val="Heading2"/>
         <w:numPr>
           <w:ilvl w:val="1"/>
@@ -2273,7 +2497,7 @@
         </w:numPr>
         <w:ind w:left="431" w:hanging="431"/>
       </w:pPr>
-      <w:bookmarkStart w:id="8" w:name="_Toc303022337"/>
+      <w:bookmarkStart w:id="8" w:name="_Toc303807214"/>
       <w:r>
         <w:t>Major Features</w:t>
       </w:r>
@@ -2466,12 +2690,7 @@
               <w:cnfStyle w:val="000000100000" w:firstRow="0" w:lastRow="0" w:firstColumn="0" w:lastColumn="0" w:oddVBand="0" w:evenVBand="0" w:oddHBand="1" w:evenHBand="0" w:firstRowFirstColumn="0" w:firstRowLastColumn="0" w:lastRowFirstColumn="0" w:lastRowLastColumn="0"/>
             </w:pPr>
             <w:r>
-              <w:t>Hover over a key to see the definition; click a key to open the defining document; assistance when creating new refe</w:t>
-            </w:r>
-            <w:bookmarkStart w:id="9" w:name="_GoBack"/>
-            <w:bookmarkEnd w:id="9"/>
-            <w:r>
-              <w:t>rences (possibly auto-complete, UI to select from available)</w:t>
+              <w:t>Hover over a key to see the definition; click a key to open the defining document; assistance when creating new references (possibly auto-complete, UI to select from available)</w:t>
             </w:r>
           </w:p>
         </w:tc>
@@ -2542,6 +2761,8 @@
             <w:r>
               <w:t>View a map of all document references.</w:t>
             </w:r>
+            <w:bookmarkStart w:id="9" w:name="_GoBack"/>
+            <w:bookmarkEnd w:id="9"/>
           </w:p>
         </w:tc>
       </w:tr>
@@ -2557,6 +2778,7 @@
           </w:tcPr>
           <w:p>
             <w:r>
+              <w:lastRenderedPageBreak/>
               <w:t>MF-8</w:t>
             </w:r>
           </w:p>
@@ -2670,10 +2892,7 @@
           </w:tcPr>
           <w:p>
             <w:r>
-              <w:t>MF-1</w:t>
-            </w:r>
-            <w:r>
-              <w:t>1</w:t>
+              <w:t>MF-11</w:t>
             </w:r>
           </w:p>
         </w:tc>
@@ -2706,10 +2925,7 @@
           </w:tcPr>
           <w:p>
             <w:r>
-              <w:t>MF-1</w:t>
-            </w:r>
-            <w:r>
-              <w:t>2</w:t>
+              <w:t>MF-12</w:t>
             </w:r>
           </w:p>
         </w:tc>
@@ -2756,10 +2972,7 @@
           </w:tcPr>
           <w:p>
             <w:r>
-              <w:t>MF-1</w:t>
-            </w:r>
-            <w:r>
-              <w:t>3</w:t>
+              <w:t>MF-13</w:t>
             </w:r>
           </w:p>
         </w:tc>
@@ -2801,10 +3014,7 @@
           </w:tcPr>
           <w:p>
             <w:r>
-              <w:t>MF-1</w:t>
-            </w:r>
-            <w:r>
-              <w:t>4</w:t>
+              <w:t>MF-14</w:t>
             </w:r>
           </w:p>
         </w:tc>
@@ -2840,10 +3050,7 @@
           </w:tcPr>
           <w:p>
             <w:r>
-              <w:t>MF-1</w:t>
-            </w:r>
-            <w:r>
-              <w:t>5</w:t>
+              <w:t>MF-15</w:t>
             </w:r>
           </w:p>
         </w:tc>
@@ -2876,10 +3083,7 @@
           </w:tcPr>
           <w:p>
             <w:r>
-              <w:t>MF-1</w:t>
-            </w:r>
-            <w:r>
-              <w:t>6</w:t>
+              <w:t>MF-16</w:t>
             </w:r>
           </w:p>
         </w:tc>
@@ -2915,10 +3119,7 @@
           </w:tcPr>
           <w:p>
             <w:r>
-              <w:t>MF-1</w:t>
-            </w:r>
-            <w:r>
-              <w:t>7</w:t>
+              <w:t>MF-17</w:t>
             </w:r>
           </w:p>
         </w:tc>
@@ -2954,10 +3155,7 @@
           </w:tcPr>
           <w:p>
             <w:r>
-              <w:t>MF-1</w:t>
-            </w:r>
-            <w:r>
-              <w:t>8</w:t>
+              <w:t>MF-18</w:t>
             </w:r>
           </w:p>
         </w:tc>
@@ -3013,6 +3211,84 @@
             </w:r>
             <w:r>
               <w:t>which relevant users can accept/reject.</w:t>
+            </w:r>
+          </w:p>
+        </w:tc>
+      </w:tr>
+      <w:tr>
+        <w:tc>
+          <w:tcPr>
+            <w:cnfStyle w:val="001000000000" w:firstRow="0" w:lastRow="0" w:firstColumn="1" w:lastColumn="0" w:oddVBand="0" w:evenVBand="0" w:oddHBand="0" w:evenHBand="0" w:firstRowFirstColumn="0" w:firstRowLastColumn="0" w:lastRowFirstColumn="0" w:lastRowLastColumn="0"/>
+            <w:tcW w:w="817" w:type="dxa"/>
+            <w:tcBorders>
+              <w:right w:val="single" w:sz="8" w:space="0" w:color="9BBB59" w:themeColor="accent3"/>
+            </w:tcBorders>
+            <w:shd w:val="clear" w:color="auto" w:fill="D6E3BC" w:themeFill="accent3" w:themeFillTint="66"/>
+          </w:tcPr>
+          <w:p>
+            <w:r>
+              <w:t>MF-20</w:t>
+            </w:r>
+          </w:p>
+        </w:tc>
+        <w:tc>
+          <w:tcPr>
+            <w:tcW w:w="7903" w:type="dxa"/>
+            <w:tcBorders>
+              <w:left w:val="single" w:sz="8" w:space="0" w:color="9BBB59" w:themeColor="accent3"/>
+            </w:tcBorders>
+          </w:tcPr>
+          <w:p>
+            <w:pPr>
+              <w:cnfStyle w:val="000000000000" w:firstRow="0" w:lastRow="0" w:firstColumn="0" w:lastColumn="0" w:oddVBand="0" w:evenVBand="0" w:oddHBand="0" w:evenHBand="0" w:firstRowFirstColumn="0" w:firstRowLastColumn="0" w:lastRowFirstColumn="0" w:lastRowLastColumn="0"/>
+            </w:pPr>
+            <w:r>
+              <w:t xml:space="preserve">Broadcast </w:t>
+            </w:r>
+            <w:r>
+              <w:t xml:space="preserve">document changes to users. </w:t>
+            </w:r>
+            <w:r>
+              <w:t>Notifications</w:t>
+            </w:r>
+            <w:r>
+              <w:t xml:space="preserve"> can be after a change is made, or periodically such as a weekly change email.</w:t>
+            </w:r>
+          </w:p>
+        </w:tc>
+      </w:tr>
+      <w:tr>
+        <w:trPr>
+          <w:cnfStyle w:val="000000100000" w:firstRow="0" w:lastRow="0" w:firstColumn="0" w:lastColumn="0" w:oddVBand="0" w:evenVBand="0" w:oddHBand="1" w:evenHBand="0" w:firstRowFirstColumn="0" w:firstRowLastColumn="0" w:lastRowFirstColumn="0" w:lastRowLastColumn="0"/>
+        </w:trPr>
+        <w:tc>
+          <w:tcPr>
+            <w:cnfStyle w:val="001000000000" w:firstRow="0" w:lastRow="0" w:firstColumn="1" w:lastColumn="0" w:oddVBand="0" w:evenVBand="0" w:oddHBand="0" w:evenHBand="0" w:firstRowFirstColumn="0" w:firstRowLastColumn="0" w:lastRowFirstColumn="0" w:lastRowLastColumn="0"/>
+            <w:tcW w:w="817" w:type="dxa"/>
+            <w:tcBorders>
+              <w:right w:val="single" w:sz="8" w:space="0" w:color="9BBB59" w:themeColor="accent3"/>
+            </w:tcBorders>
+            <w:shd w:val="clear" w:color="auto" w:fill="D6E3BC" w:themeFill="accent3" w:themeFillTint="66"/>
+          </w:tcPr>
+          <w:p>
+            <w:r>
+              <w:t>MF-21</w:t>
+            </w:r>
+          </w:p>
+        </w:tc>
+        <w:tc>
+          <w:tcPr>
+            <w:tcW w:w="7903" w:type="dxa"/>
+            <w:tcBorders>
+              <w:left w:val="single" w:sz="8" w:space="0" w:color="9BBB59" w:themeColor="accent3"/>
+            </w:tcBorders>
+          </w:tcPr>
+          <w:p>
+            <w:pPr>
+              <w:cnfStyle w:val="000000100000" w:firstRow="0" w:lastRow="0" w:firstColumn="0" w:lastColumn="0" w:oddVBand="0" w:evenVBand="0" w:oddHBand="1" w:evenHBand="0" w:firstRowFirstColumn="0" w:firstRowLastColumn="0" w:lastRowFirstColumn="0" w:lastRowLastColumn="0"/>
+            </w:pPr>
+            <w:r>
+              <w:t>Users can review sections of documents. Who and what can be defined in rules, and explicitly requested.</w:t>
             </w:r>
           </w:p>
         </w:tc>
@@ -3028,7 +3304,7 @@
         </w:numPr>
         <w:ind w:left="431" w:hanging="431"/>
       </w:pPr>
-      <w:bookmarkStart w:id="10" w:name="_Toc303022338"/>
+      <w:bookmarkStart w:id="10" w:name="_Toc303807215"/>
       <w:r>
         <w:t>Assumptions and Dependencies</w:t>
       </w:r>
@@ -3047,7 +3323,7 @@
           <w:numId w:val="11"/>
         </w:numPr>
       </w:pPr>
-      <w:bookmarkStart w:id="11" w:name="_Toc303022339"/>
+      <w:bookmarkStart w:id="11" w:name="_Toc303807216"/>
       <w:r>
         <w:t>Scope and Limitations</w:t>
       </w:r>
@@ -3062,7 +3338,7 @@
         </w:numPr>
         <w:ind w:left="431" w:hanging="431"/>
       </w:pPr>
-      <w:bookmarkStart w:id="12" w:name="_Toc303022340"/>
+      <w:bookmarkStart w:id="12" w:name="_Toc303807217"/>
       <w:r>
         <w:t>Scope of</w:t>
       </w:r>
@@ -3143,7 +3419,11 @@
               <w:bottom w:val="none" w:sz="0" w:space="0" w:color="auto"/>
             </w:tcBorders>
           </w:tcPr>
-          <w:p/>
+          <w:p>
+            <w:r>
+              <w:t>1.x</w:t>
+            </w:r>
+          </w:p>
         </w:tc>
         <w:tc>
           <w:tcPr>
@@ -3158,6 +3438,9 @@
             <w:pPr>
               <w:cnfStyle w:val="000000100000" w:firstRow="0" w:lastRow="0" w:firstColumn="0" w:lastColumn="0" w:oddVBand="0" w:evenVBand="0" w:oddHBand="1" w:evenHBand="0" w:firstRowFirstColumn="0" w:firstRowLastColumn="0" w:lastRowFirstColumn="0" w:lastRowLastColumn="0"/>
             </w:pPr>
+            <w:r>
+              <w:t>Creating requirements online.</w:t>
+            </w:r>
           </w:p>
         </w:tc>
       </w:tr>
@@ -3167,7 +3450,11 @@
             <w:cnfStyle w:val="001000000000" w:firstRow="0" w:lastRow="0" w:firstColumn="1" w:lastColumn="0" w:oddVBand="0" w:evenVBand="0" w:oddHBand="0" w:evenHBand="0" w:firstRowFirstColumn="0" w:firstRowLastColumn="0" w:lastRowFirstColumn="0" w:lastRowLastColumn="0"/>
             <w:tcW w:w="959" w:type="dxa"/>
           </w:tcPr>
-          <w:p/>
+          <w:p>
+            <w:r>
+              <w:t>2.x</w:t>
+            </w:r>
+          </w:p>
         </w:tc>
         <w:tc>
           <w:tcPr>
@@ -3177,6 +3464,9 @@
             <w:pPr>
               <w:cnfStyle w:val="000000000000" w:firstRow="0" w:lastRow="0" w:firstColumn="0" w:lastColumn="0" w:oddVBand="0" w:evenVBand="0" w:oddHBand="0" w:evenHBand="0" w:firstRowFirstColumn="0" w:firstRowLastColumn="0" w:lastRowFirstColumn="0" w:lastRowLastColumn="0"/>
             </w:pPr>
+            <w:r>
+              <w:t>Versioning.</w:t>
+            </w:r>
           </w:p>
         </w:tc>
       </w:tr>
@@ -3194,7 +3484,11 @@
               <w:bottom w:val="none" w:sz="0" w:space="0" w:color="auto"/>
             </w:tcBorders>
           </w:tcPr>
-          <w:p/>
+          <w:p>
+            <w:r>
+              <w:t>3.x</w:t>
+            </w:r>
+          </w:p>
         </w:tc>
         <w:tc>
           <w:tcPr>
@@ -3209,76 +3503,9 @@
             <w:pPr>
               <w:cnfStyle w:val="000000100000" w:firstRow="0" w:lastRow="0" w:firstColumn="0" w:lastColumn="0" w:oddVBand="0" w:evenVBand="0" w:oddHBand="1" w:evenHBand="0" w:firstRowFirstColumn="0" w:firstRowLastColumn="0" w:lastRowFirstColumn="0" w:lastRowLastColumn="0"/>
             </w:pPr>
-          </w:p>
-        </w:tc>
-      </w:tr>
-      <w:tr>
-        <w:tc>
-          <w:tcPr>
-            <w:cnfStyle w:val="001000000000" w:firstRow="0" w:lastRow="0" w:firstColumn="1" w:lastColumn="0" w:oddVBand="0" w:evenVBand="0" w:oddHBand="0" w:evenHBand="0" w:firstRowFirstColumn="0" w:firstRowLastColumn="0" w:lastRowFirstColumn="0" w:lastRowLastColumn="0"/>
-            <w:tcW w:w="959" w:type="dxa"/>
-          </w:tcPr>
-          <w:p/>
-        </w:tc>
-        <w:tc>
-          <w:tcPr>
-            <w:tcW w:w="7513" w:type="dxa"/>
-          </w:tcPr>
-          <w:p>
-            <w:pPr>
-              <w:cnfStyle w:val="000000000000" w:firstRow="0" w:lastRow="0" w:firstColumn="0" w:lastColumn="0" w:oddVBand="0" w:evenVBand="0" w:oddHBand="0" w:evenHBand="0" w:firstRowFirstColumn="0" w:firstRowLastColumn="0" w:lastRowFirstColumn="0" w:lastRowLastColumn="0"/>
-            </w:pPr>
-          </w:p>
-        </w:tc>
-      </w:tr>
-      <w:tr>
-        <w:trPr>
-          <w:cnfStyle w:val="000000100000" w:firstRow="0" w:lastRow="0" w:firstColumn="0" w:lastColumn="0" w:oddVBand="0" w:evenVBand="0" w:oddHBand="1" w:evenHBand="0" w:firstRowFirstColumn="0" w:firstRowLastColumn="0" w:lastRowFirstColumn="0" w:lastRowLastColumn="0"/>
-        </w:trPr>
-        <w:tc>
-          <w:tcPr>
-            <w:cnfStyle w:val="001000000000" w:firstRow="0" w:lastRow="0" w:firstColumn="1" w:lastColumn="0" w:oddVBand="0" w:evenVBand="0" w:oddHBand="0" w:evenHBand="0" w:firstRowFirstColumn="0" w:firstRowLastColumn="0" w:lastRowFirstColumn="0" w:lastRowLastColumn="0"/>
-            <w:tcW w:w="959" w:type="dxa"/>
-            <w:tcBorders>
-              <w:top w:val="none" w:sz="0" w:space="0" w:color="auto"/>
-              <w:left w:val="none" w:sz="0" w:space="0" w:color="auto"/>
-              <w:bottom w:val="none" w:sz="0" w:space="0" w:color="auto"/>
-            </w:tcBorders>
-          </w:tcPr>
-          <w:p/>
-        </w:tc>
-        <w:tc>
-          <w:tcPr>
-            <w:tcW w:w="7513" w:type="dxa"/>
-            <w:tcBorders>
-              <w:top w:val="none" w:sz="0" w:space="0" w:color="auto"/>
-              <w:bottom w:val="none" w:sz="0" w:space="0" w:color="auto"/>
-              <w:right w:val="none" w:sz="0" w:space="0" w:color="auto"/>
-            </w:tcBorders>
-          </w:tcPr>
-          <w:p>
-            <w:pPr>
-              <w:cnfStyle w:val="000000100000" w:firstRow="0" w:lastRow="0" w:firstColumn="0" w:lastColumn="0" w:oddVBand="0" w:evenVBand="0" w:oddHBand="1" w:evenHBand="0" w:firstRowFirstColumn="0" w:firstRowLastColumn="0" w:lastRowFirstColumn="0" w:lastRowLastColumn="0"/>
-            </w:pPr>
-          </w:p>
-        </w:tc>
-      </w:tr>
-      <w:tr>
-        <w:tc>
-          <w:tcPr>
-            <w:cnfStyle w:val="001000000000" w:firstRow="0" w:lastRow="0" w:firstColumn="1" w:lastColumn="0" w:oddVBand="0" w:evenVBand="0" w:oddHBand="0" w:evenHBand="0" w:firstRowFirstColumn="0" w:firstRowLastColumn="0" w:lastRowFirstColumn="0" w:lastRowLastColumn="0"/>
-            <w:tcW w:w="959" w:type="dxa"/>
-          </w:tcPr>
-          <w:p/>
-        </w:tc>
-        <w:tc>
-          <w:tcPr>
-            <w:tcW w:w="7513" w:type="dxa"/>
-          </w:tcPr>
-          <w:p>
-            <w:pPr>
-              <w:cnfStyle w:val="000000000000" w:firstRow="0" w:lastRow="0" w:firstColumn="0" w:lastColumn="0" w:oddVBand="0" w:evenVBand="0" w:oddHBand="0" w:evenHBand="0" w:firstRowFirstColumn="0" w:firstRowLastColumn="0" w:lastRowFirstColumn="0" w:lastRowLastColumn="0"/>
-            </w:pPr>
+            <w:r>
+              <w:t>Collaboration.</w:t>
+            </w:r>
           </w:p>
         </w:tc>
       </w:tr>
@@ -3301,8 +3528,6 @@
         <w:gridCol w:w="818"/>
         <w:gridCol w:w="676"/>
         <w:gridCol w:w="676"/>
-        <w:gridCol w:w="676"/>
-        <w:gridCol w:w="790"/>
         <w:gridCol w:w="1294"/>
       </w:tblGrid>
       <w:tr>
@@ -3341,6 +3566,9 @@
               <w:jc w:val="center"/>
               <w:cnfStyle w:val="100000000000" w:firstRow="1" w:lastRow="0" w:firstColumn="0" w:lastColumn="0" w:oddVBand="0" w:evenVBand="0" w:oddHBand="0" w:evenHBand="0" w:firstRowFirstColumn="0" w:firstRowLastColumn="0" w:lastRowFirstColumn="0" w:lastRowLastColumn="0"/>
             </w:pPr>
+            <w:r>
+              <w:t>1.0</w:t>
+            </w:r>
           </w:p>
         </w:tc>
         <w:tc>
@@ -3358,6 +3586,9 @@
               <w:jc w:val="center"/>
               <w:cnfStyle w:val="100000000000" w:firstRow="1" w:lastRow="0" w:firstColumn="0" w:lastColumn="0" w:oddVBand="0" w:evenVBand="0" w:oddHBand="0" w:evenHBand="0" w:firstRowFirstColumn="0" w:firstRowLastColumn="0" w:lastRowFirstColumn="0" w:lastRowLastColumn="0"/>
             </w:pPr>
+            <w:r>
+              <w:t>1.x</w:t>
+            </w:r>
           </w:p>
         </w:tc>
         <w:tc>
@@ -3375,6 +3606,9 @@
               <w:jc w:val="center"/>
               <w:cnfStyle w:val="100000000000" w:firstRow="1" w:lastRow="0" w:firstColumn="0" w:lastColumn="0" w:oddVBand="0" w:evenVBand="0" w:oddHBand="0" w:evenHBand="0" w:firstRowFirstColumn="0" w:firstRowLastColumn="0" w:lastRowFirstColumn="0" w:lastRowLastColumn="0"/>
             </w:pPr>
+            <w:r>
+              <w:t>2.0</w:t>
+            </w:r>
           </w:p>
         </w:tc>
         <w:tc>
@@ -3392,6 +3626,9 @@
               <w:jc w:val="center"/>
               <w:cnfStyle w:val="100000000000" w:firstRow="1" w:lastRow="0" w:firstColumn="0" w:lastColumn="0" w:oddVBand="0" w:evenVBand="0" w:oddHBand="0" w:evenHBand="0" w:firstRowFirstColumn="0" w:firstRowLastColumn="0" w:lastRowFirstColumn="0" w:lastRowLastColumn="0"/>
             </w:pPr>
+            <w:r>
+              <w:t>2.x</w:t>
+            </w:r>
           </w:p>
         </w:tc>
         <w:tc>
@@ -3409,6 +3646,9 @@
               <w:jc w:val="center"/>
               <w:cnfStyle w:val="100000000000" w:firstRow="1" w:lastRow="0" w:firstColumn="0" w:lastColumn="0" w:oddVBand="0" w:evenVBand="0" w:oddHBand="0" w:evenHBand="0" w:firstRowFirstColumn="0" w:firstRowLastColumn="0" w:lastRowFirstColumn="0" w:lastRowLastColumn="0"/>
             </w:pPr>
+            <w:r>
+              <w:t>3.0</w:t>
+            </w:r>
           </w:p>
         </w:tc>
         <w:tc>
@@ -3426,40 +3666,9 @@
               <w:jc w:val="center"/>
               <w:cnfStyle w:val="100000000000" w:firstRow="1" w:lastRow="0" w:firstColumn="0" w:lastColumn="0" w:oddVBand="0" w:evenVBand="0" w:oddHBand="0" w:evenHBand="0" w:firstRowFirstColumn="0" w:firstRowLastColumn="0" w:lastRowFirstColumn="0" w:lastRowLastColumn="0"/>
             </w:pPr>
-          </w:p>
-        </w:tc>
-        <w:tc>
-          <w:tcPr>
-            <w:tcW w:w="676" w:type="dxa"/>
-            <w:tcBorders>
-              <w:top w:val="none" w:sz="0" w:space="0" w:color="auto"/>
-              <w:left w:val="none" w:sz="0" w:space="0" w:color="auto"/>
-              <w:bottom w:val="none" w:sz="0" w:space="0" w:color="auto"/>
-              <w:right w:val="none" w:sz="0" w:space="0" w:color="auto"/>
-            </w:tcBorders>
-          </w:tcPr>
-          <w:p>
-            <w:pPr>
-              <w:jc w:val="center"/>
-              <w:cnfStyle w:val="100000000000" w:firstRow="1" w:lastRow="0" w:firstColumn="0" w:lastColumn="0" w:oddVBand="0" w:evenVBand="0" w:oddHBand="0" w:evenHBand="0" w:firstRowFirstColumn="0" w:firstRowLastColumn="0" w:lastRowFirstColumn="0" w:lastRowLastColumn="0"/>
-            </w:pPr>
-          </w:p>
-        </w:tc>
-        <w:tc>
-          <w:tcPr>
-            <w:tcW w:w="790" w:type="dxa"/>
-            <w:tcBorders>
-              <w:top w:val="none" w:sz="0" w:space="0" w:color="auto"/>
-              <w:left w:val="none" w:sz="0" w:space="0" w:color="auto"/>
-              <w:bottom w:val="none" w:sz="0" w:space="0" w:color="auto"/>
-              <w:right w:val="none" w:sz="0" w:space="0" w:color="auto"/>
-            </w:tcBorders>
-          </w:tcPr>
-          <w:p>
-            <w:pPr>
-              <w:jc w:val="center"/>
-              <w:cnfStyle w:val="100000000000" w:firstRow="1" w:lastRow="0" w:firstColumn="0" w:lastColumn="0" w:oddVBand="0" w:evenVBand="0" w:oddHBand="0" w:evenHBand="0" w:firstRowFirstColumn="0" w:firstRowLastColumn="0" w:lastRowFirstColumn="0" w:lastRowLastColumn="0"/>
-            </w:pPr>
+            <w:r>
+              <w:t>3.x</w:t>
+            </w:r>
           </w:p>
         </w:tc>
         <w:tc>
@@ -3498,7 +3707,11 @@
               <w:right w:val="none" w:sz="0" w:space="0" w:color="auto"/>
             </w:tcBorders>
           </w:tcPr>
-          <w:p/>
+          <w:p>
+            <w:r>
+              <w:t>MF-1</w:t>
+            </w:r>
+          </w:p>
         </w:tc>
         <w:tc>
           <w:tcPr>
@@ -3513,6 +3726,9 @@
               <w:jc w:val="center"/>
               <w:cnfStyle w:val="000000100000" w:firstRow="0" w:lastRow="0" w:firstColumn="0" w:lastColumn="0" w:oddVBand="0" w:evenVBand="0" w:oddHBand="1" w:evenHBand="0" w:firstRowFirstColumn="0" w:firstRowLastColumn="0" w:lastRowFirstColumn="0" w:lastRowLastColumn="0"/>
             </w:pPr>
+            <w:r>
+              <w:t>●</w:t>
+            </w:r>
           </w:p>
         </w:tc>
         <w:tc>
@@ -3592,10 +3808,9 @@
         </w:tc>
         <w:tc>
           <w:tcPr>
-            <w:tcW w:w="676" w:type="dxa"/>
+            <w:tcW w:w="1294" w:type="dxa"/>
             <w:tcBorders>
               <w:left w:val="none" w:sz="0" w:space="0" w:color="auto"/>
-              <w:right w:val="none" w:sz="0" w:space="0" w:color="auto"/>
             </w:tcBorders>
           </w:tcPr>
           <w:p>
@@ -3603,38 +3818,6 @@
               <w:jc w:val="center"/>
               <w:cnfStyle w:val="000000100000" w:firstRow="0" w:lastRow="0" w:firstColumn="0" w:lastColumn="0" w:oddVBand="0" w:evenVBand="0" w:oddHBand="1" w:evenHBand="0" w:firstRowFirstColumn="0" w:firstRowLastColumn="0" w:lastRowFirstColumn="0" w:lastRowLastColumn="0"/>
             </w:pPr>
-          </w:p>
-        </w:tc>
-        <w:tc>
-          <w:tcPr>
-            <w:tcW w:w="790" w:type="dxa"/>
-            <w:tcBorders>
-              <w:left w:val="none" w:sz="0" w:space="0" w:color="auto"/>
-              <w:right w:val="none" w:sz="0" w:space="0" w:color="auto"/>
-            </w:tcBorders>
-          </w:tcPr>
-          <w:p>
-            <w:pPr>
-              <w:jc w:val="center"/>
-              <w:cnfStyle w:val="000000100000" w:firstRow="0" w:lastRow="0" w:firstColumn="0" w:lastColumn="0" w:oddVBand="0" w:evenVBand="0" w:oddHBand="1" w:evenHBand="0" w:firstRowFirstColumn="0" w:firstRowLastColumn="0" w:lastRowFirstColumn="0" w:lastRowLastColumn="0"/>
-            </w:pPr>
-          </w:p>
-        </w:tc>
-        <w:tc>
-          <w:tcPr>
-            <w:tcW w:w="1294" w:type="dxa"/>
-            <w:tcBorders>
-              <w:left w:val="none" w:sz="0" w:space="0" w:color="auto"/>
-            </w:tcBorders>
-          </w:tcPr>
-          <w:p>
-            <w:pPr>
-              <w:jc w:val="center"/>
-              <w:cnfStyle w:val="000000100000" w:firstRow="0" w:lastRow="0" w:firstColumn="0" w:lastColumn="0" w:oddVBand="0" w:evenVBand="0" w:oddHBand="1" w:evenHBand="0" w:firstRowFirstColumn="0" w:firstRowLastColumn="0" w:lastRowFirstColumn="0" w:lastRowLastColumn="0"/>
-            </w:pPr>
-            <w:r>
-              <w:t>●</w:t>
-            </w:r>
           </w:p>
         </w:tc>
       </w:tr>
@@ -3650,7 +3833,11 @@
               <w:right w:val="none" w:sz="0" w:space="0" w:color="auto"/>
             </w:tcBorders>
           </w:tcPr>
-          <w:p/>
+          <w:p>
+            <w:r>
+              <w:t>MF-2</w:t>
+            </w:r>
+          </w:p>
         </w:tc>
         <w:tc>
           <w:tcPr>
@@ -3665,6 +3852,9 @@
               <w:jc w:val="center"/>
               <w:cnfStyle w:val="000000010000" w:firstRow="0" w:lastRow="0" w:firstColumn="0" w:lastColumn="0" w:oddVBand="0" w:evenVBand="0" w:oddHBand="0" w:evenHBand="1" w:firstRowFirstColumn="0" w:firstRowLastColumn="0" w:lastRowFirstColumn="0" w:lastRowLastColumn="0"/>
             </w:pPr>
+            <w:r>
+              <w:t>●</w:t>
+            </w:r>
           </w:p>
         </w:tc>
         <w:tc>
@@ -3730,36 +3920,6 @@
         <w:tc>
           <w:tcPr>
             <w:tcW w:w="676" w:type="dxa"/>
-            <w:tcBorders>
-              <w:left w:val="none" w:sz="0" w:space="0" w:color="auto"/>
-              <w:right w:val="none" w:sz="0" w:space="0" w:color="auto"/>
-            </w:tcBorders>
-          </w:tcPr>
-          <w:p>
-            <w:pPr>
-              <w:jc w:val="center"/>
-              <w:cnfStyle w:val="000000010000" w:firstRow="0" w:lastRow="0" w:firstColumn="0" w:lastColumn="0" w:oddVBand="0" w:evenVBand="0" w:oddHBand="0" w:evenHBand="1" w:firstRowFirstColumn="0" w:firstRowLastColumn="0" w:lastRowFirstColumn="0" w:lastRowLastColumn="0"/>
-            </w:pPr>
-          </w:p>
-        </w:tc>
-        <w:tc>
-          <w:tcPr>
-            <w:tcW w:w="676" w:type="dxa"/>
-            <w:tcBorders>
-              <w:left w:val="none" w:sz="0" w:space="0" w:color="auto"/>
-              <w:right w:val="none" w:sz="0" w:space="0" w:color="auto"/>
-            </w:tcBorders>
-          </w:tcPr>
-          <w:p>
-            <w:pPr>
-              <w:jc w:val="center"/>
-              <w:cnfStyle w:val="000000010000" w:firstRow="0" w:lastRow="0" w:firstColumn="0" w:lastColumn="0" w:oddVBand="0" w:evenVBand="0" w:oddHBand="0" w:evenHBand="1" w:firstRowFirstColumn="0" w:firstRowLastColumn="0" w:lastRowFirstColumn="0" w:lastRowLastColumn="0"/>
-            </w:pPr>
-          </w:p>
-        </w:tc>
-        <w:tc>
-          <w:tcPr>
-            <w:tcW w:w="790" w:type="dxa"/>
             <w:tcBorders>
               <w:left w:val="none" w:sz="0" w:space="0" w:color="auto"/>
               <w:right w:val="none" w:sz="0" w:space="0" w:color="auto"/>
@@ -3799,7 +3959,11 @@
               <w:right w:val="none" w:sz="0" w:space="0" w:color="auto"/>
             </w:tcBorders>
           </w:tcPr>
-          <w:p/>
+          <w:p>
+            <w:r>
+              <w:t>MF-3</w:t>
+            </w:r>
+          </w:p>
         </w:tc>
         <w:tc>
           <w:tcPr>
@@ -3829,6 +3993,9 @@
               <w:jc w:val="center"/>
               <w:cnfStyle w:val="000000100000" w:firstRow="0" w:lastRow="0" w:firstColumn="0" w:lastColumn="0" w:oddVBand="0" w:evenVBand="0" w:oddHBand="1" w:evenHBand="0" w:firstRowFirstColumn="0" w:firstRowLastColumn="0" w:lastRowFirstColumn="0" w:lastRowLastColumn="0"/>
             </w:pPr>
+            <w:r>
+              <w:t>●</w:t>
+            </w:r>
           </w:p>
         </w:tc>
         <w:tc>
@@ -3844,6 +4011,9 @@
               <w:jc w:val="center"/>
               <w:cnfStyle w:val="000000100000" w:firstRow="0" w:lastRow="0" w:firstColumn="0" w:lastColumn="0" w:oddVBand="0" w:evenVBand="0" w:oddHBand="1" w:evenHBand="0" w:firstRowFirstColumn="0" w:firstRowLastColumn="0" w:lastRowFirstColumn="0" w:lastRowLastColumn="0"/>
             </w:pPr>
+            <w:r>
+              <w:t>●</w:t>
+            </w:r>
           </w:p>
         </w:tc>
         <w:tc>
@@ -3879,36 +4049,6 @@
         <w:tc>
           <w:tcPr>
             <w:tcW w:w="676" w:type="dxa"/>
-            <w:tcBorders>
-              <w:left w:val="none" w:sz="0" w:space="0" w:color="auto"/>
-              <w:right w:val="none" w:sz="0" w:space="0" w:color="auto"/>
-            </w:tcBorders>
-          </w:tcPr>
-          <w:p>
-            <w:pPr>
-              <w:jc w:val="center"/>
-              <w:cnfStyle w:val="000000100000" w:firstRow="0" w:lastRow="0" w:firstColumn="0" w:lastColumn="0" w:oddVBand="0" w:evenVBand="0" w:oddHBand="1" w:evenHBand="0" w:firstRowFirstColumn="0" w:firstRowLastColumn="0" w:lastRowFirstColumn="0" w:lastRowLastColumn="0"/>
-            </w:pPr>
-          </w:p>
-        </w:tc>
-        <w:tc>
-          <w:tcPr>
-            <w:tcW w:w="676" w:type="dxa"/>
-            <w:tcBorders>
-              <w:left w:val="none" w:sz="0" w:space="0" w:color="auto"/>
-              <w:right w:val="none" w:sz="0" w:space="0" w:color="auto"/>
-            </w:tcBorders>
-          </w:tcPr>
-          <w:p>
-            <w:pPr>
-              <w:jc w:val="center"/>
-              <w:cnfStyle w:val="000000100000" w:firstRow="0" w:lastRow="0" w:firstColumn="0" w:lastColumn="0" w:oddVBand="0" w:evenVBand="0" w:oddHBand="1" w:evenHBand="0" w:firstRowFirstColumn="0" w:firstRowLastColumn="0" w:lastRowFirstColumn="0" w:lastRowLastColumn="0"/>
-            </w:pPr>
-          </w:p>
-        </w:tc>
-        <w:tc>
-          <w:tcPr>
-            <w:tcW w:w="790" w:type="dxa"/>
             <w:tcBorders>
               <w:left w:val="none" w:sz="0" w:space="0" w:color="auto"/>
               <w:right w:val="none" w:sz="0" w:space="0" w:color="auto"/>
@@ -3948,7 +4088,11 @@
               <w:right w:val="none" w:sz="0" w:space="0" w:color="auto"/>
             </w:tcBorders>
           </w:tcPr>
-          <w:p/>
+          <w:p>
+            <w:r>
+              <w:t>MF-4</w:t>
+            </w:r>
+          </w:p>
         </w:tc>
         <w:tc>
           <w:tcPr>
@@ -3963,6 +4107,9 @@
               <w:jc w:val="center"/>
               <w:cnfStyle w:val="000000010000" w:firstRow="0" w:lastRow="0" w:firstColumn="0" w:lastColumn="0" w:oddVBand="0" w:evenVBand="0" w:oddHBand="0" w:evenHBand="1" w:firstRowFirstColumn="0" w:firstRowLastColumn="0" w:lastRowFirstColumn="0" w:lastRowLastColumn="0"/>
             </w:pPr>
+            <w:r>
+              <w:t>●</w:t>
+            </w:r>
           </w:p>
         </w:tc>
         <w:tc>
@@ -4028,36 +4175,6 @@
         <w:tc>
           <w:tcPr>
             <w:tcW w:w="676" w:type="dxa"/>
-            <w:tcBorders>
-              <w:left w:val="none" w:sz="0" w:space="0" w:color="auto"/>
-              <w:right w:val="none" w:sz="0" w:space="0" w:color="auto"/>
-            </w:tcBorders>
-          </w:tcPr>
-          <w:p>
-            <w:pPr>
-              <w:jc w:val="center"/>
-              <w:cnfStyle w:val="000000010000" w:firstRow="0" w:lastRow="0" w:firstColumn="0" w:lastColumn="0" w:oddVBand="0" w:evenVBand="0" w:oddHBand="0" w:evenHBand="1" w:firstRowFirstColumn="0" w:firstRowLastColumn="0" w:lastRowFirstColumn="0" w:lastRowLastColumn="0"/>
-            </w:pPr>
-          </w:p>
-        </w:tc>
-        <w:tc>
-          <w:tcPr>
-            <w:tcW w:w="676" w:type="dxa"/>
-            <w:tcBorders>
-              <w:left w:val="none" w:sz="0" w:space="0" w:color="auto"/>
-              <w:right w:val="none" w:sz="0" w:space="0" w:color="auto"/>
-            </w:tcBorders>
-          </w:tcPr>
-          <w:p>
-            <w:pPr>
-              <w:jc w:val="center"/>
-              <w:cnfStyle w:val="000000010000" w:firstRow="0" w:lastRow="0" w:firstColumn="0" w:lastColumn="0" w:oddVBand="0" w:evenVBand="0" w:oddHBand="0" w:evenHBand="1" w:firstRowFirstColumn="0" w:firstRowLastColumn="0" w:lastRowFirstColumn="0" w:lastRowLastColumn="0"/>
-            </w:pPr>
-          </w:p>
-        </w:tc>
-        <w:tc>
-          <w:tcPr>
-            <w:tcW w:w="790" w:type="dxa"/>
             <w:tcBorders>
               <w:left w:val="none" w:sz="0" w:space="0" w:color="auto"/>
               <w:right w:val="none" w:sz="0" w:space="0" w:color="auto"/>
@@ -4097,7 +4214,11 @@
               <w:right w:val="none" w:sz="0" w:space="0" w:color="auto"/>
             </w:tcBorders>
           </w:tcPr>
-          <w:p/>
+          <w:p>
+            <w:r>
+              <w:t>MF-5</w:t>
+            </w:r>
+          </w:p>
         </w:tc>
         <w:tc>
           <w:tcPr>
@@ -4112,6 +4233,9 @@
               <w:jc w:val="center"/>
               <w:cnfStyle w:val="000000100000" w:firstRow="0" w:lastRow="0" w:firstColumn="0" w:lastColumn="0" w:oddVBand="0" w:evenVBand="0" w:oddHBand="1" w:evenHBand="0" w:firstRowFirstColumn="0" w:firstRowLastColumn="0" w:lastRowFirstColumn="0" w:lastRowLastColumn="0"/>
             </w:pPr>
+            <w:r>
+              <w:t>●</w:t>
+            </w:r>
           </w:p>
         </w:tc>
         <w:tc>
@@ -4177,36 +4301,6 @@
         <w:tc>
           <w:tcPr>
             <w:tcW w:w="676" w:type="dxa"/>
-            <w:tcBorders>
-              <w:left w:val="none" w:sz="0" w:space="0" w:color="auto"/>
-              <w:right w:val="none" w:sz="0" w:space="0" w:color="auto"/>
-            </w:tcBorders>
-          </w:tcPr>
-          <w:p>
-            <w:pPr>
-              <w:jc w:val="center"/>
-              <w:cnfStyle w:val="000000100000" w:firstRow="0" w:lastRow="0" w:firstColumn="0" w:lastColumn="0" w:oddVBand="0" w:evenVBand="0" w:oddHBand="1" w:evenHBand="0" w:firstRowFirstColumn="0" w:firstRowLastColumn="0" w:lastRowFirstColumn="0" w:lastRowLastColumn="0"/>
-            </w:pPr>
-          </w:p>
-        </w:tc>
-        <w:tc>
-          <w:tcPr>
-            <w:tcW w:w="676" w:type="dxa"/>
-            <w:tcBorders>
-              <w:left w:val="none" w:sz="0" w:space="0" w:color="auto"/>
-              <w:right w:val="none" w:sz="0" w:space="0" w:color="auto"/>
-            </w:tcBorders>
-          </w:tcPr>
-          <w:p>
-            <w:pPr>
-              <w:jc w:val="center"/>
-              <w:cnfStyle w:val="000000100000" w:firstRow="0" w:lastRow="0" w:firstColumn="0" w:lastColumn="0" w:oddVBand="0" w:evenVBand="0" w:oddHBand="1" w:evenHBand="0" w:firstRowFirstColumn="0" w:firstRowLastColumn="0" w:lastRowFirstColumn="0" w:lastRowLastColumn="0"/>
-            </w:pPr>
-          </w:p>
-        </w:tc>
-        <w:tc>
-          <w:tcPr>
-            <w:tcW w:w="790" w:type="dxa"/>
             <w:tcBorders>
               <w:left w:val="none" w:sz="0" w:space="0" w:color="auto"/>
               <w:right w:val="none" w:sz="0" w:space="0" w:color="auto"/>
@@ -4246,7 +4340,11 @@
               <w:right w:val="none" w:sz="0" w:space="0" w:color="auto"/>
             </w:tcBorders>
           </w:tcPr>
-          <w:p/>
+          <w:p>
+            <w:r>
+              <w:t>MF-6</w:t>
+            </w:r>
+          </w:p>
         </w:tc>
         <w:tc>
           <w:tcPr>
@@ -4261,6 +4359,9 @@
               <w:jc w:val="center"/>
               <w:cnfStyle w:val="000000010000" w:firstRow="0" w:lastRow="0" w:firstColumn="0" w:lastColumn="0" w:oddVBand="0" w:evenVBand="0" w:oddHBand="0" w:evenHBand="1" w:firstRowFirstColumn="0" w:firstRowLastColumn="0" w:lastRowFirstColumn="0" w:lastRowLastColumn="0"/>
             </w:pPr>
+            <w:r>
+              <w:t>●</w:t>
+            </w:r>
           </w:p>
         </w:tc>
         <w:tc>
@@ -4326,36 +4427,6 @@
         <w:tc>
           <w:tcPr>
             <w:tcW w:w="676" w:type="dxa"/>
-            <w:tcBorders>
-              <w:left w:val="none" w:sz="0" w:space="0" w:color="auto"/>
-              <w:right w:val="none" w:sz="0" w:space="0" w:color="auto"/>
-            </w:tcBorders>
-          </w:tcPr>
-          <w:p>
-            <w:pPr>
-              <w:jc w:val="center"/>
-              <w:cnfStyle w:val="000000010000" w:firstRow="0" w:lastRow="0" w:firstColumn="0" w:lastColumn="0" w:oddVBand="0" w:evenVBand="0" w:oddHBand="0" w:evenHBand="1" w:firstRowFirstColumn="0" w:firstRowLastColumn="0" w:lastRowFirstColumn="0" w:lastRowLastColumn="0"/>
-            </w:pPr>
-          </w:p>
-        </w:tc>
-        <w:tc>
-          <w:tcPr>
-            <w:tcW w:w="676" w:type="dxa"/>
-            <w:tcBorders>
-              <w:left w:val="none" w:sz="0" w:space="0" w:color="auto"/>
-              <w:right w:val="none" w:sz="0" w:space="0" w:color="auto"/>
-            </w:tcBorders>
-          </w:tcPr>
-          <w:p>
-            <w:pPr>
-              <w:jc w:val="center"/>
-              <w:cnfStyle w:val="000000010000" w:firstRow="0" w:lastRow="0" w:firstColumn="0" w:lastColumn="0" w:oddVBand="0" w:evenVBand="0" w:oddHBand="0" w:evenHBand="1" w:firstRowFirstColumn="0" w:firstRowLastColumn="0" w:lastRowFirstColumn="0" w:lastRowLastColumn="0"/>
-            </w:pPr>
-          </w:p>
-        </w:tc>
-        <w:tc>
-          <w:tcPr>
-            <w:tcW w:w="790" w:type="dxa"/>
             <w:tcBorders>
               <w:left w:val="none" w:sz="0" w:space="0" w:color="auto"/>
               <w:right w:val="none" w:sz="0" w:space="0" w:color="auto"/>
@@ -4395,7 +4466,11 @@
               <w:right w:val="none" w:sz="0" w:space="0" w:color="auto"/>
             </w:tcBorders>
           </w:tcPr>
-          <w:p/>
+          <w:p>
+            <w:r>
+              <w:t>MF-7</w:t>
+            </w:r>
+          </w:p>
         </w:tc>
         <w:tc>
           <w:tcPr>
@@ -4489,10 +4564,9 @@
         </w:tc>
         <w:tc>
           <w:tcPr>
-            <w:tcW w:w="676" w:type="dxa"/>
+            <w:tcW w:w="1294" w:type="dxa"/>
             <w:tcBorders>
               <w:left w:val="none" w:sz="0" w:space="0" w:color="auto"/>
-              <w:right w:val="none" w:sz="0" w:space="0" w:color="auto"/>
             </w:tcBorders>
           </w:tcPr>
           <w:p>
@@ -4500,35 +4574,9 @@
               <w:jc w:val="center"/>
               <w:cnfStyle w:val="000000100000" w:firstRow="0" w:lastRow="0" w:firstColumn="0" w:lastColumn="0" w:oddVBand="0" w:evenVBand="0" w:oddHBand="1" w:evenHBand="0" w:firstRowFirstColumn="0" w:firstRowLastColumn="0" w:lastRowFirstColumn="0" w:lastRowLastColumn="0"/>
             </w:pPr>
-          </w:p>
-        </w:tc>
-        <w:tc>
-          <w:tcPr>
-            <w:tcW w:w="790" w:type="dxa"/>
-            <w:tcBorders>
-              <w:left w:val="none" w:sz="0" w:space="0" w:color="auto"/>
-              <w:right w:val="none" w:sz="0" w:space="0" w:color="auto"/>
-            </w:tcBorders>
-          </w:tcPr>
-          <w:p>
-            <w:pPr>
-              <w:jc w:val="center"/>
-              <w:cnfStyle w:val="000000100000" w:firstRow="0" w:lastRow="0" w:firstColumn="0" w:lastColumn="0" w:oddVBand="0" w:evenVBand="0" w:oddHBand="1" w:evenHBand="0" w:firstRowFirstColumn="0" w:firstRowLastColumn="0" w:lastRowFirstColumn="0" w:lastRowLastColumn="0"/>
-            </w:pPr>
-          </w:p>
-        </w:tc>
-        <w:tc>
-          <w:tcPr>
-            <w:tcW w:w="1294" w:type="dxa"/>
-            <w:tcBorders>
-              <w:left w:val="none" w:sz="0" w:space="0" w:color="auto"/>
-            </w:tcBorders>
-          </w:tcPr>
-          <w:p>
-            <w:pPr>
-              <w:jc w:val="center"/>
-              <w:cnfStyle w:val="000000100000" w:firstRow="0" w:lastRow="0" w:firstColumn="0" w:lastColumn="0" w:oddVBand="0" w:evenVBand="0" w:oddHBand="1" w:evenHBand="0" w:firstRowFirstColumn="0" w:firstRowLastColumn="0" w:lastRowFirstColumn="0" w:lastRowLastColumn="0"/>
-            </w:pPr>
+            <w:r>
+              <w:t>●</w:t>
+            </w:r>
           </w:p>
         </w:tc>
       </w:tr>
@@ -4544,7 +4592,11 @@
               <w:right w:val="none" w:sz="0" w:space="0" w:color="auto"/>
             </w:tcBorders>
           </w:tcPr>
-          <w:p/>
+          <w:p>
+            <w:r>
+              <w:t>MF-8</w:t>
+            </w:r>
+          </w:p>
         </w:tc>
         <w:tc>
           <w:tcPr>
@@ -4589,6 +4641,9 @@
               <w:jc w:val="center"/>
               <w:cnfStyle w:val="000000010000" w:firstRow="0" w:lastRow="0" w:firstColumn="0" w:lastColumn="0" w:oddVBand="0" w:evenVBand="0" w:oddHBand="0" w:evenHBand="1" w:firstRowFirstColumn="0" w:firstRowLastColumn="0" w:lastRowFirstColumn="0" w:lastRowLastColumn="0"/>
             </w:pPr>
+            <w:r>
+              <w:t>●</w:t>
+            </w:r>
           </w:p>
         </w:tc>
         <w:tc>
@@ -4624,36 +4679,6 @@
         <w:tc>
           <w:tcPr>
             <w:tcW w:w="676" w:type="dxa"/>
-            <w:tcBorders>
-              <w:left w:val="none" w:sz="0" w:space="0" w:color="auto"/>
-              <w:right w:val="none" w:sz="0" w:space="0" w:color="auto"/>
-            </w:tcBorders>
-          </w:tcPr>
-          <w:p>
-            <w:pPr>
-              <w:jc w:val="center"/>
-              <w:cnfStyle w:val="000000010000" w:firstRow="0" w:lastRow="0" w:firstColumn="0" w:lastColumn="0" w:oddVBand="0" w:evenVBand="0" w:oddHBand="0" w:evenHBand="1" w:firstRowFirstColumn="0" w:firstRowLastColumn="0" w:lastRowFirstColumn="0" w:lastRowLastColumn="0"/>
-            </w:pPr>
-          </w:p>
-        </w:tc>
-        <w:tc>
-          <w:tcPr>
-            <w:tcW w:w="676" w:type="dxa"/>
-            <w:tcBorders>
-              <w:left w:val="none" w:sz="0" w:space="0" w:color="auto"/>
-              <w:right w:val="none" w:sz="0" w:space="0" w:color="auto"/>
-            </w:tcBorders>
-          </w:tcPr>
-          <w:p>
-            <w:pPr>
-              <w:jc w:val="center"/>
-              <w:cnfStyle w:val="000000010000" w:firstRow="0" w:lastRow="0" w:firstColumn="0" w:lastColumn="0" w:oddVBand="0" w:evenVBand="0" w:oddHBand="0" w:evenHBand="1" w:firstRowFirstColumn="0" w:firstRowLastColumn="0" w:lastRowFirstColumn="0" w:lastRowLastColumn="0"/>
-            </w:pPr>
-          </w:p>
-        </w:tc>
-        <w:tc>
-          <w:tcPr>
-            <w:tcW w:w="790" w:type="dxa"/>
             <w:tcBorders>
               <w:left w:val="none" w:sz="0" w:space="0" w:color="auto"/>
               <w:right w:val="none" w:sz="0" w:space="0" w:color="auto"/>
@@ -4693,7 +4718,11 @@
               <w:right w:val="none" w:sz="0" w:space="0" w:color="auto"/>
             </w:tcBorders>
           </w:tcPr>
-          <w:p/>
+          <w:p>
+            <w:r>
+              <w:t>MF-9</w:t>
+            </w:r>
+          </w:p>
         </w:tc>
         <w:tc>
           <w:tcPr>
@@ -4738,6 +4767,9 @@
               <w:jc w:val="center"/>
               <w:cnfStyle w:val="000000100000" w:firstRow="0" w:lastRow="0" w:firstColumn="0" w:lastColumn="0" w:oddVBand="0" w:evenVBand="0" w:oddHBand="1" w:evenHBand="0" w:firstRowFirstColumn="0" w:firstRowLastColumn="0" w:lastRowFirstColumn="0" w:lastRowLastColumn="0"/>
             </w:pPr>
+            <w:r>
+              <w:t>●</w:t>
+            </w:r>
           </w:p>
         </w:tc>
         <w:tc>
@@ -4773,36 +4805,6 @@
         <w:tc>
           <w:tcPr>
             <w:tcW w:w="676" w:type="dxa"/>
-            <w:tcBorders>
-              <w:left w:val="none" w:sz="0" w:space="0" w:color="auto"/>
-              <w:right w:val="none" w:sz="0" w:space="0" w:color="auto"/>
-            </w:tcBorders>
-          </w:tcPr>
-          <w:p>
-            <w:pPr>
-              <w:jc w:val="center"/>
-              <w:cnfStyle w:val="000000100000" w:firstRow="0" w:lastRow="0" w:firstColumn="0" w:lastColumn="0" w:oddVBand="0" w:evenVBand="0" w:oddHBand="1" w:evenHBand="0" w:firstRowFirstColumn="0" w:firstRowLastColumn="0" w:lastRowFirstColumn="0" w:lastRowLastColumn="0"/>
-            </w:pPr>
-          </w:p>
-        </w:tc>
-        <w:tc>
-          <w:tcPr>
-            <w:tcW w:w="676" w:type="dxa"/>
-            <w:tcBorders>
-              <w:left w:val="none" w:sz="0" w:space="0" w:color="auto"/>
-              <w:right w:val="none" w:sz="0" w:space="0" w:color="auto"/>
-            </w:tcBorders>
-          </w:tcPr>
-          <w:p>
-            <w:pPr>
-              <w:jc w:val="center"/>
-              <w:cnfStyle w:val="000000100000" w:firstRow="0" w:lastRow="0" w:firstColumn="0" w:lastColumn="0" w:oddVBand="0" w:evenVBand="0" w:oddHBand="1" w:evenHBand="0" w:firstRowFirstColumn="0" w:firstRowLastColumn="0" w:lastRowFirstColumn="0" w:lastRowLastColumn="0"/>
-            </w:pPr>
-          </w:p>
-        </w:tc>
-        <w:tc>
-          <w:tcPr>
-            <w:tcW w:w="790" w:type="dxa"/>
             <w:tcBorders>
               <w:left w:val="none" w:sz="0" w:space="0" w:color="auto"/>
               <w:right w:val="none" w:sz="0" w:space="0" w:color="auto"/>
@@ -4842,7 +4844,11 @@
               <w:right w:val="none" w:sz="0" w:space="0" w:color="auto"/>
             </w:tcBorders>
           </w:tcPr>
-          <w:p/>
+          <w:p>
+            <w:r>
+              <w:t>MF-10</w:t>
+            </w:r>
+          </w:p>
         </w:tc>
         <w:tc>
           <w:tcPr>
@@ -4887,6 +4893,9 @@
               <w:jc w:val="center"/>
               <w:cnfStyle w:val="000000010000" w:firstRow="0" w:lastRow="0" w:firstColumn="0" w:lastColumn="0" w:oddVBand="0" w:evenVBand="0" w:oddHBand="0" w:evenHBand="1" w:firstRowFirstColumn="0" w:firstRowLastColumn="0" w:lastRowFirstColumn="0" w:lastRowLastColumn="0"/>
             </w:pPr>
+            <w:r>
+              <w:t>●</w:t>
+            </w:r>
           </w:p>
         </w:tc>
         <w:tc>
@@ -4922,36 +4931,6 @@
         <w:tc>
           <w:tcPr>
             <w:tcW w:w="676" w:type="dxa"/>
-            <w:tcBorders>
-              <w:left w:val="none" w:sz="0" w:space="0" w:color="auto"/>
-              <w:right w:val="none" w:sz="0" w:space="0" w:color="auto"/>
-            </w:tcBorders>
-          </w:tcPr>
-          <w:p>
-            <w:pPr>
-              <w:jc w:val="center"/>
-              <w:cnfStyle w:val="000000010000" w:firstRow="0" w:lastRow="0" w:firstColumn="0" w:lastColumn="0" w:oddVBand="0" w:evenVBand="0" w:oddHBand="0" w:evenHBand="1" w:firstRowFirstColumn="0" w:firstRowLastColumn="0" w:lastRowFirstColumn="0" w:lastRowLastColumn="0"/>
-            </w:pPr>
-          </w:p>
-        </w:tc>
-        <w:tc>
-          <w:tcPr>
-            <w:tcW w:w="676" w:type="dxa"/>
-            <w:tcBorders>
-              <w:left w:val="none" w:sz="0" w:space="0" w:color="auto"/>
-              <w:right w:val="none" w:sz="0" w:space="0" w:color="auto"/>
-            </w:tcBorders>
-          </w:tcPr>
-          <w:p>
-            <w:pPr>
-              <w:jc w:val="center"/>
-              <w:cnfStyle w:val="000000010000" w:firstRow="0" w:lastRow="0" w:firstColumn="0" w:lastColumn="0" w:oddVBand="0" w:evenVBand="0" w:oddHBand="0" w:evenHBand="1" w:firstRowFirstColumn="0" w:firstRowLastColumn="0" w:lastRowFirstColumn="0" w:lastRowLastColumn="0"/>
-            </w:pPr>
-          </w:p>
-        </w:tc>
-        <w:tc>
-          <w:tcPr>
-            <w:tcW w:w="790" w:type="dxa"/>
             <w:tcBorders>
               <w:left w:val="none" w:sz="0" w:space="0" w:color="auto"/>
               <w:right w:val="none" w:sz="0" w:space="0" w:color="auto"/>
@@ -4991,7 +4970,11 @@
               <w:right w:val="none" w:sz="0" w:space="0" w:color="auto"/>
             </w:tcBorders>
           </w:tcPr>
-          <w:p/>
+          <w:p>
+            <w:r>
+              <w:t>MF-11</w:t>
+            </w:r>
+          </w:p>
         </w:tc>
         <w:tc>
           <w:tcPr>
@@ -5051,6 +5034,9 @@
               <w:jc w:val="center"/>
               <w:cnfStyle w:val="000000100000" w:firstRow="0" w:lastRow="0" w:firstColumn="0" w:lastColumn="0" w:oddVBand="0" w:evenVBand="0" w:oddHBand="1" w:evenHBand="0" w:firstRowFirstColumn="0" w:firstRowLastColumn="0" w:lastRowFirstColumn="0" w:lastRowLastColumn="0"/>
             </w:pPr>
+            <w:r>
+              <w:t>●</w:t>
+            </w:r>
           </w:p>
         </w:tc>
         <w:tc>
@@ -5071,36 +5057,6 @@
         <w:tc>
           <w:tcPr>
             <w:tcW w:w="676" w:type="dxa"/>
-            <w:tcBorders>
-              <w:left w:val="none" w:sz="0" w:space="0" w:color="auto"/>
-              <w:right w:val="none" w:sz="0" w:space="0" w:color="auto"/>
-            </w:tcBorders>
-          </w:tcPr>
-          <w:p>
-            <w:pPr>
-              <w:jc w:val="center"/>
-              <w:cnfStyle w:val="000000100000" w:firstRow="0" w:lastRow="0" w:firstColumn="0" w:lastColumn="0" w:oddVBand="0" w:evenVBand="0" w:oddHBand="1" w:evenHBand="0" w:firstRowFirstColumn="0" w:firstRowLastColumn="0" w:lastRowFirstColumn="0" w:lastRowLastColumn="0"/>
-            </w:pPr>
-          </w:p>
-        </w:tc>
-        <w:tc>
-          <w:tcPr>
-            <w:tcW w:w="676" w:type="dxa"/>
-            <w:tcBorders>
-              <w:left w:val="none" w:sz="0" w:space="0" w:color="auto"/>
-              <w:right w:val="none" w:sz="0" w:space="0" w:color="auto"/>
-            </w:tcBorders>
-          </w:tcPr>
-          <w:p>
-            <w:pPr>
-              <w:jc w:val="center"/>
-              <w:cnfStyle w:val="000000100000" w:firstRow="0" w:lastRow="0" w:firstColumn="0" w:lastColumn="0" w:oddVBand="0" w:evenVBand="0" w:oddHBand="1" w:evenHBand="0" w:firstRowFirstColumn="0" w:firstRowLastColumn="0" w:lastRowFirstColumn="0" w:lastRowLastColumn="0"/>
-            </w:pPr>
-          </w:p>
-        </w:tc>
-        <w:tc>
-          <w:tcPr>
-            <w:tcW w:w="790" w:type="dxa"/>
             <w:tcBorders>
               <w:left w:val="none" w:sz="0" w:space="0" w:color="auto"/>
               <w:right w:val="none" w:sz="0" w:space="0" w:color="auto"/>
@@ -5140,7 +5096,12 @@
               <w:right w:val="none" w:sz="0" w:space="0" w:color="auto"/>
             </w:tcBorders>
           </w:tcPr>
-          <w:p/>
+          <w:p>
+            <w:r>
+              <w:lastRenderedPageBreak/>
+              <w:t>MF-12</w:t>
+            </w:r>
+          </w:p>
         </w:tc>
         <w:tc>
           <w:tcPr>
@@ -5170,6 +5131,9 @@
               <w:jc w:val="center"/>
               <w:cnfStyle w:val="000000010000" w:firstRow="0" w:lastRow="0" w:firstColumn="0" w:lastColumn="0" w:oddVBand="0" w:evenVBand="0" w:oddHBand="0" w:evenHBand="1" w:firstRowFirstColumn="0" w:firstRowLastColumn="0" w:lastRowFirstColumn="0" w:lastRowLastColumn="0"/>
             </w:pPr>
+            <w:r>
+              <w:t>●</w:t>
+            </w:r>
           </w:p>
         </w:tc>
         <w:tc>
@@ -5220,36 +5184,6 @@
         <w:tc>
           <w:tcPr>
             <w:tcW w:w="676" w:type="dxa"/>
-            <w:tcBorders>
-              <w:left w:val="none" w:sz="0" w:space="0" w:color="auto"/>
-              <w:right w:val="none" w:sz="0" w:space="0" w:color="auto"/>
-            </w:tcBorders>
-          </w:tcPr>
-          <w:p>
-            <w:pPr>
-              <w:jc w:val="center"/>
-              <w:cnfStyle w:val="000000010000" w:firstRow="0" w:lastRow="0" w:firstColumn="0" w:lastColumn="0" w:oddVBand="0" w:evenVBand="0" w:oddHBand="0" w:evenHBand="1" w:firstRowFirstColumn="0" w:firstRowLastColumn="0" w:lastRowFirstColumn="0" w:lastRowLastColumn="0"/>
-            </w:pPr>
-          </w:p>
-        </w:tc>
-        <w:tc>
-          <w:tcPr>
-            <w:tcW w:w="676" w:type="dxa"/>
-            <w:tcBorders>
-              <w:left w:val="none" w:sz="0" w:space="0" w:color="auto"/>
-              <w:right w:val="none" w:sz="0" w:space="0" w:color="auto"/>
-            </w:tcBorders>
-          </w:tcPr>
-          <w:p>
-            <w:pPr>
-              <w:jc w:val="center"/>
-              <w:cnfStyle w:val="000000010000" w:firstRow="0" w:lastRow="0" w:firstColumn="0" w:lastColumn="0" w:oddVBand="0" w:evenVBand="0" w:oddHBand="0" w:evenHBand="1" w:firstRowFirstColumn="0" w:firstRowLastColumn="0" w:lastRowFirstColumn="0" w:lastRowLastColumn="0"/>
-            </w:pPr>
-          </w:p>
-        </w:tc>
-        <w:tc>
-          <w:tcPr>
-            <w:tcW w:w="790" w:type="dxa"/>
             <w:tcBorders>
               <w:left w:val="none" w:sz="0" w:space="0" w:color="auto"/>
               <w:right w:val="none" w:sz="0" w:space="0" w:color="auto"/>
@@ -5289,7 +5223,11 @@
               <w:right w:val="none" w:sz="0" w:space="0" w:color="auto"/>
             </w:tcBorders>
           </w:tcPr>
-          <w:p/>
+          <w:p>
+            <w:r>
+              <w:t>MF-13</w:t>
+            </w:r>
+          </w:p>
         </w:tc>
         <w:tc>
           <w:tcPr>
@@ -5304,6 +5242,9 @@
               <w:jc w:val="center"/>
               <w:cnfStyle w:val="000000100000" w:firstRow="0" w:lastRow="0" w:firstColumn="0" w:lastColumn="0" w:oddVBand="0" w:evenVBand="0" w:oddHBand="1" w:evenHBand="0" w:firstRowFirstColumn="0" w:firstRowLastColumn="0" w:lastRowFirstColumn="0" w:lastRowLastColumn="0"/>
             </w:pPr>
+            <w:r>
+              <w:t>●</w:t>
+            </w:r>
           </w:p>
         </w:tc>
         <w:tc>
@@ -5369,36 +5310,6 @@
         <w:tc>
           <w:tcPr>
             <w:tcW w:w="676" w:type="dxa"/>
-            <w:tcBorders>
-              <w:left w:val="none" w:sz="0" w:space="0" w:color="auto"/>
-              <w:right w:val="none" w:sz="0" w:space="0" w:color="auto"/>
-            </w:tcBorders>
-          </w:tcPr>
-          <w:p>
-            <w:pPr>
-              <w:jc w:val="center"/>
-              <w:cnfStyle w:val="000000100000" w:firstRow="0" w:lastRow="0" w:firstColumn="0" w:lastColumn="0" w:oddVBand="0" w:evenVBand="0" w:oddHBand="1" w:evenHBand="0" w:firstRowFirstColumn="0" w:firstRowLastColumn="0" w:lastRowFirstColumn="0" w:lastRowLastColumn="0"/>
-            </w:pPr>
-          </w:p>
-        </w:tc>
-        <w:tc>
-          <w:tcPr>
-            <w:tcW w:w="676" w:type="dxa"/>
-            <w:tcBorders>
-              <w:left w:val="none" w:sz="0" w:space="0" w:color="auto"/>
-              <w:right w:val="none" w:sz="0" w:space="0" w:color="auto"/>
-            </w:tcBorders>
-          </w:tcPr>
-          <w:p>
-            <w:pPr>
-              <w:jc w:val="center"/>
-              <w:cnfStyle w:val="000000100000" w:firstRow="0" w:lastRow="0" w:firstColumn="0" w:lastColumn="0" w:oddVBand="0" w:evenVBand="0" w:oddHBand="1" w:evenHBand="0" w:firstRowFirstColumn="0" w:firstRowLastColumn="0" w:lastRowFirstColumn="0" w:lastRowLastColumn="0"/>
-            </w:pPr>
-          </w:p>
-        </w:tc>
-        <w:tc>
-          <w:tcPr>
-            <w:tcW w:w="790" w:type="dxa"/>
             <w:tcBorders>
               <w:left w:val="none" w:sz="0" w:space="0" w:color="auto"/>
               <w:right w:val="none" w:sz="0" w:space="0" w:color="auto"/>
@@ -5438,7 +5349,11 @@
               <w:right w:val="none" w:sz="0" w:space="0" w:color="auto"/>
             </w:tcBorders>
           </w:tcPr>
-          <w:p/>
+          <w:p>
+            <w:r>
+              <w:t>MF-14</w:t>
+            </w:r>
+          </w:p>
         </w:tc>
         <w:tc>
           <w:tcPr>
@@ -5453,6 +5368,9 @@
               <w:jc w:val="center"/>
               <w:cnfStyle w:val="000000010000" w:firstRow="0" w:lastRow="0" w:firstColumn="0" w:lastColumn="0" w:oddVBand="0" w:evenVBand="0" w:oddHBand="0" w:evenHBand="1" w:firstRowFirstColumn="0" w:firstRowLastColumn="0" w:lastRowFirstColumn="0" w:lastRowLastColumn="0"/>
             </w:pPr>
+            <w:r>
+              <w:t>●</w:t>
+            </w:r>
           </w:p>
         </w:tc>
         <w:tc>
@@ -5518,36 +5436,6 @@
         <w:tc>
           <w:tcPr>
             <w:tcW w:w="676" w:type="dxa"/>
-            <w:tcBorders>
-              <w:left w:val="none" w:sz="0" w:space="0" w:color="auto"/>
-              <w:right w:val="none" w:sz="0" w:space="0" w:color="auto"/>
-            </w:tcBorders>
-          </w:tcPr>
-          <w:p>
-            <w:pPr>
-              <w:jc w:val="center"/>
-              <w:cnfStyle w:val="000000010000" w:firstRow="0" w:lastRow="0" w:firstColumn="0" w:lastColumn="0" w:oddVBand="0" w:evenVBand="0" w:oddHBand="0" w:evenHBand="1" w:firstRowFirstColumn="0" w:firstRowLastColumn="0" w:lastRowFirstColumn="0" w:lastRowLastColumn="0"/>
-            </w:pPr>
-          </w:p>
-        </w:tc>
-        <w:tc>
-          <w:tcPr>
-            <w:tcW w:w="676" w:type="dxa"/>
-            <w:tcBorders>
-              <w:left w:val="none" w:sz="0" w:space="0" w:color="auto"/>
-              <w:right w:val="none" w:sz="0" w:space="0" w:color="auto"/>
-            </w:tcBorders>
-          </w:tcPr>
-          <w:p>
-            <w:pPr>
-              <w:jc w:val="center"/>
-              <w:cnfStyle w:val="000000010000" w:firstRow="0" w:lastRow="0" w:firstColumn="0" w:lastColumn="0" w:oddVBand="0" w:evenVBand="0" w:oddHBand="0" w:evenHBand="1" w:firstRowFirstColumn="0" w:firstRowLastColumn="0" w:lastRowFirstColumn="0" w:lastRowLastColumn="0"/>
-            </w:pPr>
-          </w:p>
-        </w:tc>
-        <w:tc>
-          <w:tcPr>
-            <w:tcW w:w="790" w:type="dxa"/>
             <w:tcBorders>
               <w:left w:val="none" w:sz="0" w:space="0" w:color="auto"/>
               <w:right w:val="none" w:sz="0" w:space="0" w:color="auto"/>
@@ -5584,16 +5472,22 @@
             <w:cnfStyle w:val="001000000000" w:firstRow="0" w:lastRow="0" w:firstColumn="1" w:lastColumn="0" w:oddVBand="0" w:evenVBand="0" w:oddHBand="0" w:evenHBand="0" w:firstRowFirstColumn="0" w:firstRowLastColumn="0" w:lastRowFirstColumn="0" w:lastRowLastColumn="0"/>
             <w:tcW w:w="959" w:type="dxa"/>
             <w:tcBorders>
+              <w:bottom w:val="single" w:sz="8" w:space="0" w:color="B3CC82" w:themeColor="accent3" w:themeTint="BF"/>
               <w:right w:val="none" w:sz="0" w:space="0" w:color="auto"/>
             </w:tcBorders>
           </w:tcPr>
-          <w:p/>
+          <w:p>
+            <w:r>
+              <w:t>MF-15</w:t>
+            </w:r>
+          </w:p>
         </w:tc>
         <w:tc>
           <w:tcPr>
             <w:tcW w:w="850" w:type="dxa"/>
             <w:tcBorders>
               <w:left w:val="none" w:sz="0" w:space="0" w:color="auto"/>
+              <w:bottom w:val="single" w:sz="8" w:space="0" w:color="B3CC82" w:themeColor="accent3" w:themeTint="BF"/>
               <w:right w:val="none" w:sz="0" w:space="0" w:color="auto"/>
             </w:tcBorders>
           </w:tcPr>
@@ -5602,6 +5496,9 @@
               <w:jc w:val="center"/>
               <w:cnfStyle w:val="000000100000" w:firstRow="0" w:lastRow="0" w:firstColumn="0" w:lastColumn="0" w:oddVBand="0" w:evenVBand="0" w:oddHBand="1" w:evenHBand="0" w:firstRowFirstColumn="0" w:firstRowLastColumn="0" w:lastRowFirstColumn="0" w:lastRowLastColumn="0"/>
             </w:pPr>
+            <w:r>
+              <w:t>●</w:t>
+            </w:r>
           </w:p>
         </w:tc>
         <w:tc>
@@ -5609,6 +5506,7 @@
             <w:tcW w:w="851" w:type="dxa"/>
             <w:tcBorders>
               <w:left w:val="none" w:sz="0" w:space="0" w:color="auto"/>
+              <w:bottom w:val="single" w:sz="8" w:space="0" w:color="B3CC82" w:themeColor="accent3" w:themeTint="BF"/>
               <w:right w:val="none" w:sz="0" w:space="0" w:color="auto"/>
             </w:tcBorders>
           </w:tcPr>
@@ -5624,6 +5522,7 @@
             <w:tcW w:w="902" w:type="dxa"/>
             <w:tcBorders>
               <w:left w:val="none" w:sz="0" w:space="0" w:color="auto"/>
+              <w:bottom w:val="single" w:sz="8" w:space="0" w:color="B3CC82" w:themeColor="accent3" w:themeTint="BF"/>
               <w:right w:val="none" w:sz="0" w:space="0" w:color="auto"/>
             </w:tcBorders>
           </w:tcPr>
@@ -5639,6 +5538,7 @@
             <w:tcW w:w="818" w:type="dxa"/>
             <w:tcBorders>
               <w:left w:val="none" w:sz="0" w:space="0" w:color="auto"/>
+              <w:bottom w:val="single" w:sz="8" w:space="0" w:color="B3CC82" w:themeColor="accent3" w:themeTint="BF"/>
               <w:right w:val="none" w:sz="0" w:space="0" w:color="auto"/>
             </w:tcBorders>
           </w:tcPr>
@@ -5654,6 +5554,7 @@
             <w:tcW w:w="676" w:type="dxa"/>
             <w:tcBorders>
               <w:left w:val="none" w:sz="0" w:space="0" w:color="auto"/>
+              <w:bottom w:val="single" w:sz="8" w:space="0" w:color="B3CC82" w:themeColor="accent3" w:themeTint="BF"/>
               <w:right w:val="none" w:sz="0" w:space="0" w:color="auto"/>
             </w:tcBorders>
           </w:tcPr>
@@ -5669,6 +5570,7 @@
             <w:tcW w:w="676" w:type="dxa"/>
             <w:tcBorders>
               <w:left w:val="none" w:sz="0" w:space="0" w:color="auto"/>
+              <w:bottom w:val="single" w:sz="8" w:space="0" w:color="B3CC82" w:themeColor="accent3" w:themeTint="BF"/>
               <w:right w:val="none" w:sz="0" w:space="0" w:color="auto"/>
             </w:tcBorders>
           </w:tcPr>
@@ -5681,10 +5583,170 @@
         </w:tc>
         <w:tc>
           <w:tcPr>
+            <w:tcW w:w="1294" w:type="dxa"/>
+            <w:tcBorders>
+              <w:left w:val="none" w:sz="0" w:space="0" w:color="auto"/>
+              <w:bottom w:val="single" w:sz="8" w:space="0" w:color="B3CC82" w:themeColor="accent3" w:themeTint="BF"/>
+            </w:tcBorders>
+          </w:tcPr>
+          <w:p>
+            <w:pPr>
+              <w:jc w:val="center"/>
+              <w:cnfStyle w:val="000000100000" w:firstRow="0" w:lastRow="0" w:firstColumn="0" w:lastColumn="0" w:oddVBand="0" w:evenVBand="0" w:oddHBand="1" w:evenHBand="0" w:firstRowFirstColumn="0" w:firstRowLastColumn="0" w:lastRowFirstColumn="0" w:lastRowLastColumn="0"/>
+            </w:pPr>
+          </w:p>
+        </w:tc>
+      </w:tr>
+      <w:tr>
+        <w:trPr>
+          <w:cnfStyle w:val="000000010000" w:firstRow="0" w:lastRow="0" w:firstColumn="0" w:lastColumn="0" w:oddVBand="0" w:evenVBand="0" w:oddHBand="0" w:evenHBand="1" w:firstRowFirstColumn="0" w:firstRowLastColumn="0" w:lastRowFirstColumn="0" w:lastRowLastColumn="0"/>
+        </w:trPr>
+        <w:tc>
+          <w:tcPr>
+            <w:cnfStyle w:val="001000000000" w:firstRow="0" w:lastRow="0" w:firstColumn="1" w:lastColumn="0" w:oddVBand="0" w:evenVBand="0" w:oddHBand="0" w:evenHBand="0" w:firstRowFirstColumn="0" w:firstRowLastColumn="0" w:lastRowFirstColumn="0" w:lastRowLastColumn="0"/>
+            <w:tcW w:w="959" w:type="dxa"/>
+            <w:tcBorders>
+              <w:right w:val="single" w:sz="8" w:space="0" w:color="B3CC82" w:themeColor="accent3" w:themeTint="BF"/>
+            </w:tcBorders>
+          </w:tcPr>
+          <w:p>
+            <w:r>
+              <w:t>MF-16</w:t>
+            </w:r>
+          </w:p>
+        </w:tc>
+        <w:tc>
+          <w:tcPr>
+            <w:tcW w:w="850" w:type="dxa"/>
+            <w:tcBorders>
+              <w:left w:val="single" w:sz="8" w:space="0" w:color="B3CC82" w:themeColor="accent3" w:themeTint="BF"/>
+              <w:right w:val="single" w:sz="8" w:space="0" w:color="B3CC82" w:themeColor="accent3" w:themeTint="BF"/>
+            </w:tcBorders>
+          </w:tcPr>
+          <w:p>
+            <w:pPr>
+              <w:jc w:val="center"/>
+              <w:cnfStyle w:val="000000010000" w:firstRow="0" w:lastRow="0" w:firstColumn="0" w:lastColumn="0" w:oddVBand="0" w:evenVBand="0" w:oddHBand="0" w:evenHBand="1" w:firstRowFirstColumn="0" w:firstRowLastColumn="0" w:lastRowFirstColumn="0" w:lastRowLastColumn="0"/>
+            </w:pPr>
+          </w:p>
+        </w:tc>
+        <w:tc>
+          <w:tcPr>
+            <w:tcW w:w="851" w:type="dxa"/>
+            <w:tcBorders>
+              <w:left w:val="single" w:sz="8" w:space="0" w:color="B3CC82" w:themeColor="accent3" w:themeTint="BF"/>
+              <w:right w:val="single" w:sz="8" w:space="0" w:color="B3CC82" w:themeColor="accent3" w:themeTint="BF"/>
+            </w:tcBorders>
+          </w:tcPr>
+          <w:p>
+            <w:pPr>
+              <w:jc w:val="center"/>
+              <w:cnfStyle w:val="000000010000" w:firstRow="0" w:lastRow="0" w:firstColumn="0" w:lastColumn="0" w:oddVBand="0" w:evenVBand="0" w:oddHBand="0" w:evenHBand="1" w:firstRowFirstColumn="0" w:firstRowLastColumn="0" w:lastRowFirstColumn="0" w:lastRowLastColumn="0"/>
+            </w:pPr>
+          </w:p>
+        </w:tc>
+        <w:tc>
+          <w:tcPr>
+            <w:tcW w:w="902" w:type="dxa"/>
+            <w:tcBorders>
+              <w:left w:val="single" w:sz="8" w:space="0" w:color="B3CC82" w:themeColor="accent3" w:themeTint="BF"/>
+              <w:right w:val="single" w:sz="8" w:space="0" w:color="B3CC82" w:themeColor="accent3" w:themeTint="BF"/>
+            </w:tcBorders>
+          </w:tcPr>
+          <w:p>
+            <w:pPr>
+              <w:jc w:val="center"/>
+              <w:cnfStyle w:val="000000010000" w:firstRow="0" w:lastRow="0" w:firstColumn="0" w:lastColumn="0" w:oddVBand="0" w:evenVBand="0" w:oddHBand="0" w:evenHBand="1" w:firstRowFirstColumn="0" w:firstRowLastColumn="0" w:lastRowFirstColumn="0" w:lastRowLastColumn="0"/>
+            </w:pPr>
+          </w:p>
+        </w:tc>
+        <w:tc>
+          <w:tcPr>
+            <w:tcW w:w="818" w:type="dxa"/>
+            <w:tcBorders>
+              <w:left w:val="single" w:sz="8" w:space="0" w:color="B3CC82" w:themeColor="accent3" w:themeTint="BF"/>
+              <w:right w:val="single" w:sz="8" w:space="0" w:color="B3CC82" w:themeColor="accent3" w:themeTint="BF"/>
+            </w:tcBorders>
+          </w:tcPr>
+          <w:p>
+            <w:pPr>
+              <w:jc w:val="center"/>
+              <w:cnfStyle w:val="000000010000" w:firstRow="0" w:lastRow="0" w:firstColumn="0" w:lastColumn="0" w:oddVBand="0" w:evenVBand="0" w:oddHBand="0" w:evenHBand="1" w:firstRowFirstColumn="0" w:firstRowLastColumn="0" w:lastRowFirstColumn="0" w:lastRowLastColumn="0"/>
+            </w:pPr>
+          </w:p>
+        </w:tc>
+        <w:tc>
+          <w:tcPr>
             <w:tcW w:w="676" w:type="dxa"/>
             <w:tcBorders>
-              <w:left w:val="none" w:sz="0" w:space="0" w:color="auto"/>
-              <w:right w:val="none" w:sz="0" w:space="0" w:color="auto"/>
+              <w:left w:val="single" w:sz="8" w:space="0" w:color="B3CC82" w:themeColor="accent3" w:themeTint="BF"/>
+              <w:right w:val="single" w:sz="8" w:space="0" w:color="B3CC82" w:themeColor="accent3" w:themeTint="BF"/>
+            </w:tcBorders>
+          </w:tcPr>
+          <w:p>
+            <w:pPr>
+              <w:jc w:val="center"/>
+              <w:cnfStyle w:val="000000010000" w:firstRow="0" w:lastRow="0" w:firstColumn="0" w:lastColumn="0" w:oddVBand="0" w:evenVBand="0" w:oddHBand="0" w:evenHBand="1" w:firstRowFirstColumn="0" w:firstRowLastColumn="0" w:lastRowFirstColumn="0" w:lastRowLastColumn="0"/>
+            </w:pPr>
+            <w:r>
+              <w:t>●</w:t>
+            </w:r>
+          </w:p>
+        </w:tc>
+        <w:tc>
+          <w:tcPr>
+            <w:tcW w:w="676" w:type="dxa"/>
+            <w:tcBorders>
+              <w:left w:val="single" w:sz="8" w:space="0" w:color="B3CC82" w:themeColor="accent3" w:themeTint="BF"/>
+              <w:right w:val="single" w:sz="8" w:space="0" w:color="B3CC82" w:themeColor="accent3" w:themeTint="BF"/>
+            </w:tcBorders>
+          </w:tcPr>
+          <w:p>
+            <w:pPr>
+              <w:jc w:val="center"/>
+              <w:cnfStyle w:val="000000010000" w:firstRow="0" w:lastRow="0" w:firstColumn="0" w:lastColumn="0" w:oddVBand="0" w:evenVBand="0" w:oddHBand="0" w:evenHBand="1" w:firstRowFirstColumn="0" w:firstRowLastColumn="0" w:lastRowFirstColumn="0" w:lastRowLastColumn="0"/>
+            </w:pPr>
+          </w:p>
+        </w:tc>
+        <w:tc>
+          <w:tcPr>
+            <w:tcW w:w="1294" w:type="dxa"/>
+            <w:tcBorders>
+              <w:left w:val="single" w:sz="8" w:space="0" w:color="B3CC82" w:themeColor="accent3" w:themeTint="BF"/>
+            </w:tcBorders>
+          </w:tcPr>
+          <w:p>
+            <w:pPr>
+              <w:jc w:val="center"/>
+              <w:cnfStyle w:val="000000010000" w:firstRow="0" w:lastRow="0" w:firstColumn="0" w:lastColumn="0" w:oddVBand="0" w:evenVBand="0" w:oddHBand="0" w:evenHBand="1" w:firstRowFirstColumn="0" w:firstRowLastColumn="0" w:lastRowFirstColumn="0" w:lastRowLastColumn="0"/>
+            </w:pPr>
+          </w:p>
+        </w:tc>
+      </w:tr>
+      <w:tr>
+        <w:trPr>
+          <w:cnfStyle w:val="000000100000" w:firstRow="0" w:lastRow="0" w:firstColumn="0" w:lastColumn="0" w:oddVBand="0" w:evenVBand="0" w:oddHBand="1" w:evenHBand="0" w:firstRowFirstColumn="0" w:firstRowLastColumn="0" w:lastRowFirstColumn="0" w:lastRowLastColumn="0"/>
+        </w:trPr>
+        <w:tc>
+          <w:tcPr>
+            <w:cnfStyle w:val="001000000000" w:firstRow="0" w:lastRow="0" w:firstColumn="1" w:lastColumn="0" w:oddVBand="0" w:evenVBand="0" w:oddHBand="0" w:evenHBand="0" w:firstRowFirstColumn="0" w:firstRowLastColumn="0" w:lastRowFirstColumn="0" w:lastRowLastColumn="0"/>
+            <w:tcW w:w="959" w:type="dxa"/>
+            <w:tcBorders>
+              <w:right w:val="single" w:sz="8" w:space="0" w:color="B3CC82" w:themeColor="accent3" w:themeTint="BF"/>
+            </w:tcBorders>
+          </w:tcPr>
+          <w:p>
+            <w:r>
+              <w:t>MF-17</w:t>
+            </w:r>
+          </w:p>
+        </w:tc>
+        <w:tc>
+          <w:tcPr>
+            <w:tcW w:w="850" w:type="dxa"/>
+            <w:tcBorders>
+              <w:left w:val="single" w:sz="8" w:space="0" w:color="B3CC82" w:themeColor="accent3" w:themeTint="BF"/>
+              <w:right w:val="single" w:sz="8" w:space="0" w:color="B3CC82" w:themeColor="accent3" w:themeTint="BF"/>
             </w:tcBorders>
           </w:tcPr>
           <w:p>
@@ -5696,10 +5758,10 @@
         </w:tc>
         <w:tc>
           <w:tcPr>
-            <w:tcW w:w="790" w:type="dxa"/>
-            <w:tcBorders>
-              <w:left w:val="none" w:sz="0" w:space="0" w:color="auto"/>
-              <w:right w:val="none" w:sz="0" w:space="0" w:color="auto"/>
+            <w:tcW w:w="851" w:type="dxa"/>
+            <w:tcBorders>
+              <w:left w:val="single" w:sz="8" w:space="0" w:color="B3CC82" w:themeColor="accent3" w:themeTint="BF"/>
+              <w:right w:val="single" w:sz="8" w:space="0" w:color="B3CC82" w:themeColor="accent3" w:themeTint="BF"/>
             </w:tcBorders>
           </w:tcPr>
           <w:p>
@@ -5711,9 +5773,576 @@
         </w:tc>
         <w:tc>
           <w:tcPr>
+            <w:tcW w:w="902" w:type="dxa"/>
+            <w:tcBorders>
+              <w:left w:val="single" w:sz="8" w:space="0" w:color="B3CC82" w:themeColor="accent3" w:themeTint="BF"/>
+              <w:right w:val="single" w:sz="8" w:space="0" w:color="B3CC82" w:themeColor="accent3" w:themeTint="BF"/>
+            </w:tcBorders>
+          </w:tcPr>
+          <w:p>
+            <w:pPr>
+              <w:jc w:val="center"/>
+              <w:cnfStyle w:val="000000100000" w:firstRow="0" w:lastRow="0" w:firstColumn="0" w:lastColumn="0" w:oddVBand="0" w:evenVBand="0" w:oddHBand="1" w:evenHBand="0" w:firstRowFirstColumn="0" w:firstRowLastColumn="0" w:lastRowFirstColumn="0" w:lastRowLastColumn="0"/>
+            </w:pPr>
+          </w:p>
+        </w:tc>
+        <w:tc>
+          <w:tcPr>
+            <w:tcW w:w="818" w:type="dxa"/>
+            <w:tcBorders>
+              <w:left w:val="single" w:sz="8" w:space="0" w:color="B3CC82" w:themeColor="accent3" w:themeTint="BF"/>
+              <w:right w:val="single" w:sz="8" w:space="0" w:color="B3CC82" w:themeColor="accent3" w:themeTint="BF"/>
+            </w:tcBorders>
+          </w:tcPr>
+          <w:p>
+            <w:pPr>
+              <w:jc w:val="center"/>
+              <w:cnfStyle w:val="000000100000" w:firstRow="0" w:lastRow="0" w:firstColumn="0" w:lastColumn="0" w:oddVBand="0" w:evenVBand="0" w:oddHBand="1" w:evenHBand="0" w:firstRowFirstColumn="0" w:firstRowLastColumn="0" w:lastRowFirstColumn="0" w:lastRowLastColumn="0"/>
+            </w:pPr>
+          </w:p>
+        </w:tc>
+        <w:tc>
+          <w:tcPr>
+            <w:tcW w:w="676" w:type="dxa"/>
+            <w:tcBorders>
+              <w:left w:val="single" w:sz="8" w:space="0" w:color="B3CC82" w:themeColor="accent3" w:themeTint="BF"/>
+              <w:right w:val="single" w:sz="8" w:space="0" w:color="B3CC82" w:themeColor="accent3" w:themeTint="BF"/>
+            </w:tcBorders>
+          </w:tcPr>
+          <w:p>
+            <w:pPr>
+              <w:jc w:val="center"/>
+              <w:cnfStyle w:val="000000100000" w:firstRow="0" w:lastRow="0" w:firstColumn="0" w:lastColumn="0" w:oddVBand="0" w:evenVBand="0" w:oddHBand="1" w:evenHBand="0" w:firstRowFirstColumn="0" w:firstRowLastColumn="0" w:lastRowFirstColumn="0" w:lastRowLastColumn="0"/>
+            </w:pPr>
+          </w:p>
+        </w:tc>
+        <w:tc>
+          <w:tcPr>
+            <w:tcW w:w="676" w:type="dxa"/>
+            <w:tcBorders>
+              <w:left w:val="single" w:sz="8" w:space="0" w:color="B3CC82" w:themeColor="accent3" w:themeTint="BF"/>
+              <w:right w:val="single" w:sz="8" w:space="0" w:color="B3CC82" w:themeColor="accent3" w:themeTint="BF"/>
+            </w:tcBorders>
+          </w:tcPr>
+          <w:p>
+            <w:pPr>
+              <w:jc w:val="center"/>
+              <w:cnfStyle w:val="000000100000" w:firstRow="0" w:lastRow="0" w:firstColumn="0" w:lastColumn="0" w:oddVBand="0" w:evenVBand="0" w:oddHBand="1" w:evenHBand="0" w:firstRowFirstColumn="0" w:firstRowLastColumn="0" w:lastRowFirstColumn="0" w:lastRowLastColumn="0"/>
+            </w:pPr>
+          </w:p>
+        </w:tc>
+        <w:tc>
+          <w:tcPr>
             <w:tcW w:w="1294" w:type="dxa"/>
             <w:tcBorders>
-              <w:left w:val="none" w:sz="0" w:space="0" w:color="auto"/>
+              <w:left w:val="single" w:sz="8" w:space="0" w:color="B3CC82" w:themeColor="accent3" w:themeTint="BF"/>
+            </w:tcBorders>
+          </w:tcPr>
+          <w:p>
+            <w:pPr>
+              <w:jc w:val="center"/>
+              <w:cnfStyle w:val="000000100000" w:firstRow="0" w:lastRow="0" w:firstColumn="0" w:lastColumn="0" w:oddVBand="0" w:evenVBand="0" w:oddHBand="1" w:evenHBand="0" w:firstRowFirstColumn="0" w:firstRowLastColumn="0" w:lastRowFirstColumn="0" w:lastRowLastColumn="0"/>
+            </w:pPr>
+            <w:r>
+              <w:t>●</w:t>
+            </w:r>
+          </w:p>
+        </w:tc>
+      </w:tr>
+      <w:tr>
+        <w:trPr>
+          <w:cnfStyle w:val="000000010000" w:firstRow="0" w:lastRow="0" w:firstColumn="0" w:lastColumn="0" w:oddVBand="0" w:evenVBand="0" w:oddHBand="0" w:evenHBand="1" w:firstRowFirstColumn="0" w:firstRowLastColumn="0" w:lastRowFirstColumn="0" w:lastRowLastColumn="0"/>
+        </w:trPr>
+        <w:tc>
+          <w:tcPr>
+            <w:cnfStyle w:val="001000000000" w:firstRow="0" w:lastRow="0" w:firstColumn="1" w:lastColumn="0" w:oddVBand="0" w:evenVBand="0" w:oddHBand="0" w:evenHBand="0" w:firstRowFirstColumn="0" w:firstRowLastColumn="0" w:lastRowFirstColumn="0" w:lastRowLastColumn="0"/>
+            <w:tcW w:w="959" w:type="dxa"/>
+            <w:tcBorders>
+              <w:right w:val="single" w:sz="8" w:space="0" w:color="B3CC82" w:themeColor="accent3" w:themeTint="BF"/>
+            </w:tcBorders>
+          </w:tcPr>
+          <w:p>
+            <w:r>
+              <w:t>MF-18</w:t>
+            </w:r>
+          </w:p>
+        </w:tc>
+        <w:tc>
+          <w:tcPr>
+            <w:tcW w:w="850" w:type="dxa"/>
+            <w:tcBorders>
+              <w:left w:val="single" w:sz="8" w:space="0" w:color="B3CC82" w:themeColor="accent3" w:themeTint="BF"/>
+              <w:right w:val="single" w:sz="8" w:space="0" w:color="B3CC82" w:themeColor="accent3" w:themeTint="BF"/>
+            </w:tcBorders>
+          </w:tcPr>
+          <w:p>
+            <w:pPr>
+              <w:jc w:val="center"/>
+              <w:cnfStyle w:val="000000010000" w:firstRow="0" w:lastRow="0" w:firstColumn="0" w:lastColumn="0" w:oddVBand="0" w:evenVBand="0" w:oddHBand="0" w:evenHBand="1" w:firstRowFirstColumn="0" w:firstRowLastColumn="0" w:lastRowFirstColumn="0" w:lastRowLastColumn="0"/>
+            </w:pPr>
+          </w:p>
+        </w:tc>
+        <w:tc>
+          <w:tcPr>
+            <w:tcW w:w="851" w:type="dxa"/>
+            <w:tcBorders>
+              <w:left w:val="single" w:sz="8" w:space="0" w:color="B3CC82" w:themeColor="accent3" w:themeTint="BF"/>
+              <w:right w:val="single" w:sz="8" w:space="0" w:color="B3CC82" w:themeColor="accent3" w:themeTint="BF"/>
+            </w:tcBorders>
+          </w:tcPr>
+          <w:p>
+            <w:pPr>
+              <w:jc w:val="center"/>
+              <w:cnfStyle w:val="000000010000" w:firstRow="0" w:lastRow="0" w:firstColumn="0" w:lastColumn="0" w:oddVBand="0" w:evenVBand="0" w:oddHBand="0" w:evenHBand="1" w:firstRowFirstColumn="0" w:firstRowLastColumn="0" w:lastRowFirstColumn="0" w:lastRowLastColumn="0"/>
+            </w:pPr>
+            <w:r>
+              <w:t>●</w:t>
+            </w:r>
+          </w:p>
+        </w:tc>
+        <w:tc>
+          <w:tcPr>
+            <w:tcW w:w="902" w:type="dxa"/>
+            <w:tcBorders>
+              <w:left w:val="single" w:sz="8" w:space="0" w:color="B3CC82" w:themeColor="accent3" w:themeTint="BF"/>
+              <w:right w:val="single" w:sz="8" w:space="0" w:color="B3CC82" w:themeColor="accent3" w:themeTint="BF"/>
+            </w:tcBorders>
+          </w:tcPr>
+          <w:p>
+            <w:pPr>
+              <w:jc w:val="center"/>
+              <w:cnfStyle w:val="000000010000" w:firstRow="0" w:lastRow="0" w:firstColumn="0" w:lastColumn="0" w:oddVBand="0" w:evenVBand="0" w:oddHBand="0" w:evenHBand="1" w:firstRowFirstColumn="0" w:firstRowLastColumn="0" w:lastRowFirstColumn="0" w:lastRowLastColumn="0"/>
+            </w:pPr>
+          </w:p>
+        </w:tc>
+        <w:tc>
+          <w:tcPr>
+            <w:tcW w:w="818" w:type="dxa"/>
+            <w:tcBorders>
+              <w:left w:val="single" w:sz="8" w:space="0" w:color="B3CC82" w:themeColor="accent3" w:themeTint="BF"/>
+              <w:right w:val="single" w:sz="8" w:space="0" w:color="B3CC82" w:themeColor="accent3" w:themeTint="BF"/>
+            </w:tcBorders>
+          </w:tcPr>
+          <w:p>
+            <w:pPr>
+              <w:jc w:val="center"/>
+              <w:cnfStyle w:val="000000010000" w:firstRow="0" w:lastRow="0" w:firstColumn="0" w:lastColumn="0" w:oddVBand="0" w:evenVBand="0" w:oddHBand="0" w:evenHBand="1" w:firstRowFirstColumn="0" w:firstRowLastColumn="0" w:lastRowFirstColumn="0" w:lastRowLastColumn="0"/>
+            </w:pPr>
+          </w:p>
+        </w:tc>
+        <w:tc>
+          <w:tcPr>
+            <w:tcW w:w="676" w:type="dxa"/>
+            <w:tcBorders>
+              <w:left w:val="single" w:sz="8" w:space="0" w:color="B3CC82" w:themeColor="accent3" w:themeTint="BF"/>
+              <w:right w:val="single" w:sz="8" w:space="0" w:color="B3CC82" w:themeColor="accent3" w:themeTint="BF"/>
+            </w:tcBorders>
+          </w:tcPr>
+          <w:p>
+            <w:pPr>
+              <w:jc w:val="center"/>
+              <w:cnfStyle w:val="000000010000" w:firstRow="0" w:lastRow="0" w:firstColumn="0" w:lastColumn="0" w:oddVBand="0" w:evenVBand="0" w:oddHBand="0" w:evenHBand="1" w:firstRowFirstColumn="0" w:firstRowLastColumn="0" w:lastRowFirstColumn="0" w:lastRowLastColumn="0"/>
+            </w:pPr>
+          </w:p>
+        </w:tc>
+        <w:tc>
+          <w:tcPr>
+            <w:tcW w:w="676" w:type="dxa"/>
+            <w:tcBorders>
+              <w:left w:val="single" w:sz="8" w:space="0" w:color="B3CC82" w:themeColor="accent3" w:themeTint="BF"/>
+              <w:right w:val="single" w:sz="8" w:space="0" w:color="B3CC82" w:themeColor="accent3" w:themeTint="BF"/>
+            </w:tcBorders>
+          </w:tcPr>
+          <w:p>
+            <w:pPr>
+              <w:jc w:val="center"/>
+              <w:cnfStyle w:val="000000010000" w:firstRow="0" w:lastRow="0" w:firstColumn="0" w:lastColumn="0" w:oddVBand="0" w:evenVBand="0" w:oddHBand="0" w:evenHBand="1" w:firstRowFirstColumn="0" w:firstRowLastColumn="0" w:lastRowFirstColumn="0" w:lastRowLastColumn="0"/>
+            </w:pPr>
+          </w:p>
+        </w:tc>
+        <w:tc>
+          <w:tcPr>
+            <w:tcW w:w="1294" w:type="dxa"/>
+            <w:tcBorders>
+              <w:left w:val="single" w:sz="8" w:space="0" w:color="B3CC82" w:themeColor="accent3" w:themeTint="BF"/>
+            </w:tcBorders>
+          </w:tcPr>
+          <w:p>
+            <w:pPr>
+              <w:jc w:val="center"/>
+              <w:cnfStyle w:val="000000010000" w:firstRow="0" w:lastRow="0" w:firstColumn="0" w:lastColumn="0" w:oddVBand="0" w:evenVBand="0" w:oddHBand="0" w:evenHBand="1" w:firstRowFirstColumn="0" w:firstRowLastColumn="0" w:lastRowFirstColumn="0" w:lastRowLastColumn="0"/>
+            </w:pPr>
+          </w:p>
+        </w:tc>
+      </w:tr>
+      <w:tr>
+        <w:trPr>
+          <w:cnfStyle w:val="000000100000" w:firstRow="0" w:lastRow="0" w:firstColumn="0" w:lastColumn="0" w:oddVBand="0" w:evenVBand="0" w:oddHBand="1" w:evenHBand="0" w:firstRowFirstColumn="0" w:firstRowLastColumn="0" w:lastRowFirstColumn="0" w:lastRowLastColumn="0"/>
+        </w:trPr>
+        <w:tc>
+          <w:tcPr>
+            <w:cnfStyle w:val="001000000000" w:firstRow="0" w:lastRow="0" w:firstColumn="1" w:lastColumn="0" w:oddVBand="0" w:evenVBand="0" w:oddHBand="0" w:evenHBand="0" w:firstRowFirstColumn="0" w:firstRowLastColumn="0" w:lastRowFirstColumn="0" w:lastRowLastColumn="0"/>
+            <w:tcW w:w="959" w:type="dxa"/>
+            <w:tcBorders>
+              <w:right w:val="single" w:sz="8" w:space="0" w:color="B3CC82" w:themeColor="accent3" w:themeTint="BF"/>
+            </w:tcBorders>
+          </w:tcPr>
+          <w:p>
+            <w:r>
+              <w:t>MF-19</w:t>
+            </w:r>
+          </w:p>
+        </w:tc>
+        <w:tc>
+          <w:tcPr>
+            <w:tcW w:w="850" w:type="dxa"/>
+            <w:tcBorders>
+              <w:left w:val="single" w:sz="8" w:space="0" w:color="B3CC82" w:themeColor="accent3" w:themeTint="BF"/>
+              <w:right w:val="single" w:sz="8" w:space="0" w:color="B3CC82" w:themeColor="accent3" w:themeTint="BF"/>
+            </w:tcBorders>
+          </w:tcPr>
+          <w:p>
+            <w:pPr>
+              <w:jc w:val="center"/>
+              <w:cnfStyle w:val="000000100000" w:firstRow="0" w:lastRow="0" w:firstColumn="0" w:lastColumn="0" w:oddVBand="0" w:evenVBand="0" w:oddHBand="1" w:evenHBand="0" w:firstRowFirstColumn="0" w:firstRowLastColumn="0" w:lastRowFirstColumn="0" w:lastRowLastColumn="0"/>
+            </w:pPr>
+          </w:p>
+        </w:tc>
+        <w:tc>
+          <w:tcPr>
+            <w:tcW w:w="851" w:type="dxa"/>
+            <w:tcBorders>
+              <w:left w:val="single" w:sz="8" w:space="0" w:color="B3CC82" w:themeColor="accent3" w:themeTint="BF"/>
+              <w:right w:val="single" w:sz="8" w:space="0" w:color="B3CC82" w:themeColor="accent3" w:themeTint="BF"/>
+            </w:tcBorders>
+          </w:tcPr>
+          <w:p>
+            <w:pPr>
+              <w:jc w:val="center"/>
+              <w:cnfStyle w:val="000000100000" w:firstRow="0" w:lastRow="0" w:firstColumn="0" w:lastColumn="0" w:oddVBand="0" w:evenVBand="0" w:oddHBand="1" w:evenHBand="0" w:firstRowFirstColumn="0" w:firstRowLastColumn="0" w:lastRowFirstColumn="0" w:lastRowLastColumn="0"/>
+            </w:pPr>
+          </w:p>
+        </w:tc>
+        <w:tc>
+          <w:tcPr>
+            <w:tcW w:w="902" w:type="dxa"/>
+            <w:tcBorders>
+              <w:left w:val="single" w:sz="8" w:space="0" w:color="B3CC82" w:themeColor="accent3" w:themeTint="BF"/>
+              <w:right w:val="single" w:sz="8" w:space="0" w:color="B3CC82" w:themeColor="accent3" w:themeTint="BF"/>
+            </w:tcBorders>
+          </w:tcPr>
+          <w:p>
+            <w:pPr>
+              <w:jc w:val="center"/>
+              <w:cnfStyle w:val="000000100000" w:firstRow="0" w:lastRow="0" w:firstColumn="0" w:lastColumn="0" w:oddVBand="0" w:evenVBand="0" w:oddHBand="1" w:evenHBand="0" w:firstRowFirstColumn="0" w:firstRowLastColumn="0" w:lastRowFirstColumn="0" w:lastRowLastColumn="0"/>
+            </w:pPr>
+          </w:p>
+        </w:tc>
+        <w:tc>
+          <w:tcPr>
+            <w:tcW w:w="818" w:type="dxa"/>
+            <w:tcBorders>
+              <w:left w:val="single" w:sz="8" w:space="0" w:color="B3CC82" w:themeColor="accent3" w:themeTint="BF"/>
+              <w:right w:val="single" w:sz="8" w:space="0" w:color="B3CC82" w:themeColor="accent3" w:themeTint="BF"/>
+            </w:tcBorders>
+          </w:tcPr>
+          <w:p>
+            <w:pPr>
+              <w:jc w:val="center"/>
+              <w:cnfStyle w:val="000000100000" w:firstRow="0" w:lastRow="0" w:firstColumn="0" w:lastColumn="0" w:oddVBand="0" w:evenVBand="0" w:oddHBand="1" w:evenHBand="0" w:firstRowFirstColumn="0" w:firstRowLastColumn="0" w:lastRowFirstColumn="0" w:lastRowLastColumn="0"/>
+            </w:pPr>
+          </w:p>
+        </w:tc>
+        <w:tc>
+          <w:tcPr>
+            <w:tcW w:w="676" w:type="dxa"/>
+            <w:tcBorders>
+              <w:left w:val="single" w:sz="8" w:space="0" w:color="B3CC82" w:themeColor="accent3" w:themeTint="BF"/>
+              <w:right w:val="single" w:sz="8" w:space="0" w:color="B3CC82" w:themeColor="accent3" w:themeTint="BF"/>
+            </w:tcBorders>
+          </w:tcPr>
+          <w:p>
+            <w:pPr>
+              <w:jc w:val="center"/>
+              <w:cnfStyle w:val="000000100000" w:firstRow="0" w:lastRow="0" w:firstColumn="0" w:lastColumn="0" w:oddVBand="0" w:evenVBand="0" w:oddHBand="1" w:evenHBand="0" w:firstRowFirstColumn="0" w:firstRowLastColumn="0" w:lastRowFirstColumn="0" w:lastRowLastColumn="0"/>
+            </w:pPr>
+          </w:p>
+        </w:tc>
+        <w:tc>
+          <w:tcPr>
+            <w:tcW w:w="676" w:type="dxa"/>
+            <w:tcBorders>
+              <w:left w:val="single" w:sz="8" w:space="0" w:color="B3CC82" w:themeColor="accent3" w:themeTint="BF"/>
+              <w:right w:val="single" w:sz="8" w:space="0" w:color="B3CC82" w:themeColor="accent3" w:themeTint="BF"/>
+            </w:tcBorders>
+          </w:tcPr>
+          <w:p>
+            <w:pPr>
+              <w:jc w:val="center"/>
+              <w:cnfStyle w:val="000000100000" w:firstRow="0" w:lastRow="0" w:firstColumn="0" w:lastColumn="0" w:oddVBand="0" w:evenVBand="0" w:oddHBand="1" w:evenHBand="0" w:firstRowFirstColumn="0" w:firstRowLastColumn="0" w:lastRowFirstColumn="0" w:lastRowLastColumn="0"/>
+            </w:pPr>
+            <w:r>
+              <w:t>●</w:t>
+            </w:r>
+          </w:p>
+        </w:tc>
+        <w:tc>
+          <w:tcPr>
+            <w:tcW w:w="1294" w:type="dxa"/>
+            <w:tcBorders>
+              <w:left w:val="single" w:sz="8" w:space="0" w:color="B3CC82" w:themeColor="accent3" w:themeTint="BF"/>
+            </w:tcBorders>
+          </w:tcPr>
+          <w:p>
+            <w:pPr>
+              <w:jc w:val="center"/>
+              <w:cnfStyle w:val="000000100000" w:firstRow="0" w:lastRow="0" w:firstColumn="0" w:lastColumn="0" w:oddVBand="0" w:evenVBand="0" w:oddHBand="1" w:evenHBand="0" w:firstRowFirstColumn="0" w:firstRowLastColumn="0" w:lastRowFirstColumn="0" w:lastRowLastColumn="0"/>
+            </w:pPr>
+          </w:p>
+        </w:tc>
+      </w:tr>
+      <w:tr>
+        <w:trPr>
+          <w:cnfStyle w:val="000000010000" w:firstRow="0" w:lastRow="0" w:firstColumn="0" w:lastColumn="0" w:oddVBand="0" w:evenVBand="0" w:oddHBand="0" w:evenHBand="1" w:firstRowFirstColumn="0" w:firstRowLastColumn="0" w:lastRowFirstColumn="0" w:lastRowLastColumn="0"/>
+        </w:trPr>
+        <w:tc>
+          <w:tcPr>
+            <w:cnfStyle w:val="001000000000" w:firstRow="0" w:lastRow="0" w:firstColumn="1" w:lastColumn="0" w:oddVBand="0" w:evenVBand="0" w:oddHBand="0" w:evenHBand="0" w:firstRowFirstColumn="0" w:firstRowLastColumn="0" w:lastRowFirstColumn="0" w:lastRowLastColumn="0"/>
+            <w:tcW w:w="959" w:type="dxa"/>
+            <w:tcBorders>
+              <w:right w:val="single" w:sz="8" w:space="0" w:color="B3CC82" w:themeColor="accent3" w:themeTint="BF"/>
+            </w:tcBorders>
+          </w:tcPr>
+          <w:p>
+            <w:r>
+              <w:t>MF-20</w:t>
+            </w:r>
+          </w:p>
+        </w:tc>
+        <w:tc>
+          <w:tcPr>
+            <w:tcW w:w="850" w:type="dxa"/>
+            <w:tcBorders>
+              <w:left w:val="single" w:sz="8" w:space="0" w:color="B3CC82" w:themeColor="accent3" w:themeTint="BF"/>
+              <w:right w:val="single" w:sz="8" w:space="0" w:color="B3CC82" w:themeColor="accent3" w:themeTint="BF"/>
+            </w:tcBorders>
+          </w:tcPr>
+          <w:p>
+            <w:pPr>
+              <w:jc w:val="center"/>
+              <w:cnfStyle w:val="000000010000" w:firstRow="0" w:lastRow="0" w:firstColumn="0" w:lastColumn="0" w:oddVBand="0" w:evenVBand="0" w:oddHBand="0" w:evenHBand="1" w:firstRowFirstColumn="0" w:firstRowLastColumn="0" w:lastRowFirstColumn="0" w:lastRowLastColumn="0"/>
+            </w:pPr>
+          </w:p>
+        </w:tc>
+        <w:tc>
+          <w:tcPr>
+            <w:tcW w:w="851" w:type="dxa"/>
+            <w:tcBorders>
+              <w:left w:val="single" w:sz="8" w:space="0" w:color="B3CC82" w:themeColor="accent3" w:themeTint="BF"/>
+              <w:right w:val="single" w:sz="8" w:space="0" w:color="B3CC82" w:themeColor="accent3" w:themeTint="BF"/>
+            </w:tcBorders>
+          </w:tcPr>
+          <w:p>
+            <w:pPr>
+              <w:jc w:val="center"/>
+              <w:cnfStyle w:val="000000010000" w:firstRow="0" w:lastRow="0" w:firstColumn="0" w:lastColumn="0" w:oddVBand="0" w:evenVBand="0" w:oddHBand="0" w:evenHBand="1" w:firstRowFirstColumn="0" w:firstRowLastColumn="0" w:lastRowFirstColumn="0" w:lastRowLastColumn="0"/>
+            </w:pPr>
+          </w:p>
+        </w:tc>
+        <w:tc>
+          <w:tcPr>
+            <w:tcW w:w="902" w:type="dxa"/>
+            <w:tcBorders>
+              <w:left w:val="single" w:sz="8" w:space="0" w:color="B3CC82" w:themeColor="accent3" w:themeTint="BF"/>
+              <w:right w:val="single" w:sz="8" w:space="0" w:color="B3CC82" w:themeColor="accent3" w:themeTint="BF"/>
+            </w:tcBorders>
+          </w:tcPr>
+          <w:p>
+            <w:pPr>
+              <w:jc w:val="center"/>
+              <w:cnfStyle w:val="000000010000" w:firstRow="0" w:lastRow="0" w:firstColumn="0" w:lastColumn="0" w:oddVBand="0" w:evenVBand="0" w:oddHBand="0" w:evenHBand="1" w:firstRowFirstColumn="0" w:firstRowLastColumn="0" w:lastRowFirstColumn="0" w:lastRowLastColumn="0"/>
+            </w:pPr>
+          </w:p>
+        </w:tc>
+        <w:tc>
+          <w:tcPr>
+            <w:tcW w:w="818" w:type="dxa"/>
+            <w:tcBorders>
+              <w:left w:val="single" w:sz="8" w:space="0" w:color="B3CC82" w:themeColor="accent3" w:themeTint="BF"/>
+              <w:right w:val="single" w:sz="8" w:space="0" w:color="B3CC82" w:themeColor="accent3" w:themeTint="BF"/>
+            </w:tcBorders>
+          </w:tcPr>
+          <w:p>
+            <w:pPr>
+              <w:jc w:val="center"/>
+              <w:cnfStyle w:val="000000010000" w:firstRow="0" w:lastRow="0" w:firstColumn="0" w:lastColumn="0" w:oddVBand="0" w:evenVBand="0" w:oddHBand="0" w:evenHBand="1" w:firstRowFirstColumn="0" w:firstRowLastColumn="0" w:lastRowFirstColumn="0" w:lastRowLastColumn="0"/>
+            </w:pPr>
+          </w:p>
+        </w:tc>
+        <w:tc>
+          <w:tcPr>
+            <w:tcW w:w="676" w:type="dxa"/>
+            <w:tcBorders>
+              <w:left w:val="single" w:sz="8" w:space="0" w:color="B3CC82" w:themeColor="accent3" w:themeTint="BF"/>
+              <w:right w:val="single" w:sz="8" w:space="0" w:color="B3CC82" w:themeColor="accent3" w:themeTint="BF"/>
+            </w:tcBorders>
+          </w:tcPr>
+          <w:p>
+            <w:pPr>
+              <w:jc w:val="center"/>
+              <w:cnfStyle w:val="000000010000" w:firstRow="0" w:lastRow="0" w:firstColumn="0" w:lastColumn="0" w:oddVBand="0" w:evenVBand="0" w:oddHBand="0" w:evenHBand="1" w:firstRowFirstColumn="0" w:firstRowLastColumn="0" w:lastRowFirstColumn="0" w:lastRowLastColumn="0"/>
+            </w:pPr>
+            <w:r>
+              <w:t>●</w:t>
+            </w:r>
+          </w:p>
+        </w:tc>
+        <w:tc>
+          <w:tcPr>
+            <w:tcW w:w="676" w:type="dxa"/>
+            <w:tcBorders>
+              <w:left w:val="single" w:sz="8" w:space="0" w:color="B3CC82" w:themeColor="accent3" w:themeTint="BF"/>
+              <w:right w:val="single" w:sz="8" w:space="0" w:color="B3CC82" w:themeColor="accent3" w:themeTint="BF"/>
+            </w:tcBorders>
+          </w:tcPr>
+          <w:p>
+            <w:pPr>
+              <w:jc w:val="center"/>
+              <w:cnfStyle w:val="000000010000" w:firstRow="0" w:lastRow="0" w:firstColumn="0" w:lastColumn="0" w:oddVBand="0" w:evenVBand="0" w:oddHBand="0" w:evenHBand="1" w:firstRowFirstColumn="0" w:firstRowLastColumn="0" w:lastRowFirstColumn="0" w:lastRowLastColumn="0"/>
+            </w:pPr>
+          </w:p>
+        </w:tc>
+        <w:tc>
+          <w:tcPr>
+            <w:tcW w:w="1294" w:type="dxa"/>
+            <w:tcBorders>
+              <w:left w:val="single" w:sz="8" w:space="0" w:color="B3CC82" w:themeColor="accent3" w:themeTint="BF"/>
+            </w:tcBorders>
+          </w:tcPr>
+          <w:p>
+            <w:pPr>
+              <w:jc w:val="center"/>
+              <w:cnfStyle w:val="000000010000" w:firstRow="0" w:lastRow="0" w:firstColumn="0" w:lastColumn="0" w:oddVBand="0" w:evenVBand="0" w:oddHBand="0" w:evenHBand="1" w:firstRowFirstColumn="0" w:firstRowLastColumn="0" w:lastRowFirstColumn="0" w:lastRowLastColumn="0"/>
+            </w:pPr>
+          </w:p>
+        </w:tc>
+      </w:tr>
+      <w:tr>
+        <w:trPr>
+          <w:cnfStyle w:val="000000100000" w:firstRow="0" w:lastRow="0" w:firstColumn="0" w:lastColumn="0" w:oddVBand="0" w:evenVBand="0" w:oddHBand="1" w:evenHBand="0" w:firstRowFirstColumn="0" w:firstRowLastColumn="0" w:lastRowFirstColumn="0" w:lastRowLastColumn="0"/>
+        </w:trPr>
+        <w:tc>
+          <w:tcPr>
+            <w:cnfStyle w:val="001000000000" w:firstRow="0" w:lastRow="0" w:firstColumn="1" w:lastColumn="0" w:oddVBand="0" w:evenVBand="0" w:oddHBand="0" w:evenHBand="0" w:firstRowFirstColumn="0" w:firstRowLastColumn="0" w:lastRowFirstColumn="0" w:lastRowLastColumn="0"/>
+            <w:tcW w:w="959" w:type="dxa"/>
+            <w:tcBorders>
+              <w:right w:val="single" w:sz="8" w:space="0" w:color="B3CC82" w:themeColor="accent3" w:themeTint="BF"/>
+            </w:tcBorders>
+          </w:tcPr>
+          <w:p>
+            <w:r>
+              <w:t>MF-21</w:t>
+            </w:r>
+          </w:p>
+        </w:tc>
+        <w:tc>
+          <w:tcPr>
+            <w:tcW w:w="850" w:type="dxa"/>
+            <w:tcBorders>
+              <w:left w:val="single" w:sz="8" w:space="0" w:color="B3CC82" w:themeColor="accent3" w:themeTint="BF"/>
+              <w:right w:val="single" w:sz="8" w:space="0" w:color="B3CC82" w:themeColor="accent3" w:themeTint="BF"/>
+            </w:tcBorders>
+          </w:tcPr>
+          <w:p>
+            <w:pPr>
+              <w:jc w:val="center"/>
+              <w:cnfStyle w:val="000000100000" w:firstRow="0" w:lastRow="0" w:firstColumn="0" w:lastColumn="0" w:oddVBand="0" w:evenVBand="0" w:oddHBand="1" w:evenHBand="0" w:firstRowFirstColumn="0" w:firstRowLastColumn="0" w:lastRowFirstColumn="0" w:lastRowLastColumn="0"/>
+            </w:pPr>
+          </w:p>
+        </w:tc>
+        <w:tc>
+          <w:tcPr>
+            <w:tcW w:w="851" w:type="dxa"/>
+            <w:tcBorders>
+              <w:left w:val="single" w:sz="8" w:space="0" w:color="B3CC82" w:themeColor="accent3" w:themeTint="BF"/>
+              <w:right w:val="single" w:sz="8" w:space="0" w:color="B3CC82" w:themeColor="accent3" w:themeTint="BF"/>
+            </w:tcBorders>
+          </w:tcPr>
+          <w:p>
+            <w:pPr>
+              <w:jc w:val="center"/>
+              <w:cnfStyle w:val="000000100000" w:firstRow="0" w:lastRow="0" w:firstColumn="0" w:lastColumn="0" w:oddVBand="0" w:evenVBand="0" w:oddHBand="1" w:evenHBand="0" w:firstRowFirstColumn="0" w:firstRowLastColumn="0" w:lastRowFirstColumn="0" w:lastRowLastColumn="0"/>
+            </w:pPr>
+          </w:p>
+        </w:tc>
+        <w:tc>
+          <w:tcPr>
+            <w:tcW w:w="902" w:type="dxa"/>
+            <w:tcBorders>
+              <w:left w:val="single" w:sz="8" w:space="0" w:color="B3CC82" w:themeColor="accent3" w:themeTint="BF"/>
+              <w:right w:val="single" w:sz="8" w:space="0" w:color="B3CC82" w:themeColor="accent3" w:themeTint="BF"/>
+            </w:tcBorders>
+          </w:tcPr>
+          <w:p>
+            <w:pPr>
+              <w:jc w:val="center"/>
+              <w:cnfStyle w:val="000000100000" w:firstRow="0" w:lastRow="0" w:firstColumn="0" w:lastColumn="0" w:oddVBand="0" w:evenVBand="0" w:oddHBand="1" w:evenHBand="0" w:firstRowFirstColumn="0" w:firstRowLastColumn="0" w:lastRowFirstColumn="0" w:lastRowLastColumn="0"/>
+            </w:pPr>
+          </w:p>
+        </w:tc>
+        <w:tc>
+          <w:tcPr>
+            <w:tcW w:w="818" w:type="dxa"/>
+            <w:tcBorders>
+              <w:left w:val="single" w:sz="8" w:space="0" w:color="B3CC82" w:themeColor="accent3" w:themeTint="BF"/>
+              <w:right w:val="single" w:sz="8" w:space="0" w:color="B3CC82" w:themeColor="accent3" w:themeTint="BF"/>
+            </w:tcBorders>
+          </w:tcPr>
+          <w:p>
+            <w:pPr>
+              <w:jc w:val="center"/>
+              <w:cnfStyle w:val="000000100000" w:firstRow="0" w:lastRow="0" w:firstColumn="0" w:lastColumn="0" w:oddVBand="0" w:evenVBand="0" w:oddHBand="1" w:evenHBand="0" w:firstRowFirstColumn="0" w:firstRowLastColumn="0" w:lastRowFirstColumn="0" w:lastRowLastColumn="0"/>
+            </w:pPr>
+          </w:p>
+        </w:tc>
+        <w:tc>
+          <w:tcPr>
+            <w:tcW w:w="676" w:type="dxa"/>
+            <w:tcBorders>
+              <w:left w:val="single" w:sz="8" w:space="0" w:color="B3CC82" w:themeColor="accent3" w:themeTint="BF"/>
+              <w:right w:val="single" w:sz="8" w:space="0" w:color="B3CC82" w:themeColor="accent3" w:themeTint="BF"/>
+            </w:tcBorders>
+          </w:tcPr>
+          <w:p>
+            <w:pPr>
+              <w:jc w:val="center"/>
+              <w:cnfStyle w:val="000000100000" w:firstRow="0" w:lastRow="0" w:firstColumn="0" w:lastColumn="0" w:oddVBand="0" w:evenVBand="0" w:oddHBand="1" w:evenHBand="0" w:firstRowFirstColumn="0" w:firstRowLastColumn="0" w:lastRowFirstColumn="0" w:lastRowLastColumn="0"/>
+            </w:pPr>
+            <w:r>
+              <w:t>●</w:t>
+            </w:r>
+          </w:p>
+        </w:tc>
+        <w:tc>
+          <w:tcPr>
+            <w:tcW w:w="676" w:type="dxa"/>
+            <w:tcBorders>
+              <w:left w:val="single" w:sz="8" w:space="0" w:color="B3CC82" w:themeColor="accent3" w:themeTint="BF"/>
+              <w:right w:val="single" w:sz="8" w:space="0" w:color="B3CC82" w:themeColor="accent3" w:themeTint="BF"/>
+            </w:tcBorders>
+          </w:tcPr>
+          <w:p>
+            <w:pPr>
+              <w:jc w:val="center"/>
+              <w:cnfStyle w:val="000000100000" w:firstRow="0" w:lastRow="0" w:firstColumn="0" w:lastColumn="0" w:oddVBand="0" w:evenVBand="0" w:oddHBand="1" w:evenHBand="0" w:firstRowFirstColumn="0" w:firstRowLastColumn="0" w:lastRowFirstColumn="0" w:lastRowLastColumn="0"/>
+            </w:pPr>
+          </w:p>
+        </w:tc>
+        <w:tc>
+          <w:tcPr>
+            <w:tcW w:w="1294" w:type="dxa"/>
+            <w:tcBorders>
+              <w:left w:val="single" w:sz="8" w:space="0" w:color="B3CC82" w:themeColor="accent3" w:themeTint="BF"/>
             </w:tcBorders>
           </w:tcPr>
           <w:p>
@@ -5734,7 +6363,7 @@
         </w:numPr>
         <w:ind w:left="431" w:hanging="431"/>
       </w:pPr>
-      <w:bookmarkStart w:id="13" w:name="_Toc303022341"/>
+      <w:bookmarkStart w:id="13" w:name="_Toc303807218"/>
       <w:r>
         <w:t>Limitations and Exclusions</w:t>
       </w:r>
@@ -5817,7 +6446,7 @@
           <w:numId w:val="11"/>
         </w:numPr>
       </w:pPr>
-      <w:bookmarkStart w:id="14" w:name="_Toc303022342"/>
+      <w:bookmarkStart w:id="14" w:name="_Toc303807219"/>
       <w:r>
         <w:t>Business Context</w:t>
       </w:r>
@@ -5832,7 +6461,7 @@
         </w:numPr>
         <w:ind w:left="431" w:hanging="431"/>
       </w:pPr>
-      <w:bookmarkStart w:id="15" w:name="_Toc303022343"/>
+      <w:bookmarkStart w:id="15" w:name="_Toc303807220"/>
       <w:r>
         <w:t>Stakeholder Profiles</w:t>
       </w:r>
@@ -5852,18 +6481,434 @@
         </w:numPr>
         <w:ind w:left="431" w:hanging="431"/>
       </w:pPr>
-      <w:bookmarkStart w:id="16" w:name="_Toc303022344"/>
+      <w:bookmarkStart w:id="16" w:name="_Toc303807221"/>
       <w:r>
-        <w:lastRenderedPageBreak/>
         <w:t>Project Priorities</w:t>
       </w:r>
       <w:bookmarkEnd w:id="16"/>
     </w:p>
-    <w:p>
-      <w:r>
-        <w:t>&lt;TODO&gt;</w:t>
-      </w:r>
-    </w:p>
+    <w:tbl>
+      <w:tblPr>
+        <w:tblStyle w:val="LightList-Accent1"/>
+        <w:tblW w:w="0" w:type="auto"/>
+        <w:tblLook w:val="04A0" w:firstRow="1" w:lastRow="0" w:firstColumn="1" w:lastColumn="0" w:noHBand="0" w:noVBand="1"/>
+      </w:tblPr>
+      <w:tblGrid>
+        <w:gridCol w:w="2180"/>
+        <w:gridCol w:w="2180"/>
+        <w:gridCol w:w="2180"/>
+        <w:gridCol w:w="2180"/>
+      </w:tblGrid>
+      <w:tr>
+        <w:trPr>
+          <w:cnfStyle w:val="100000000000" w:firstRow="1" w:lastRow="0" w:firstColumn="0" w:lastColumn="0" w:oddVBand="0" w:evenVBand="0" w:oddHBand="0" w:evenHBand="0" w:firstRowFirstColumn="0" w:firstRowLastColumn="0" w:lastRowFirstColumn="0" w:lastRowLastColumn="0"/>
+        </w:trPr>
+        <w:tc>
+          <w:tcPr>
+            <w:cnfStyle w:val="001000000000" w:firstRow="0" w:lastRow="0" w:firstColumn="1" w:lastColumn="0" w:oddVBand="0" w:evenVBand="0" w:oddHBand="0" w:evenHBand="0" w:firstRowFirstColumn="0" w:firstRowLastColumn="0" w:lastRowFirstColumn="0" w:lastRowLastColumn="0"/>
+            <w:tcW w:w="2180" w:type="dxa"/>
+            <w:tcBorders>
+              <w:bottom w:val="single" w:sz="8" w:space="0" w:color="4F81BD" w:themeColor="accent1"/>
+            </w:tcBorders>
+          </w:tcPr>
+          <w:p>
+            <w:r>
+              <w:t>Dimension</w:t>
+            </w:r>
+          </w:p>
+        </w:tc>
+        <w:tc>
+          <w:tcPr>
+            <w:tcW w:w="2180" w:type="dxa"/>
+            <w:tcBorders>
+              <w:bottom w:val="single" w:sz="8" w:space="0" w:color="4F81BD" w:themeColor="accent1"/>
+            </w:tcBorders>
+          </w:tcPr>
+          <w:p>
+            <w:pPr>
+              <w:cnfStyle w:val="100000000000" w:firstRow="1" w:lastRow="0" w:firstColumn="0" w:lastColumn="0" w:oddVBand="0" w:evenVBand="0" w:oddHBand="0" w:evenHBand="0" w:firstRowFirstColumn="0" w:firstRowLastColumn="0" w:lastRowFirstColumn="0" w:lastRowLastColumn="0"/>
+            </w:pPr>
+            <w:r>
+              <w:t>Driver</w:t>
+            </w:r>
+          </w:p>
+        </w:tc>
+        <w:tc>
+          <w:tcPr>
+            <w:tcW w:w="2180" w:type="dxa"/>
+            <w:tcBorders>
+              <w:bottom w:val="single" w:sz="8" w:space="0" w:color="4F81BD" w:themeColor="accent1"/>
+            </w:tcBorders>
+          </w:tcPr>
+          <w:p>
+            <w:pPr>
+              <w:cnfStyle w:val="100000000000" w:firstRow="1" w:lastRow="0" w:firstColumn="0" w:lastColumn="0" w:oddVBand="0" w:evenVBand="0" w:oddHBand="0" w:evenHBand="0" w:firstRowFirstColumn="0" w:firstRowLastColumn="0" w:lastRowFirstColumn="0" w:lastRowLastColumn="0"/>
+            </w:pPr>
+            <w:r>
+              <w:t>Constraint</w:t>
+            </w:r>
+          </w:p>
+        </w:tc>
+        <w:tc>
+          <w:tcPr>
+            <w:tcW w:w="2180" w:type="dxa"/>
+            <w:tcBorders>
+              <w:bottom w:val="single" w:sz="8" w:space="0" w:color="4F81BD" w:themeColor="accent1"/>
+            </w:tcBorders>
+          </w:tcPr>
+          <w:p>
+            <w:pPr>
+              <w:cnfStyle w:val="100000000000" w:firstRow="1" w:lastRow="0" w:firstColumn="0" w:lastColumn="0" w:oddVBand="0" w:evenVBand="0" w:oddHBand="0" w:evenHBand="0" w:firstRowFirstColumn="0" w:firstRowLastColumn="0" w:lastRowFirstColumn="0" w:lastRowLastColumn="0"/>
+            </w:pPr>
+            <w:r>
+              <w:t>Degree Of Freedom</w:t>
+            </w:r>
+          </w:p>
+        </w:tc>
+      </w:tr>
+      <w:tr>
+        <w:trPr>
+          <w:cnfStyle w:val="000000100000" w:firstRow="0" w:lastRow="0" w:firstColumn="0" w:lastColumn="0" w:oddVBand="0" w:evenVBand="0" w:oddHBand="1" w:evenHBand="0" w:firstRowFirstColumn="0" w:firstRowLastColumn="0" w:lastRowFirstColumn="0" w:lastRowLastColumn="0"/>
+        </w:trPr>
+        <w:tc>
+          <w:tcPr>
+            <w:cnfStyle w:val="001000000000" w:firstRow="0" w:lastRow="0" w:firstColumn="1" w:lastColumn="0" w:oddVBand="0" w:evenVBand="0" w:oddHBand="0" w:evenHBand="0" w:firstRowFirstColumn="0" w:firstRowLastColumn="0" w:lastRowFirstColumn="0" w:lastRowLastColumn="0"/>
+            <w:tcW w:w="2180" w:type="dxa"/>
+            <w:tcBorders>
+              <w:right w:val="single" w:sz="8" w:space="0" w:color="4F81BD" w:themeColor="accent1"/>
+            </w:tcBorders>
+            <w:shd w:val="clear" w:color="auto" w:fill="B8CCE4" w:themeFill="accent1" w:themeFillTint="66"/>
+          </w:tcPr>
+          <w:p>
+            <w:r>
+              <w:t>Time</w:t>
+            </w:r>
+          </w:p>
+        </w:tc>
+        <w:tc>
+          <w:tcPr>
+            <w:tcW w:w="2180" w:type="dxa"/>
+            <w:tcBorders>
+              <w:left w:val="single" w:sz="8" w:space="0" w:color="4F81BD" w:themeColor="accent1"/>
+              <w:right w:val="single" w:sz="8" w:space="0" w:color="4F81BD" w:themeColor="accent1"/>
+            </w:tcBorders>
+            <w:shd w:val="clear" w:color="auto" w:fill="D9D9D9" w:themeFill="background1" w:themeFillShade="D9"/>
+          </w:tcPr>
+          <w:p>
+            <w:pPr>
+              <w:cnfStyle w:val="000000100000" w:firstRow="0" w:lastRow="0" w:firstColumn="0" w:lastColumn="0" w:oddVBand="0" w:evenVBand="0" w:oddHBand="1" w:evenHBand="0" w:firstRowFirstColumn="0" w:firstRowLastColumn="0" w:lastRowFirstColumn="0" w:lastRowLastColumn="0"/>
+            </w:pPr>
+          </w:p>
+        </w:tc>
+        <w:tc>
+          <w:tcPr>
+            <w:tcW w:w="2180" w:type="dxa"/>
+            <w:tcBorders>
+              <w:left w:val="single" w:sz="8" w:space="0" w:color="4F81BD" w:themeColor="accent1"/>
+              <w:right w:val="single" w:sz="8" w:space="0" w:color="4F81BD" w:themeColor="accent1"/>
+            </w:tcBorders>
+            <w:shd w:val="clear" w:color="auto" w:fill="D9D9D9" w:themeFill="background1" w:themeFillShade="D9"/>
+          </w:tcPr>
+          <w:p>
+            <w:pPr>
+              <w:cnfStyle w:val="000000100000" w:firstRow="0" w:lastRow="0" w:firstColumn="0" w:lastColumn="0" w:oddVBand="0" w:evenVBand="0" w:oddHBand="1" w:evenHBand="0" w:firstRowFirstColumn="0" w:firstRowLastColumn="0" w:lastRowFirstColumn="0" w:lastRowLastColumn="0"/>
+            </w:pPr>
+          </w:p>
+        </w:tc>
+        <w:tc>
+          <w:tcPr>
+            <w:tcW w:w="2180" w:type="dxa"/>
+            <w:tcBorders>
+              <w:left w:val="single" w:sz="8" w:space="0" w:color="4F81BD" w:themeColor="accent1"/>
+            </w:tcBorders>
+          </w:tcPr>
+          <w:p>
+            <w:pPr>
+              <w:cnfStyle w:val="000000100000" w:firstRow="0" w:lastRow="0" w:firstColumn="0" w:lastColumn="0" w:oddVBand="0" w:evenVBand="0" w:oddHBand="1" w:evenHBand="0" w:firstRowFirstColumn="0" w:firstRowLastColumn="0" w:lastRowFirstColumn="0" w:lastRowLastColumn="0"/>
+            </w:pPr>
+            <w:r>
+              <w:t>Plan to be online within 6 months. Total project can span years if necessary and feasible.</w:t>
+            </w:r>
+          </w:p>
+        </w:tc>
+      </w:tr>
+      <w:tr>
+        <w:tc>
+          <w:tcPr>
+            <w:cnfStyle w:val="001000000000" w:firstRow="0" w:lastRow="0" w:firstColumn="1" w:lastColumn="0" w:oddVBand="0" w:evenVBand="0" w:oddHBand="0" w:evenHBand="0" w:firstRowFirstColumn="0" w:firstRowLastColumn="0" w:lastRowFirstColumn="0" w:lastRowLastColumn="0"/>
+            <w:tcW w:w="2180" w:type="dxa"/>
+            <w:tcBorders>
+              <w:top w:val="single" w:sz="8" w:space="0" w:color="4F81BD" w:themeColor="accent1"/>
+              <w:bottom w:val="single" w:sz="8" w:space="0" w:color="4F81BD" w:themeColor="accent1"/>
+              <w:right w:val="single" w:sz="8" w:space="0" w:color="4F81BD" w:themeColor="accent1"/>
+            </w:tcBorders>
+            <w:shd w:val="clear" w:color="auto" w:fill="B8CCE4" w:themeFill="accent1" w:themeFillTint="66"/>
+          </w:tcPr>
+          <w:p>
+            <w:r>
+              <w:t>Scope</w:t>
+            </w:r>
+          </w:p>
+        </w:tc>
+        <w:tc>
+          <w:tcPr>
+            <w:tcW w:w="2180" w:type="dxa"/>
+            <w:tcBorders>
+              <w:top w:val="single" w:sz="8" w:space="0" w:color="4F81BD" w:themeColor="accent1"/>
+              <w:left w:val="single" w:sz="8" w:space="0" w:color="4F81BD" w:themeColor="accent1"/>
+              <w:bottom w:val="single" w:sz="8" w:space="0" w:color="4F81BD" w:themeColor="accent1"/>
+              <w:right w:val="single" w:sz="8" w:space="0" w:color="4F81BD" w:themeColor="accent1"/>
+            </w:tcBorders>
+            <w:shd w:val="clear" w:color="auto" w:fill="D9D9D9" w:themeFill="background1" w:themeFillShade="D9"/>
+          </w:tcPr>
+          <w:p>
+            <w:pPr>
+              <w:cnfStyle w:val="000000000000" w:firstRow="0" w:lastRow="0" w:firstColumn="0" w:lastColumn="0" w:oddVBand="0" w:evenVBand="0" w:oddHBand="0" w:evenHBand="0" w:firstRowFirstColumn="0" w:firstRowLastColumn="0" w:lastRowFirstColumn="0" w:lastRowLastColumn="0"/>
+            </w:pPr>
+          </w:p>
+        </w:tc>
+        <w:tc>
+          <w:tcPr>
+            <w:tcW w:w="2180" w:type="dxa"/>
+            <w:tcBorders>
+              <w:top w:val="single" w:sz="8" w:space="0" w:color="4F81BD" w:themeColor="accent1"/>
+              <w:left w:val="single" w:sz="8" w:space="0" w:color="4F81BD" w:themeColor="accent1"/>
+              <w:bottom w:val="single" w:sz="8" w:space="0" w:color="4F81BD" w:themeColor="accent1"/>
+              <w:right w:val="single" w:sz="8" w:space="0" w:color="4F81BD" w:themeColor="accent1"/>
+            </w:tcBorders>
+            <w:shd w:val="clear" w:color="auto" w:fill="D9D9D9" w:themeFill="background1" w:themeFillShade="D9"/>
+          </w:tcPr>
+          <w:p>
+            <w:pPr>
+              <w:cnfStyle w:val="000000000000" w:firstRow="0" w:lastRow="0" w:firstColumn="0" w:lastColumn="0" w:oddVBand="0" w:evenVBand="0" w:oddHBand="0" w:evenHBand="0" w:firstRowFirstColumn="0" w:firstRowLastColumn="0" w:lastRowFirstColumn="0" w:lastRowLastColumn="0"/>
+            </w:pPr>
+          </w:p>
+        </w:tc>
+        <w:tc>
+          <w:tcPr>
+            <w:tcW w:w="2180" w:type="dxa"/>
+            <w:tcBorders>
+              <w:top w:val="single" w:sz="8" w:space="0" w:color="4F81BD" w:themeColor="accent1"/>
+              <w:left w:val="single" w:sz="8" w:space="0" w:color="4F81BD" w:themeColor="accent1"/>
+              <w:bottom w:val="single" w:sz="8" w:space="0" w:color="4F81BD" w:themeColor="accent1"/>
+            </w:tcBorders>
+          </w:tcPr>
+          <w:p>
+            <w:pPr>
+              <w:cnfStyle w:val="000000000000" w:firstRow="0" w:lastRow="0" w:firstColumn="0" w:lastColumn="0" w:oddVBand="0" w:evenVBand="0" w:oddHBand="0" w:evenHBand="0" w:firstRowFirstColumn="0" w:firstRowLastColumn="0" w:lastRowFirstColumn="0" w:lastRowLastColumn="0"/>
+            </w:pPr>
+            <w:r>
+              <w:t>Scope can be adjusted to reflect business or project needs.</w:t>
+            </w:r>
+          </w:p>
+        </w:tc>
+      </w:tr>
+      <w:tr>
+        <w:trPr>
+          <w:cnfStyle w:val="000000100000" w:firstRow="0" w:lastRow="0" w:firstColumn="0" w:lastColumn="0" w:oddVBand="0" w:evenVBand="0" w:oddHBand="1" w:evenHBand="0" w:firstRowFirstColumn="0" w:firstRowLastColumn="0" w:lastRowFirstColumn="0" w:lastRowLastColumn="0"/>
+        </w:trPr>
+        <w:tc>
+          <w:tcPr>
+            <w:cnfStyle w:val="001000000000" w:firstRow="0" w:lastRow="0" w:firstColumn="1" w:lastColumn="0" w:oddVBand="0" w:evenVBand="0" w:oddHBand="0" w:evenHBand="0" w:firstRowFirstColumn="0" w:firstRowLastColumn="0" w:lastRowFirstColumn="0" w:lastRowLastColumn="0"/>
+            <w:tcW w:w="2180" w:type="dxa"/>
+            <w:tcBorders>
+              <w:right w:val="single" w:sz="8" w:space="0" w:color="4F81BD" w:themeColor="accent1"/>
+            </w:tcBorders>
+            <w:shd w:val="clear" w:color="auto" w:fill="B8CCE4" w:themeFill="accent1" w:themeFillTint="66"/>
+          </w:tcPr>
+          <w:p>
+            <w:r>
+              <w:t>Cost</w:t>
+            </w:r>
+          </w:p>
+        </w:tc>
+        <w:tc>
+          <w:tcPr>
+            <w:tcW w:w="2180" w:type="dxa"/>
+            <w:tcBorders>
+              <w:left w:val="single" w:sz="8" w:space="0" w:color="4F81BD" w:themeColor="accent1"/>
+              <w:right w:val="single" w:sz="8" w:space="0" w:color="4F81BD" w:themeColor="accent1"/>
+            </w:tcBorders>
+            <w:shd w:val="clear" w:color="auto" w:fill="D9D9D9" w:themeFill="background1" w:themeFillShade="D9"/>
+          </w:tcPr>
+          <w:p>
+            <w:pPr>
+              <w:cnfStyle w:val="000000100000" w:firstRow="0" w:lastRow="0" w:firstColumn="0" w:lastColumn="0" w:oddVBand="0" w:evenVBand="0" w:oddHBand="1" w:evenHBand="0" w:firstRowFirstColumn="0" w:firstRowLastColumn="0" w:lastRowFirstColumn="0" w:lastRowLastColumn="0"/>
+            </w:pPr>
+          </w:p>
+        </w:tc>
+        <w:tc>
+          <w:tcPr>
+            <w:tcW w:w="2180" w:type="dxa"/>
+            <w:tcBorders>
+              <w:left w:val="single" w:sz="8" w:space="0" w:color="4F81BD" w:themeColor="accent1"/>
+              <w:right w:val="single" w:sz="8" w:space="0" w:color="4F81BD" w:themeColor="accent1"/>
+            </w:tcBorders>
+            <w:shd w:val="clear" w:color="auto" w:fill="auto"/>
+          </w:tcPr>
+          <w:p>
+            <w:pPr>
+              <w:cnfStyle w:val="000000100000" w:firstRow="0" w:lastRow="0" w:firstColumn="0" w:lastColumn="0" w:oddVBand="0" w:evenVBand="0" w:oddHBand="1" w:evenHBand="0" w:firstRowFirstColumn="0" w:firstRowLastColumn="0" w:lastRowFirstColumn="0" w:lastRowLastColumn="0"/>
+            </w:pPr>
+            <w:r>
+              <w:t>Budget is my own personal bank account.</w:t>
+            </w:r>
+          </w:p>
+        </w:tc>
+        <w:tc>
+          <w:tcPr>
+            <w:tcW w:w="2180" w:type="dxa"/>
+            <w:tcBorders>
+              <w:left w:val="single" w:sz="8" w:space="0" w:color="4F81BD" w:themeColor="accent1"/>
+            </w:tcBorders>
+            <w:shd w:val="clear" w:color="auto" w:fill="D9D9D9" w:themeFill="background1" w:themeFillShade="D9"/>
+          </w:tcPr>
+          <w:p>
+            <w:pPr>
+              <w:cnfStyle w:val="000000100000" w:firstRow="0" w:lastRow="0" w:firstColumn="0" w:lastColumn="0" w:oddVBand="0" w:evenVBand="0" w:oddHBand="1" w:evenHBand="0" w:firstRowFirstColumn="0" w:firstRowLastColumn="0" w:lastRowFirstColumn="0" w:lastRowLastColumn="0"/>
+            </w:pPr>
+          </w:p>
+        </w:tc>
+      </w:tr>
+      <w:tr>
+        <w:tc>
+          <w:tcPr>
+            <w:cnfStyle w:val="001000000000" w:firstRow="0" w:lastRow="0" w:firstColumn="1" w:lastColumn="0" w:oddVBand="0" w:evenVBand="0" w:oddHBand="0" w:evenHBand="0" w:firstRowFirstColumn="0" w:firstRowLastColumn="0" w:lastRowFirstColumn="0" w:lastRowLastColumn="0"/>
+            <w:tcW w:w="2180" w:type="dxa"/>
+            <w:tcBorders>
+              <w:top w:val="single" w:sz="8" w:space="0" w:color="4F81BD" w:themeColor="accent1"/>
+              <w:bottom w:val="single" w:sz="8" w:space="0" w:color="4F81BD" w:themeColor="accent1"/>
+              <w:right w:val="single" w:sz="8" w:space="0" w:color="4F81BD" w:themeColor="accent1"/>
+            </w:tcBorders>
+            <w:shd w:val="clear" w:color="auto" w:fill="B8CCE4" w:themeFill="accent1" w:themeFillTint="66"/>
+          </w:tcPr>
+          <w:p>
+            <w:r>
+              <w:t>Staff</w:t>
+            </w:r>
+          </w:p>
+        </w:tc>
+        <w:tc>
+          <w:tcPr>
+            <w:tcW w:w="2180" w:type="dxa"/>
+            <w:tcBorders>
+              <w:top w:val="single" w:sz="8" w:space="0" w:color="4F81BD" w:themeColor="accent1"/>
+              <w:left w:val="single" w:sz="8" w:space="0" w:color="4F81BD" w:themeColor="accent1"/>
+              <w:bottom w:val="single" w:sz="8" w:space="0" w:color="4F81BD" w:themeColor="accent1"/>
+              <w:right w:val="single" w:sz="8" w:space="0" w:color="4F81BD" w:themeColor="accent1"/>
+            </w:tcBorders>
+            <w:shd w:val="clear" w:color="auto" w:fill="D9D9D9" w:themeFill="background1" w:themeFillShade="D9"/>
+          </w:tcPr>
+          <w:p>
+            <w:pPr>
+              <w:cnfStyle w:val="000000000000" w:firstRow="0" w:lastRow="0" w:firstColumn="0" w:lastColumn="0" w:oddVBand="0" w:evenVBand="0" w:oddHBand="0" w:evenHBand="0" w:firstRowFirstColumn="0" w:firstRowLastColumn="0" w:lastRowFirstColumn="0" w:lastRowLastColumn="0"/>
+            </w:pPr>
+          </w:p>
+        </w:tc>
+        <w:tc>
+          <w:tcPr>
+            <w:tcW w:w="2180" w:type="dxa"/>
+            <w:tcBorders>
+              <w:top w:val="single" w:sz="8" w:space="0" w:color="4F81BD" w:themeColor="accent1"/>
+              <w:left w:val="single" w:sz="8" w:space="0" w:color="4F81BD" w:themeColor="accent1"/>
+              <w:bottom w:val="single" w:sz="8" w:space="0" w:color="4F81BD" w:themeColor="accent1"/>
+              <w:right w:val="single" w:sz="8" w:space="0" w:color="4F81BD" w:themeColor="accent1"/>
+            </w:tcBorders>
+          </w:tcPr>
+          <w:p>
+            <w:pPr>
+              <w:cnfStyle w:val="000000000000" w:firstRow="0" w:lastRow="0" w:firstColumn="0" w:lastColumn="0" w:oddVBand="0" w:evenVBand="0" w:oddHBand="0" w:evenHBand="0" w:firstRowFirstColumn="0" w:firstRowLastColumn="0" w:lastRowFirstColumn="0" w:lastRowLastColumn="0"/>
+            </w:pPr>
+            <w:r>
+              <w:t>1x FTE.</w:t>
+            </w:r>
+          </w:p>
+        </w:tc>
+        <w:tc>
+          <w:tcPr>
+            <w:tcW w:w="2180" w:type="dxa"/>
+            <w:tcBorders>
+              <w:top w:val="single" w:sz="8" w:space="0" w:color="4F81BD" w:themeColor="accent1"/>
+              <w:left w:val="single" w:sz="8" w:space="0" w:color="4F81BD" w:themeColor="accent1"/>
+              <w:bottom w:val="single" w:sz="8" w:space="0" w:color="4F81BD" w:themeColor="accent1"/>
+            </w:tcBorders>
+            <w:shd w:val="clear" w:color="auto" w:fill="D9D9D9" w:themeFill="background1" w:themeFillShade="D9"/>
+          </w:tcPr>
+          <w:p>
+            <w:pPr>
+              <w:cnfStyle w:val="000000000000" w:firstRow="0" w:lastRow="0" w:firstColumn="0" w:lastColumn="0" w:oddVBand="0" w:evenVBand="0" w:oddHBand="0" w:evenHBand="0" w:firstRowFirstColumn="0" w:firstRowLastColumn="0" w:lastRowFirstColumn="0" w:lastRowLastColumn="0"/>
+            </w:pPr>
+          </w:p>
+        </w:tc>
+      </w:tr>
+      <w:tr>
+        <w:trPr>
+          <w:cnfStyle w:val="000000100000" w:firstRow="0" w:lastRow="0" w:firstColumn="0" w:lastColumn="0" w:oddVBand="0" w:evenVBand="0" w:oddHBand="1" w:evenHBand="0" w:firstRowFirstColumn="0" w:firstRowLastColumn="0" w:lastRowFirstColumn="0" w:lastRowLastColumn="0"/>
+        </w:trPr>
+        <w:tc>
+          <w:tcPr>
+            <w:cnfStyle w:val="001000000000" w:firstRow="0" w:lastRow="0" w:firstColumn="1" w:lastColumn="0" w:oddVBand="0" w:evenVBand="0" w:oddHBand="0" w:evenHBand="0" w:firstRowFirstColumn="0" w:firstRowLastColumn="0" w:lastRowFirstColumn="0" w:lastRowLastColumn="0"/>
+            <w:tcW w:w="2180" w:type="dxa"/>
+            <w:tcBorders>
+              <w:right w:val="single" w:sz="8" w:space="0" w:color="4F81BD" w:themeColor="accent1"/>
+            </w:tcBorders>
+            <w:shd w:val="clear" w:color="auto" w:fill="B8CCE4" w:themeFill="accent1" w:themeFillTint="66"/>
+          </w:tcPr>
+          <w:p>
+            <w:r>
+              <w:t>Quality</w:t>
+            </w:r>
+          </w:p>
+        </w:tc>
+        <w:tc>
+          <w:tcPr>
+            <w:tcW w:w="2180" w:type="dxa"/>
+            <w:tcBorders>
+              <w:left w:val="single" w:sz="8" w:space="0" w:color="4F81BD" w:themeColor="accent1"/>
+              <w:right w:val="single" w:sz="8" w:space="0" w:color="4F81BD" w:themeColor="accent1"/>
+            </w:tcBorders>
+          </w:tcPr>
+          <w:p>
+            <w:pPr>
+              <w:cnfStyle w:val="000000100000" w:firstRow="0" w:lastRow="0" w:firstColumn="0" w:lastColumn="0" w:oddVBand="0" w:evenVBand="0" w:oddHBand="1" w:evenHBand="0" w:firstRowFirstColumn="0" w:firstRowLastColumn="0" w:lastRowFirstColumn="0" w:lastRowLastColumn="0"/>
+            </w:pPr>
+            <w:r>
+              <w:t>Quality is part of my professional reputation.</w:t>
+            </w:r>
+          </w:p>
+        </w:tc>
+        <w:tc>
+          <w:tcPr>
+            <w:tcW w:w="2180" w:type="dxa"/>
+            <w:tcBorders>
+              <w:left w:val="single" w:sz="8" w:space="0" w:color="4F81BD" w:themeColor="accent1"/>
+              <w:right w:val="single" w:sz="8" w:space="0" w:color="4F81BD" w:themeColor="accent1"/>
+            </w:tcBorders>
+            <w:shd w:val="clear" w:color="auto" w:fill="D9D9D9" w:themeFill="background1" w:themeFillShade="D9"/>
+          </w:tcPr>
+          <w:p>
+            <w:pPr>
+              <w:cnfStyle w:val="000000100000" w:firstRow="0" w:lastRow="0" w:firstColumn="0" w:lastColumn="0" w:oddVBand="0" w:evenVBand="0" w:oddHBand="1" w:evenHBand="0" w:firstRowFirstColumn="0" w:firstRowLastColumn="0" w:lastRowFirstColumn="0" w:lastRowLastColumn="0"/>
+            </w:pPr>
+          </w:p>
+        </w:tc>
+        <w:tc>
+          <w:tcPr>
+            <w:tcW w:w="2180" w:type="dxa"/>
+            <w:tcBorders>
+              <w:left w:val="single" w:sz="8" w:space="0" w:color="4F81BD" w:themeColor="accent1"/>
+            </w:tcBorders>
+            <w:shd w:val="clear" w:color="auto" w:fill="D9D9D9" w:themeFill="background1" w:themeFillShade="D9"/>
+          </w:tcPr>
+          <w:p>
+            <w:pPr>
+              <w:cnfStyle w:val="000000100000" w:firstRow="0" w:lastRow="0" w:firstColumn="0" w:lastColumn="0" w:oddVBand="0" w:evenVBand="0" w:oddHBand="1" w:evenHBand="0" w:firstRowFirstColumn="0" w:firstRowLastColumn="0" w:lastRowFirstColumn="0" w:lastRowLastColumn="0"/>
+            </w:pPr>
+          </w:p>
+        </w:tc>
+      </w:tr>
+    </w:tbl>
+    <w:p/>
     <w:p>
       <w:pPr>
         <w:pStyle w:val="Heading2"/>
@@ -5873,7 +6918,7 @@
         </w:numPr>
         <w:ind w:left="431" w:hanging="431"/>
       </w:pPr>
-      <w:bookmarkStart w:id="17" w:name="_Toc303022345"/>
+      <w:bookmarkStart w:id="17" w:name="_Toc303807222"/>
       <w:r>
         <w:t>Operating Environment</w:t>
       </w:r>
@@ -5882,6 +6927,248 @@
     <w:p>
       <w:r>
         <w:t>&lt;TODO&gt;</w:t>
+      </w:r>
+    </w:p>
+    <w:p>
+      <w:pPr>
+        <w:pStyle w:val="ListParagraph"/>
+        <w:numPr>
+          <w:ilvl w:val="0"/>
+          <w:numId w:val="14"/>
+        </w:numPr>
+      </w:pPr>
+      <w:r>
+        <w:lastRenderedPageBreak/>
+        <w:t xml:space="preserve">Users will be distributed geographically across all </w:t>
+      </w:r>
+      <w:proofErr w:type="spellStart"/>
+      <w:r>
+        <w:t>timezones</w:t>
+      </w:r>
+      <w:proofErr w:type="spellEnd"/>
+      <w:r>
+        <w:t>.</w:t>
+      </w:r>
+    </w:p>
+    <w:p>
+      <w:pPr>
+        <w:pStyle w:val="ListParagraph"/>
+        <w:numPr>
+          <w:ilvl w:val="0"/>
+          <w:numId w:val="14"/>
+        </w:numPr>
+      </w:pPr>
+      <w:r>
+        <w:t xml:space="preserve">Software will need to run on </w:t>
+      </w:r>
+      <w:proofErr w:type="spellStart"/>
+      <w:proofErr w:type="gramStart"/>
+      <w:r>
+        <w:t>unix</w:t>
+      </w:r>
+      <w:proofErr w:type="spellEnd"/>
+      <w:proofErr w:type="gramEnd"/>
+      <w:r>
+        <w:t xml:space="preserve">, </w:t>
+      </w:r>
+      <w:proofErr w:type="spellStart"/>
+      <w:r>
+        <w:t>linux</w:t>
+      </w:r>
+      <w:proofErr w:type="spellEnd"/>
+      <w:r>
+        <w:t>, Windows.</w:t>
+      </w:r>
+    </w:p>
+    <w:p>
+      <w:pPr>
+        <w:pStyle w:val="ListParagraph"/>
+        <w:numPr>
+          <w:ilvl w:val="0"/>
+          <w:numId w:val="14"/>
+        </w:numPr>
+      </w:pPr>
+      <w:r>
+        <w:t>A</w:t>
+      </w:r>
+      <w:r>
+        <w:t xml:space="preserve">s users </w:t>
+      </w:r>
+      <w:r>
+        <w:t>will be hosting their IP online,</w:t>
+      </w:r>
+    </w:p>
+    <w:p>
+      <w:pPr>
+        <w:pStyle w:val="ListParagraph"/>
+        <w:numPr>
+          <w:ilvl w:val="1"/>
+          <w:numId w:val="14"/>
+        </w:numPr>
+      </w:pPr>
+      <w:proofErr w:type="gramStart"/>
+      <w:r>
+        <w:t>security</w:t>
+      </w:r>
+      <w:proofErr w:type="gramEnd"/>
+      <w:r>
+        <w:t xml:space="preserve"> will be very important.</w:t>
+      </w:r>
+    </w:p>
+    <w:p>
+      <w:pPr>
+        <w:pStyle w:val="ListParagraph"/>
+        <w:numPr>
+          <w:ilvl w:val="1"/>
+          <w:numId w:val="14"/>
+        </w:numPr>
+      </w:pPr>
+      <w:proofErr w:type="gramStart"/>
+      <w:r>
+        <w:t>data</w:t>
+      </w:r>
+      <w:proofErr w:type="gramEnd"/>
+      <w:r>
+        <w:t xml:space="preserve"> integrity will be very important.</w:t>
+      </w:r>
+    </w:p>
+    <w:p>
+      <w:pPr>
+        <w:pStyle w:val="ListParagraph"/>
+        <w:numPr>
+          <w:ilvl w:val="1"/>
+          <w:numId w:val="14"/>
+        </w:numPr>
+      </w:pPr>
+      <w:proofErr w:type="gramStart"/>
+      <w:r>
+        <w:t>offsite</w:t>
+      </w:r>
+      <w:proofErr w:type="gramEnd"/>
+      <w:r>
+        <w:t xml:space="preserve"> backups will need to be made regularly.</w:t>
+      </w:r>
+    </w:p>
+    <w:p>
+      <w:pPr>
+        <w:pStyle w:val="ListParagraph"/>
+        <w:numPr>
+          <w:ilvl w:val="0"/>
+          <w:numId w:val="14"/>
+        </w:numPr>
+      </w:pPr>
+    </w:p>
+    <w:p>
+      <w:r>
+        <w:t>Quality Attributes:</w:t>
+      </w:r>
+    </w:p>
+    <w:p>
+      <w:pPr>
+        <w:pStyle w:val="ListParagraph"/>
+        <w:numPr>
+          <w:ilvl w:val="0"/>
+          <w:numId w:val="14"/>
+        </w:numPr>
+      </w:pPr>
+      <w:r>
+        <w:t>Flexibility</w:t>
+      </w:r>
+    </w:p>
+    <w:p>
+      <w:pPr>
+        <w:pStyle w:val="ListParagraph"/>
+        <w:numPr>
+          <w:ilvl w:val="0"/>
+          <w:numId w:val="14"/>
+        </w:numPr>
+      </w:pPr>
+      <w:r>
+        <w:t>Data Integrity (including backups)</w:t>
+      </w:r>
+    </w:p>
+    <w:p>
+      <w:pPr>
+        <w:pStyle w:val="ListParagraph"/>
+        <w:numPr>
+          <w:ilvl w:val="0"/>
+          <w:numId w:val="14"/>
+        </w:numPr>
+      </w:pPr>
+      <w:r>
+        <w:t>Security</w:t>
+      </w:r>
+    </w:p>
+    <w:p>
+      <w:pPr>
+        <w:pStyle w:val="ListParagraph"/>
+        <w:numPr>
+          <w:ilvl w:val="0"/>
+          <w:numId w:val="14"/>
+        </w:numPr>
+      </w:pPr>
+      <w:r>
+        <w:t>Testability</w:t>
+      </w:r>
+    </w:p>
+    <w:p>
+      <w:pPr>
+        <w:pStyle w:val="ListParagraph"/>
+        <w:numPr>
+          <w:ilvl w:val="0"/>
+          <w:numId w:val="14"/>
+        </w:numPr>
+      </w:pPr>
+      <w:r>
+        <w:t>Maintainability</w:t>
+      </w:r>
+    </w:p>
+    <w:p>
+      <w:pPr>
+        <w:pStyle w:val="ListParagraph"/>
+        <w:numPr>
+          <w:ilvl w:val="0"/>
+          <w:numId w:val="14"/>
+        </w:numPr>
+      </w:pPr>
+      <w:r>
+        <w:t>Usability</w:t>
+      </w:r>
+    </w:p>
+    <w:p>
+      <w:pPr>
+        <w:pStyle w:val="ListParagraph"/>
+        <w:numPr>
+          <w:ilvl w:val="0"/>
+          <w:numId w:val="14"/>
+        </w:numPr>
+      </w:pPr>
+      <w:r>
+        <w:t>Robustness</w:t>
+      </w:r>
+    </w:p>
+    <w:p>
+      <w:pPr>
+        <w:pStyle w:val="ListParagraph"/>
+        <w:numPr>
+          <w:ilvl w:val="0"/>
+          <w:numId w:val="14"/>
+        </w:numPr>
+      </w:pPr>
+      <w:r>
+        <w:t>Scalability?</w:t>
+      </w:r>
+    </w:p>
+    <w:p>
+      <w:pPr>
+        <w:pStyle w:val="ListParagraph"/>
+        <w:numPr>
+          <w:ilvl w:val="0"/>
+          <w:numId w:val="14"/>
+        </w:numPr>
+      </w:pPr>
+      <w:r>
+        <w:t>Portability</w:t>
       </w:r>
     </w:p>
     <w:p>
@@ -7292,6 +8579,244 @@
     </w:lvl>
   </w:abstractNum>
   <w:abstractNum w:abstractNumId="10">
+    <w:nsid w:val="5F08128D"/>
+    <w:multiLevelType w:val="hybridMultilevel"/>
+    <w:tmpl w:val="A18E72B0"/>
+    <w:lvl w:ilvl="0" w:tplc="0C09000F">
+      <w:start w:val="1"/>
+      <w:numFmt w:val="decimal"/>
+      <w:lvlText w:val="%1."/>
+      <w:lvlJc w:val="left"/>
+      <w:pPr>
+        <w:ind w:left="720" w:hanging="360"/>
+      </w:pPr>
+      <w:rPr>
+        <w:rFonts w:hint="default"/>
+      </w:rPr>
+    </w:lvl>
+    <w:lvl w:ilvl="1" w:tplc="0C090019" w:tentative="1">
+      <w:start w:val="1"/>
+      <w:numFmt w:val="lowerLetter"/>
+      <w:lvlText w:val="%2."/>
+      <w:lvlJc w:val="left"/>
+      <w:pPr>
+        <w:ind w:left="1440" w:hanging="360"/>
+      </w:pPr>
+    </w:lvl>
+    <w:lvl w:ilvl="2" w:tplc="0C09001B" w:tentative="1">
+      <w:start w:val="1"/>
+      <w:numFmt w:val="lowerRoman"/>
+      <w:lvlText w:val="%3."/>
+      <w:lvlJc w:val="right"/>
+      <w:pPr>
+        <w:ind w:left="2160" w:hanging="180"/>
+      </w:pPr>
+    </w:lvl>
+    <w:lvl w:ilvl="3" w:tplc="0C09000F" w:tentative="1">
+      <w:start w:val="1"/>
+      <w:numFmt w:val="decimal"/>
+      <w:lvlText w:val="%4."/>
+      <w:lvlJc w:val="left"/>
+      <w:pPr>
+        <w:ind w:left="2880" w:hanging="360"/>
+      </w:pPr>
+    </w:lvl>
+    <w:lvl w:ilvl="4" w:tplc="0C090019" w:tentative="1">
+      <w:start w:val="1"/>
+      <w:numFmt w:val="lowerLetter"/>
+      <w:lvlText w:val="%5."/>
+      <w:lvlJc w:val="left"/>
+      <w:pPr>
+        <w:ind w:left="3600" w:hanging="360"/>
+      </w:pPr>
+    </w:lvl>
+    <w:lvl w:ilvl="5" w:tplc="0C09001B" w:tentative="1">
+      <w:start w:val="1"/>
+      <w:numFmt w:val="lowerRoman"/>
+      <w:lvlText w:val="%6."/>
+      <w:lvlJc w:val="right"/>
+      <w:pPr>
+        <w:ind w:left="4320" w:hanging="180"/>
+      </w:pPr>
+    </w:lvl>
+    <w:lvl w:ilvl="6" w:tplc="0C09000F" w:tentative="1">
+      <w:start w:val="1"/>
+      <w:numFmt w:val="decimal"/>
+      <w:lvlText w:val="%7."/>
+      <w:lvlJc w:val="left"/>
+      <w:pPr>
+        <w:ind w:left="5040" w:hanging="360"/>
+      </w:pPr>
+    </w:lvl>
+    <w:lvl w:ilvl="7" w:tplc="0C090019" w:tentative="1">
+      <w:start w:val="1"/>
+      <w:numFmt w:val="lowerLetter"/>
+      <w:lvlText w:val="%8."/>
+      <w:lvlJc w:val="left"/>
+      <w:pPr>
+        <w:ind w:left="5760" w:hanging="360"/>
+      </w:pPr>
+    </w:lvl>
+    <w:lvl w:ilvl="8" w:tplc="0C09001B" w:tentative="1">
+      <w:start w:val="1"/>
+      <w:numFmt w:val="lowerRoman"/>
+      <w:lvlText w:val="%9."/>
+      <w:lvlJc w:val="right"/>
+      <w:pPr>
+        <w:ind w:left="6480" w:hanging="180"/>
+      </w:pPr>
+    </w:lvl>
+  </w:abstractNum>
+  <w:abstractNum w:abstractNumId="11">
+    <w:nsid w:val="6B531599"/>
+    <w:multiLevelType w:val="multilevel"/>
+    <w:tmpl w:val="6C3EEA3C"/>
+    <w:lvl w:ilvl="0">
+      <w:start w:val="1"/>
+      <w:numFmt w:val="bullet"/>
+      <w:lvlText w:val=""/>
+      <w:lvlJc w:val="left"/>
+      <w:pPr>
+        <w:tabs>
+          <w:tab w:val="num" w:pos="720"/>
+        </w:tabs>
+        <w:ind w:left="720" w:hanging="360"/>
+      </w:pPr>
+      <w:rPr>
+        <w:rFonts w:ascii="Symbol" w:hAnsi="Symbol" w:hint="default"/>
+        <w:sz w:val="20"/>
+      </w:rPr>
+    </w:lvl>
+    <w:lvl w:ilvl="1">
+      <w:start w:val="1"/>
+      <w:numFmt w:val="bullet"/>
+      <w:lvlText w:val="o"/>
+      <w:lvlJc w:val="left"/>
+      <w:pPr>
+        <w:tabs>
+          <w:tab w:val="num" w:pos="1440"/>
+        </w:tabs>
+        <w:ind w:left="1440" w:hanging="360"/>
+      </w:pPr>
+      <w:rPr>
+        <w:rFonts w:ascii="Courier New" w:hAnsi="Courier New" w:hint="default"/>
+        <w:sz w:val="20"/>
+      </w:rPr>
+    </w:lvl>
+    <w:lvl w:ilvl="2" w:tentative="1">
+      <w:start w:val="1"/>
+      <w:numFmt w:val="bullet"/>
+      <w:lvlText w:val=""/>
+      <w:lvlJc w:val="left"/>
+      <w:pPr>
+        <w:tabs>
+          <w:tab w:val="num" w:pos="2160"/>
+        </w:tabs>
+        <w:ind w:left="2160" w:hanging="360"/>
+      </w:pPr>
+      <w:rPr>
+        <w:rFonts w:ascii="Wingdings" w:hAnsi="Wingdings" w:hint="default"/>
+        <w:sz w:val="20"/>
+      </w:rPr>
+    </w:lvl>
+    <w:lvl w:ilvl="3" w:tentative="1">
+      <w:start w:val="1"/>
+      <w:numFmt w:val="bullet"/>
+      <w:lvlText w:val=""/>
+      <w:lvlJc w:val="left"/>
+      <w:pPr>
+        <w:tabs>
+          <w:tab w:val="num" w:pos="2880"/>
+        </w:tabs>
+        <w:ind w:left="2880" w:hanging="360"/>
+      </w:pPr>
+      <w:rPr>
+        <w:rFonts w:ascii="Wingdings" w:hAnsi="Wingdings" w:hint="default"/>
+        <w:sz w:val="20"/>
+      </w:rPr>
+    </w:lvl>
+    <w:lvl w:ilvl="4" w:tentative="1">
+      <w:start w:val="1"/>
+      <w:numFmt w:val="bullet"/>
+      <w:lvlText w:val=""/>
+      <w:lvlJc w:val="left"/>
+      <w:pPr>
+        <w:tabs>
+          <w:tab w:val="num" w:pos="3600"/>
+        </w:tabs>
+        <w:ind w:left="3600" w:hanging="360"/>
+      </w:pPr>
+      <w:rPr>
+        <w:rFonts w:ascii="Wingdings" w:hAnsi="Wingdings" w:hint="default"/>
+        <w:sz w:val="20"/>
+      </w:rPr>
+    </w:lvl>
+    <w:lvl w:ilvl="5" w:tentative="1">
+      <w:start w:val="1"/>
+      <w:numFmt w:val="bullet"/>
+      <w:lvlText w:val=""/>
+      <w:lvlJc w:val="left"/>
+      <w:pPr>
+        <w:tabs>
+          <w:tab w:val="num" w:pos="4320"/>
+        </w:tabs>
+        <w:ind w:left="4320" w:hanging="360"/>
+      </w:pPr>
+      <w:rPr>
+        <w:rFonts w:ascii="Wingdings" w:hAnsi="Wingdings" w:hint="default"/>
+        <w:sz w:val="20"/>
+      </w:rPr>
+    </w:lvl>
+    <w:lvl w:ilvl="6" w:tentative="1">
+      <w:start w:val="1"/>
+      <w:numFmt w:val="bullet"/>
+      <w:lvlText w:val=""/>
+      <w:lvlJc w:val="left"/>
+      <w:pPr>
+        <w:tabs>
+          <w:tab w:val="num" w:pos="5040"/>
+        </w:tabs>
+        <w:ind w:left="5040" w:hanging="360"/>
+      </w:pPr>
+      <w:rPr>
+        <w:rFonts w:ascii="Wingdings" w:hAnsi="Wingdings" w:hint="default"/>
+        <w:sz w:val="20"/>
+      </w:rPr>
+    </w:lvl>
+    <w:lvl w:ilvl="7" w:tentative="1">
+      <w:start w:val="1"/>
+      <w:numFmt w:val="bullet"/>
+      <w:lvlText w:val=""/>
+      <w:lvlJc w:val="left"/>
+      <w:pPr>
+        <w:tabs>
+          <w:tab w:val="num" w:pos="5760"/>
+        </w:tabs>
+        <w:ind w:left="5760" w:hanging="360"/>
+      </w:pPr>
+      <w:rPr>
+        <w:rFonts w:ascii="Wingdings" w:hAnsi="Wingdings" w:hint="default"/>
+        <w:sz w:val="20"/>
+      </w:rPr>
+    </w:lvl>
+    <w:lvl w:ilvl="8" w:tentative="1">
+      <w:start w:val="1"/>
+      <w:numFmt w:val="bullet"/>
+      <w:lvlText w:val=""/>
+      <w:lvlJc w:val="left"/>
+      <w:pPr>
+        <w:tabs>
+          <w:tab w:val="num" w:pos="6480"/>
+        </w:tabs>
+        <w:ind w:left="6480" w:hanging="360"/>
+      </w:pPr>
+      <w:rPr>
+        <w:rFonts w:ascii="Wingdings" w:hAnsi="Wingdings" w:hint="default"/>
+        <w:sz w:val="20"/>
+      </w:rPr>
+    </w:lvl>
+  </w:abstractNum>
+  <w:abstractNum w:abstractNumId="12">
     <w:nsid w:val="72F167EF"/>
     <w:multiLevelType w:val="multilevel"/>
     <w:tmpl w:val="03A63FD0"/>
@@ -7440,7 +8965,7 @@
       </w:rPr>
     </w:lvl>
   </w:abstractNum>
-  <w:abstractNum w:abstractNumId="11">
+  <w:abstractNum w:abstractNumId="13">
     <w:nsid w:val="7AA27941"/>
     <w:multiLevelType w:val="multilevel"/>
     <w:tmpl w:val="213C7658"/>
@@ -7590,13 +9115,13 @@
     </w:lvl>
   </w:abstractNum>
   <w:num w:numId="1">
-    <w:abstractNumId w:val="11"/>
+    <w:abstractNumId w:val="13"/>
   </w:num>
   <w:num w:numId="2">
     <w:abstractNumId w:val="8"/>
   </w:num>
   <w:num w:numId="3">
-    <w:abstractNumId w:val="10"/>
+    <w:abstractNumId w:val="12"/>
   </w:num>
   <w:num w:numId="4">
     <w:abstractNumId w:val="5"/>
@@ -7624,6 +9149,12 @@
   </w:num>
   <w:num w:numId="12">
     <w:abstractNumId w:val="7"/>
+  </w:num>
+  <w:num w:numId="13">
+    <w:abstractNumId w:val="10"/>
+  </w:num>
+  <w:num w:numId="14">
+    <w:abstractNumId w:val="11"/>
   </w:num>
 </w:numbering>
 </file>
@@ -10776,7 +12307,7 @@
 </file>
 
 <file path=customXml/itemProps1.xml><?xml version="1.0" encoding="utf-8"?>
-<ds:datastoreItem xmlns:ds="http://schemas.openxmlformats.org/officeDocument/2006/customXml" ds:itemID="{8F9A6AF3-7A6C-4DE8-9DD0-DED1DCAB8103}">
+<ds:datastoreItem xmlns:ds="http://schemas.openxmlformats.org/officeDocument/2006/customXml" ds:itemID="{B0F488EC-D04C-4779-AB11-7DBE509D490E}">
   <ds:schemaRefs>
     <ds:schemaRef ds:uri="http://schemas.openxmlformats.org/officeDocument/2006/bibliography"/>
   </ds:schemaRefs>

</xml_diff>

<commit_message>
Added notes to ReqRepo - Vision and Scope.docx
</commit_message>
<xml_diff>
--- a/ReqRepo - Vision and Scope.docx
+++ b/ReqRepo - Vision and Scope.docx
@@ -2490,6 +2490,425 @@
     </w:p>
     <w:p>
       <w:pPr>
+        <w:spacing w:before="100" w:beforeAutospacing="1" w:after="100" w:afterAutospacing="1" w:line="240" w:lineRule="auto"/>
+        <w:textAlignment w:val="baseline"/>
+        <w:rPr>
+          <w:rFonts w:ascii="Arial" w:eastAsia="Times New Roman" w:hAnsi="Arial" w:cs="Arial"/>
+          <w:color w:val="000000"/>
+        </w:rPr>
+      </w:pPr>
+    </w:p>
+    <w:p>
+      <w:pPr>
+        <w:spacing w:before="100" w:beforeAutospacing="1" w:after="100" w:afterAutospacing="1" w:line="240" w:lineRule="auto"/>
+        <w:textAlignment w:val="baseline"/>
+        <w:rPr>
+          <w:rFonts w:ascii="Arial" w:eastAsia="Times New Roman" w:hAnsi="Arial" w:cs="Arial"/>
+          <w:color w:val="000000"/>
+        </w:rPr>
+      </w:pPr>
+      <w:r>
+        <w:rPr>
+          <w:rFonts w:ascii="Arial" w:eastAsia="Times New Roman" w:hAnsi="Arial" w:cs="Arial"/>
+          <w:color w:val="000000"/>
+        </w:rPr>
+        <w:t>In the same way the Git doesn’t care about the file, it cares about the content; this solution should consider all information part of a larger system or project, it shouldn’t care about which documents the information is organised into.</w:t>
+      </w:r>
+    </w:p>
+    <w:p>
+      <w:pPr>
+        <w:spacing w:before="100" w:beforeAutospacing="1" w:after="100" w:afterAutospacing="1" w:line="240" w:lineRule="auto"/>
+        <w:textAlignment w:val="baseline"/>
+        <w:rPr>
+          <w:rFonts w:ascii="Arial" w:eastAsia="Times New Roman" w:hAnsi="Arial" w:cs="Arial"/>
+          <w:color w:val="000000"/>
+        </w:rPr>
+      </w:pPr>
+      <w:r>
+        <w:rPr>
+          <w:rFonts w:ascii="Arial" w:eastAsia="Times New Roman" w:hAnsi="Arial" w:cs="Arial"/>
+          <w:color w:val="000000"/>
+        </w:rPr>
+        <w:t>As much help as possible should be provided by the system, subtly or easily-accessible depending on the situation. Help is not limited to understanding system features, but encompasses content and anything else relevant to the user completing his/her job. An example would be if a requirement failed review because it was not verifiable, then “help” in this context could be</w:t>
+      </w:r>
+      <w:r>
+        <w:rPr>
+          <w:rFonts w:ascii="Arial" w:eastAsia="Times New Roman" w:hAnsi="Arial" w:cs="Arial"/>
+          <w:color w:val="000000"/>
+        </w:rPr>
+        <w:t>:</w:t>
+      </w:r>
+    </w:p>
+    <w:p>
+      <w:pPr>
+        <w:pStyle w:val="ListParagraph"/>
+        <w:numPr>
+          <w:ilvl w:val="0"/>
+          <w:numId w:val="14"/>
+        </w:numPr>
+        <w:spacing w:before="100" w:beforeAutospacing="1" w:after="100" w:afterAutospacing="1" w:line="240" w:lineRule="auto"/>
+        <w:textAlignment w:val="baseline"/>
+        <w:rPr>
+          <w:rFonts w:ascii="Arial" w:eastAsia="Times New Roman" w:hAnsi="Arial" w:cs="Arial"/>
+          <w:color w:val="000000"/>
+        </w:rPr>
+      </w:pPr>
+      <w:r>
+        <w:rPr>
+          <w:rFonts w:ascii="Arial" w:eastAsia="Times New Roman" w:hAnsi="Arial" w:cs="Arial"/>
+          <w:color w:val="000000"/>
+        </w:rPr>
+        <w:t>S</w:t>
+      </w:r>
+      <w:r>
+        <w:rPr>
+          <w:rFonts w:ascii="Arial" w:eastAsia="Times New Roman" w:hAnsi="Arial" w:cs="Arial"/>
+          <w:color w:val="000000"/>
+        </w:rPr>
+        <w:t>howing the user a list of other verifiable requirements in the system</w:t>
+      </w:r>
+    </w:p>
+    <w:p>
+      <w:pPr>
+        <w:pStyle w:val="ListParagraph"/>
+        <w:numPr>
+          <w:ilvl w:val="0"/>
+          <w:numId w:val="14"/>
+        </w:numPr>
+        <w:spacing w:before="100" w:beforeAutospacing="1" w:after="100" w:afterAutospacing="1" w:line="240" w:lineRule="auto"/>
+        <w:textAlignment w:val="baseline"/>
+        <w:rPr>
+          <w:rFonts w:ascii="Arial" w:eastAsia="Times New Roman" w:hAnsi="Arial" w:cs="Arial"/>
+          <w:color w:val="000000"/>
+        </w:rPr>
+      </w:pPr>
+      <w:r>
+        <w:rPr>
+          <w:rFonts w:ascii="Arial" w:eastAsia="Times New Roman" w:hAnsi="Arial" w:cs="Arial"/>
+          <w:color w:val="000000"/>
+        </w:rPr>
+        <w:lastRenderedPageBreak/>
+        <w:t xml:space="preserve">Showing the user </w:t>
+      </w:r>
+      <w:r>
+        <w:rPr>
+          <w:rFonts w:ascii="Arial" w:eastAsia="Times New Roman" w:hAnsi="Arial" w:cs="Arial"/>
+          <w:color w:val="000000"/>
+        </w:rPr>
+        <w:t>a list of changes to requirements as they changed from non-verifiable to verifiable.</w:t>
+      </w:r>
+    </w:p>
+    <w:p>
+      <w:pPr>
+        <w:pStyle w:val="ListParagraph"/>
+        <w:numPr>
+          <w:ilvl w:val="0"/>
+          <w:numId w:val="14"/>
+        </w:numPr>
+        <w:spacing w:before="100" w:beforeAutospacing="1" w:after="100" w:afterAutospacing="1" w:line="240" w:lineRule="auto"/>
+        <w:textAlignment w:val="baseline"/>
+        <w:rPr>
+          <w:rFonts w:ascii="Arial" w:eastAsia="Times New Roman" w:hAnsi="Arial" w:cs="Arial"/>
+          <w:color w:val="000000"/>
+        </w:rPr>
+      </w:pPr>
+      <w:r>
+        <w:rPr>
+          <w:rFonts w:ascii="Arial" w:eastAsia="Times New Roman" w:hAnsi="Arial" w:cs="Arial"/>
+          <w:color w:val="000000"/>
+        </w:rPr>
+        <w:t>Showing the user a definition of a verifiable requirement.</w:t>
+      </w:r>
+    </w:p>
+    <w:p>
+      <w:pPr>
+        <w:spacing w:before="100" w:beforeAutospacing="1" w:after="100" w:afterAutospacing="1" w:line="240" w:lineRule="auto"/>
+        <w:textAlignment w:val="baseline"/>
+        <w:rPr>
+          <w:rFonts w:ascii="Arial" w:eastAsia="Times New Roman" w:hAnsi="Arial" w:cs="Arial"/>
+          <w:color w:val="000000"/>
+        </w:rPr>
+      </w:pPr>
+    </w:p>
+    <w:p>
+      <w:pPr>
+        <w:pStyle w:val="ListParagraph"/>
+        <w:numPr>
+          <w:ilvl w:val="0"/>
+          <w:numId w:val="14"/>
+        </w:numPr>
+        <w:spacing w:before="100" w:beforeAutospacing="1" w:after="100" w:afterAutospacing="1" w:line="240" w:lineRule="auto"/>
+        <w:jc w:val="both"/>
+        <w:textAlignment w:val="baseline"/>
+        <w:rPr>
+          <w:rFonts w:ascii="Arial" w:eastAsia="Times New Roman" w:hAnsi="Arial" w:cs="Arial"/>
+          <w:color w:val="000000"/>
+        </w:rPr>
+      </w:pPr>
+      <w:r>
+        <w:rPr>
+          <w:rFonts w:ascii="Arial" w:eastAsia="Times New Roman" w:hAnsi="Arial" w:cs="Arial"/>
+          <w:color w:val="000000"/>
+        </w:rPr>
+        <w:t>Requirements Documentation</w:t>
+      </w:r>
+    </w:p>
+    <w:p>
+      <w:pPr>
+        <w:pStyle w:val="ListParagraph"/>
+        <w:numPr>
+          <w:ilvl w:val="0"/>
+          <w:numId w:val="14"/>
+        </w:numPr>
+        <w:spacing w:before="100" w:beforeAutospacing="1" w:after="100" w:afterAutospacing="1" w:line="240" w:lineRule="auto"/>
+        <w:jc w:val="both"/>
+        <w:textAlignment w:val="baseline"/>
+        <w:rPr>
+          <w:rFonts w:ascii="Arial" w:eastAsia="Times New Roman" w:hAnsi="Arial" w:cs="Arial"/>
+          <w:color w:val="000000"/>
+        </w:rPr>
+      </w:pPr>
+      <w:r>
+        <w:rPr>
+          <w:rFonts w:ascii="Arial" w:eastAsia="Times New Roman" w:hAnsi="Arial" w:cs="Arial"/>
+          <w:color w:val="000000"/>
+        </w:rPr>
+        <w:t>Access</w:t>
+      </w:r>
+    </w:p>
+    <w:p>
+      <w:pPr>
+        <w:pStyle w:val="ListParagraph"/>
+        <w:numPr>
+          <w:ilvl w:val="0"/>
+          <w:numId w:val="14"/>
+        </w:numPr>
+        <w:spacing w:before="100" w:beforeAutospacing="1" w:after="100" w:afterAutospacing="1" w:line="240" w:lineRule="auto"/>
+        <w:jc w:val="both"/>
+        <w:textAlignment w:val="baseline"/>
+        <w:rPr>
+          <w:rFonts w:ascii="Arial" w:eastAsia="Times New Roman" w:hAnsi="Arial" w:cs="Arial"/>
+          <w:color w:val="000000"/>
+        </w:rPr>
+      </w:pPr>
+      <w:r>
+        <w:rPr>
+          <w:rFonts w:ascii="Arial" w:eastAsia="Times New Roman" w:hAnsi="Arial" w:cs="Arial"/>
+          <w:color w:val="000000"/>
+        </w:rPr>
+        <w:t>Templates</w:t>
+      </w:r>
+    </w:p>
+    <w:p>
+      <w:pPr>
+        <w:pStyle w:val="ListParagraph"/>
+        <w:numPr>
+          <w:ilvl w:val="0"/>
+          <w:numId w:val="14"/>
+        </w:numPr>
+        <w:spacing w:before="100" w:beforeAutospacing="1" w:after="100" w:afterAutospacing="1" w:line="240" w:lineRule="auto"/>
+        <w:jc w:val="both"/>
+        <w:textAlignment w:val="baseline"/>
+        <w:rPr>
+          <w:rFonts w:ascii="Arial" w:eastAsia="Times New Roman" w:hAnsi="Arial" w:cs="Arial"/>
+          <w:color w:val="000000"/>
+        </w:rPr>
+      </w:pPr>
+      <w:r>
+        <w:rPr>
+          <w:rFonts w:ascii="Arial" w:eastAsia="Times New Roman" w:hAnsi="Arial" w:cs="Arial"/>
+          <w:color w:val="000000"/>
+        </w:rPr>
+        <w:t>Intelligent help</w:t>
+      </w:r>
+    </w:p>
+    <w:p>
+      <w:pPr>
+        <w:pStyle w:val="ListParagraph"/>
+        <w:numPr>
+          <w:ilvl w:val="0"/>
+          <w:numId w:val="14"/>
+        </w:numPr>
+        <w:spacing w:before="100" w:beforeAutospacing="1" w:after="100" w:afterAutospacing="1" w:line="240" w:lineRule="auto"/>
+        <w:jc w:val="both"/>
+        <w:textAlignment w:val="baseline"/>
+        <w:rPr>
+          <w:rFonts w:ascii="Arial" w:eastAsia="Times New Roman" w:hAnsi="Arial" w:cs="Arial"/>
+          <w:color w:val="000000"/>
+        </w:rPr>
+      </w:pPr>
+      <w:r>
+        <w:rPr>
+          <w:rFonts w:ascii="Arial" w:eastAsia="Times New Roman" w:hAnsi="Arial" w:cs="Arial"/>
+          <w:color w:val="000000"/>
+        </w:rPr>
+        <w:t>Content Referencing</w:t>
+      </w:r>
+    </w:p>
+    <w:p>
+      <w:pPr>
+        <w:pStyle w:val="ListParagraph"/>
+        <w:numPr>
+          <w:ilvl w:val="0"/>
+          <w:numId w:val="14"/>
+        </w:numPr>
+        <w:spacing w:before="100" w:beforeAutospacing="1" w:after="100" w:afterAutospacing="1" w:line="240" w:lineRule="auto"/>
+        <w:jc w:val="both"/>
+        <w:textAlignment w:val="baseline"/>
+        <w:rPr>
+          <w:rFonts w:ascii="Arial" w:eastAsia="Times New Roman" w:hAnsi="Arial" w:cs="Arial"/>
+          <w:color w:val="000000"/>
+        </w:rPr>
+      </w:pPr>
+      <w:r>
+        <w:rPr>
+          <w:rFonts w:ascii="Arial" w:eastAsia="Times New Roman" w:hAnsi="Arial" w:cs="Arial"/>
+          <w:color w:val="000000"/>
+        </w:rPr>
+        <w:t>Content Decoupled from Structure and Organisation</w:t>
+      </w:r>
+    </w:p>
+    <w:p>
+      <w:pPr>
+        <w:pStyle w:val="ListParagraph"/>
+        <w:numPr>
+          <w:ilvl w:val="0"/>
+          <w:numId w:val="14"/>
+        </w:numPr>
+        <w:spacing w:before="100" w:beforeAutospacing="1" w:after="100" w:afterAutospacing="1" w:line="240" w:lineRule="auto"/>
+        <w:jc w:val="both"/>
+        <w:textAlignment w:val="baseline"/>
+        <w:rPr>
+          <w:rFonts w:ascii="Arial" w:eastAsia="Times New Roman" w:hAnsi="Arial" w:cs="Arial"/>
+          <w:color w:val="000000"/>
+        </w:rPr>
+      </w:pPr>
+      <w:r>
+        <w:rPr>
+          <w:rFonts w:ascii="Arial" w:eastAsia="Times New Roman" w:hAnsi="Arial" w:cs="Arial"/>
+          <w:color w:val="000000"/>
+        </w:rPr>
+        <w:t>Version Control</w:t>
+      </w:r>
+    </w:p>
+    <w:p>
+      <w:pPr>
+        <w:pStyle w:val="ListParagraph"/>
+        <w:numPr>
+          <w:ilvl w:val="0"/>
+          <w:numId w:val="14"/>
+        </w:numPr>
+        <w:spacing w:before="100" w:beforeAutospacing="1" w:after="100" w:afterAutospacing="1" w:line="240" w:lineRule="auto"/>
+        <w:jc w:val="both"/>
+        <w:textAlignment w:val="baseline"/>
+        <w:rPr>
+          <w:rFonts w:ascii="Arial" w:eastAsia="Times New Roman" w:hAnsi="Arial" w:cs="Arial"/>
+          <w:color w:val="000000"/>
+        </w:rPr>
+      </w:pPr>
+      <w:r>
+        <w:rPr>
+          <w:rFonts w:ascii="Arial" w:eastAsia="Times New Roman" w:hAnsi="Arial" w:cs="Arial"/>
+          <w:color w:val="000000"/>
+        </w:rPr>
+        <w:t>Collaboration</w:t>
+      </w:r>
+    </w:p>
+    <w:p>
+      <w:pPr>
+        <w:pStyle w:val="ListParagraph"/>
+        <w:numPr>
+          <w:ilvl w:val="0"/>
+          <w:numId w:val="14"/>
+        </w:numPr>
+        <w:spacing w:before="100" w:beforeAutospacing="1" w:after="100" w:afterAutospacing="1" w:line="240" w:lineRule="auto"/>
+        <w:jc w:val="both"/>
+        <w:textAlignment w:val="baseline"/>
+        <w:rPr>
+          <w:rFonts w:ascii="Arial" w:eastAsia="Times New Roman" w:hAnsi="Arial" w:cs="Arial"/>
+          <w:color w:val="000000"/>
+        </w:rPr>
+      </w:pPr>
+      <w:r>
+        <w:rPr>
+          <w:rFonts w:ascii="Arial" w:eastAsia="Times New Roman" w:hAnsi="Arial" w:cs="Arial"/>
+          <w:color w:val="000000"/>
+        </w:rPr>
+        <w:t>Workflow</w:t>
+      </w:r>
+    </w:p>
+    <w:p>
+      <w:pPr>
+        <w:pStyle w:val="ListParagraph"/>
+        <w:numPr>
+          <w:ilvl w:val="1"/>
+          <w:numId w:val="14"/>
+        </w:numPr>
+        <w:spacing w:before="100" w:beforeAutospacing="1" w:after="100" w:afterAutospacing="1" w:line="240" w:lineRule="auto"/>
+        <w:jc w:val="both"/>
+        <w:textAlignment w:val="baseline"/>
+        <w:rPr>
+          <w:rFonts w:ascii="Arial" w:eastAsia="Times New Roman" w:hAnsi="Arial" w:cs="Arial"/>
+          <w:color w:val="000000"/>
+        </w:rPr>
+      </w:pPr>
+      <w:proofErr w:type="spellStart"/>
+      <w:r>
+        <w:rPr>
+          <w:rFonts w:ascii="Arial" w:eastAsia="Times New Roman" w:hAnsi="Arial" w:cs="Arial"/>
+          <w:color w:val="000000"/>
+        </w:rPr>
+        <w:t>Tracability</w:t>
+      </w:r>
+      <w:proofErr w:type="spellEnd"/>
+      <w:r>
+        <w:rPr>
+          <w:rFonts w:ascii="Arial" w:eastAsia="Times New Roman" w:hAnsi="Arial" w:cs="Arial"/>
+          <w:color w:val="000000"/>
+        </w:rPr>
+        <w:t>, sign off, verify (usually meaning submit for review)</w:t>
+      </w:r>
+    </w:p>
+    <w:p>
+      <w:pPr>
+        <w:pStyle w:val="ListParagraph"/>
+        <w:numPr>
+          <w:ilvl w:val="0"/>
+          <w:numId w:val="14"/>
+        </w:numPr>
+        <w:spacing w:before="100" w:beforeAutospacing="1" w:after="100" w:afterAutospacing="1" w:line="240" w:lineRule="auto"/>
+        <w:jc w:val="both"/>
+        <w:textAlignment w:val="baseline"/>
+        <w:rPr>
+          <w:rFonts w:ascii="Arial" w:eastAsia="Times New Roman" w:hAnsi="Arial" w:cs="Arial"/>
+          <w:color w:val="000000"/>
+        </w:rPr>
+      </w:pPr>
+      <w:r>
+        <w:rPr>
+          <w:rFonts w:ascii="Arial" w:eastAsia="Times New Roman" w:hAnsi="Arial" w:cs="Arial"/>
+          <w:color w:val="000000"/>
+        </w:rPr>
+        <w:t>External Files</w:t>
+      </w:r>
+    </w:p>
+    <w:p>
+      <w:pPr>
+        <w:pStyle w:val="ListParagraph"/>
+        <w:numPr>
+          <w:ilvl w:val="0"/>
+          <w:numId w:val="14"/>
+        </w:numPr>
+        <w:spacing w:before="100" w:beforeAutospacing="1" w:after="100" w:afterAutospacing="1" w:line="240" w:lineRule="auto"/>
+        <w:textAlignment w:val="baseline"/>
+        <w:rPr>
+          <w:rFonts w:ascii="Arial" w:eastAsia="Times New Roman" w:hAnsi="Arial" w:cs="Arial"/>
+          <w:color w:val="000000"/>
+        </w:rPr>
+      </w:pPr>
+    </w:p>
+    <w:p>
+      <w:pPr>
         <w:pStyle w:val="Heading2"/>
         <w:numPr>
           <w:ilvl w:val="1"/>
@@ -2511,7 +2930,8 @@
       </w:tblPr>
       <w:tblGrid>
         <w:gridCol w:w="817"/>
-        <w:gridCol w:w="7903"/>
+        <w:gridCol w:w="2977"/>
+        <w:gridCol w:w="4926"/>
       </w:tblGrid>
       <w:tr>
         <w:trPr>
@@ -2527,6 +2947,9 @@
             <w:shd w:val="clear" w:color="auto" w:fill="D6E3BC" w:themeFill="accent3" w:themeFillTint="66"/>
           </w:tcPr>
           <w:p>
+            <w:pPr>
+              <w:jc w:val="both"/>
+            </w:pPr>
             <w:r>
               <w:t>MF-1</w:t>
             </w:r>
@@ -2534,7 +2957,23 @@
         </w:tc>
         <w:tc>
           <w:tcPr>
-            <w:tcW w:w="7903" w:type="dxa"/>
+            <w:tcW w:w="2977" w:type="dxa"/>
+            <w:tcBorders>
+              <w:right w:val="single" w:sz="8" w:space="0" w:color="9BBB59" w:themeColor="accent3"/>
+            </w:tcBorders>
+          </w:tcPr>
+          <w:p>
+            <w:pPr>
+              <w:cnfStyle w:val="000000100000" w:firstRow="0" w:lastRow="0" w:firstColumn="0" w:lastColumn="0" w:oddVBand="0" w:evenVBand="0" w:oddHBand="1" w:evenHBand="0" w:firstRowFirstColumn="0" w:firstRowLastColumn="0" w:lastRowFirstColumn="0" w:lastRowLastColumn="0"/>
+            </w:pPr>
+            <w:r>
+              <w:t>Requirements Documentation</w:t>
+            </w:r>
+          </w:p>
+        </w:tc>
+        <w:tc>
+          <w:tcPr>
+            <w:tcW w:w="4926" w:type="dxa"/>
             <w:tcBorders>
               <w:left w:val="single" w:sz="8" w:space="0" w:color="9BBB59" w:themeColor="accent3"/>
             </w:tcBorders>
@@ -2544,7 +2983,7 @@
               <w:cnfStyle w:val="000000100000" w:firstRow="0" w:lastRow="0" w:firstColumn="0" w:lastColumn="0" w:oddVBand="0" w:evenVBand="0" w:oddHBand="1" w:evenHBand="0" w:firstRowFirstColumn="0" w:firstRowLastColumn="0" w:lastRowFirstColumn="0" w:lastRowLastColumn="0"/>
             </w:pPr>
             <w:r>
-              <w:t>Create, edit, view online requirements docs.</w:t>
+              <w:t>Create requirements documents online.</w:t>
             </w:r>
           </w:p>
         </w:tc>
@@ -2560,6 +2999,9 @@
             <w:shd w:val="clear" w:color="auto" w:fill="D6E3BC" w:themeFill="accent3" w:themeFillTint="66"/>
           </w:tcPr>
           <w:p>
+            <w:pPr>
+              <w:jc w:val="both"/>
+            </w:pPr>
             <w:r>
               <w:t>MF-2</w:t>
             </w:r>
@@ -2567,7 +3009,23 @@
         </w:tc>
         <w:tc>
           <w:tcPr>
-            <w:tcW w:w="7903" w:type="dxa"/>
+            <w:tcW w:w="2977" w:type="dxa"/>
+            <w:tcBorders>
+              <w:right w:val="single" w:sz="8" w:space="0" w:color="9BBB59" w:themeColor="accent3"/>
+            </w:tcBorders>
+          </w:tcPr>
+          <w:p>
+            <w:pPr>
+              <w:cnfStyle w:val="000000000000" w:firstRow="0" w:lastRow="0" w:firstColumn="0" w:lastColumn="0" w:oddVBand="0" w:evenVBand="0" w:oddHBand="0" w:evenHBand="0" w:firstRowFirstColumn="0" w:firstRowLastColumn="0" w:lastRowFirstColumn="0" w:lastRowLastColumn="0"/>
+            </w:pPr>
+            <w:r>
+              <w:t>Access</w:t>
+            </w:r>
+          </w:p>
+        </w:tc>
+        <w:tc>
+          <w:tcPr>
+            <w:tcW w:w="4926" w:type="dxa"/>
             <w:tcBorders>
               <w:left w:val="single" w:sz="8" w:space="0" w:color="9BBB59" w:themeColor="accent3"/>
             </w:tcBorders>
@@ -2577,7 +3035,7 @@
               <w:cnfStyle w:val="000000000000" w:firstRow="0" w:lastRow="0" w:firstColumn="0" w:lastColumn="0" w:oddVBand="0" w:evenVBand="0" w:oddHBand="0" w:evenHBand="0" w:firstRowFirstColumn="0" w:firstRowLastColumn="0" w:lastRowFirstColumn="0" w:lastRowLastColumn="0"/>
             </w:pPr>
             <w:r>
-              <w:t>Group docs together, usually based on project.</w:t>
+              <w:t>Present documentation to users and guests, search.</w:t>
             </w:r>
           </w:p>
         </w:tc>
@@ -2596,6 +3054,9 @@
             <w:shd w:val="clear" w:color="auto" w:fill="D6E3BC" w:themeFill="accent3" w:themeFillTint="66"/>
           </w:tcPr>
           <w:p>
+            <w:pPr>
+              <w:jc w:val="both"/>
+            </w:pPr>
             <w:r>
               <w:t>MF-3</w:t>
             </w:r>
@@ -2603,7 +3064,23 @@
         </w:tc>
         <w:tc>
           <w:tcPr>
-            <w:tcW w:w="7903" w:type="dxa"/>
+            <w:tcW w:w="2977" w:type="dxa"/>
+            <w:tcBorders>
+              <w:right w:val="single" w:sz="8" w:space="0" w:color="9BBB59" w:themeColor="accent3"/>
+            </w:tcBorders>
+          </w:tcPr>
+          <w:p>
+            <w:pPr>
+              <w:cnfStyle w:val="000000100000" w:firstRow="0" w:lastRow="0" w:firstColumn="0" w:lastColumn="0" w:oddVBand="0" w:evenVBand="0" w:oddHBand="1" w:evenHBand="0" w:firstRowFirstColumn="0" w:firstRowLastColumn="0" w:lastRowFirstColumn="0" w:lastRowLastColumn="0"/>
+            </w:pPr>
+            <w:r>
+              <w:t>Templates</w:t>
+            </w:r>
+          </w:p>
+        </w:tc>
+        <w:tc>
+          <w:tcPr>
+            <w:tcW w:w="4926" w:type="dxa"/>
             <w:tcBorders>
               <w:left w:val="single" w:sz="8" w:space="0" w:color="9BBB59" w:themeColor="accent3"/>
             </w:tcBorders>
@@ -2613,7 +3090,7 @@
               <w:cnfStyle w:val="000000100000" w:firstRow="0" w:lastRow="0" w:firstColumn="0" w:lastColumn="0" w:oddVBand="0" w:evenVBand="0" w:oddHBand="1" w:evenHBand="0" w:firstRowFirstColumn="0" w:firstRowLastColumn="0" w:lastRowFirstColumn="0" w:lastRowLastColumn="0"/>
             </w:pPr>
             <w:r>
-              <w:t>Search all docs and audit history in a single action.</w:t>
+              <w:t>Contain customisable document templates.</w:t>
             </w:r>
           </w:p>
         </w:tc>
@@ -2629,6 +3106,9 @@
             <w:shd w:val="clear" w:color="auto" w:fill="D6E3BC" w:themeFill="accent3" w:themeFillTint="66"/>
           </w:tcPr>
           <w:p>
+            <w:pPr>
+              <w:jc w:val="both"/>
+            </w:pPr>
             <w:r>
               <w:t>MF-4</w:t>
             </w:r>
@@ -2636,7 +3116,23 @@
         </w:tc>
         <w:tc>
           <w:tcPr>
-            <w:tcW w:w="7903" w:type="dxa"/>
+            <w:tcW w:w="2977" w:type="dxa"/>
+            <w:tcBorders>
+              <w:right w:val="single" w:sz="8" w:space="0" w:color="9BBB59" w:themeColor="accent3"/>
+            </w:tcBorders>
+          </w:tcPr>
+          <w:p>
+            <w:pPr>
+              <w:cnfStyle w:val="000000000000" w:firstRow="0" w:lastRow="0" w:firstColumn="0" w:lastColumn="0" w:oddVBand="0" w:evenVBand="0" w:oddHBand="0" w:evenHBand="0" w:firstRowFirstColumn="0" w:firstRowLastColumn="0" w:lastRowFirstColumn="0" w:lastRowLastColumn="0"/>
+            </w:pPr>
+            <w:r>
+              <w:t>Intelligent help</w:t>
+            </w:r>
+          </w:p>
+        </w:tc>
+        <w:tc>
+          <w:tcPr>
+            <w:tcW w:w="4926" w:type="dxa"/>
             <w:tcBorders>
               <w:left w:val="single" w:sz="8" w:space="0" w:color="9BBB59" w:themeColor="accent3"/>
             </w:tcBorders>
@@ -2646,7 +3142,7 @@
               <w:cnfStyle w:val="000000000000" w:firstRow="0" w:lastRow="0" w:firstColumn="0" w:lastColumn="0" w:oddVBand="0" w:evenVBand="0" w:oddHBand="0" w:evenHBand="0" w:firstRowFirstColumn="0" w:firstRowLastColumn="0" w:lastRowFirstColumn="0" w:lastRowLastColumn="0"/>
             </w:pPr>
             <w:r>
-              <w:t>Create templates which users can use to create new docs.</w:t>
+              <w:t>Provide intelligent, context-driven help for both system and high-level, content-based functions.</w:t>
             </w:r>
           </w:p>
         </w:tc>
@@ -2665,6 +3161,9 @@
             <w:shd w:val="clear" w:color="auto" w:fill="D6E3BC" w:themeFill="accent3" w:themeFillTint="66"/>
           </w:tcPr>
           <w:p>
+            <w:pPr>
+              <w:jc w:val="both"/>
+            </w:pPr>
             <w:r>
               <w:t>MF-5</w:t>
             </w:r>
@@ -2672,7 +3171,23 @@
         </w:tc>
         <w:tc>
           <w:tcPr>
-            <w:tcW w:w="7903" w:type="dxa"/>
+            <w:tcW w:w="2977" w:type="dxa"/>
+            <w:tcBorders>
+              <w:right w:val="single" w:sz="8" w:space="0" w:color="9BBB59" w:themeColor="accent3"/>
+            </w:tcBorders>
+          </w:tcPr>
+          <w:p>
+            <w:pPr>
+              <w:cnfStyle w:val="000000100000" w:firstRow="0" w:lastRow="0" w:firstColumn="0" w:lastColumn="0" w:oddVBand="0" w:evenVBand="0" w:oddHBand="1" w:evenHBand="0" w:firstRowFirstColumn="0" w:firstRowLastColumn="0" w:lastRowFirstColumn="0" w:lastRowLastColumn="0"/>
+            </w:pPr>
+            <w:r>
+              <w:t>Content Referencing</w:t>
+            </w:r>
+          </w:p>
+        </w:tc>
+        <w:tc>
+          <w:tcPr>
+            <w:tcW w:w="4926" w:type="dxa"/>
             <w:tcBorders>
               <w:left w:val="single" w:sz="8" w:space="0" w:color="9BBB59" w:themeColor="accent3"/>
             </w:tcBorders>
@@ -2682,15 +3197,7 @@
               <w:cnfStyle w:val="000000100000" w:firstRow="0" w:lastRow="0" w:firstColumn="0" w:lastColumn="0" w:oddVBand="0" w:evenVBand="0" w:oddHBand="1" w:evenHBand="0" w:firstRowFirstColumn="0" w:firstRowLastColumn="0" w:lastRowFirstColumn="0" w:lastRowLastColumn="0"/>
             </w:pPr>
             <w:r>
-              <w:t>Strong linking of requirement items.</w:t>
-            </w:r>
-          </w:p>
-          <w:p>
-            <w:pPr>
-              <w:cnfStyle w:val="000000100000" w:firstRow="0" w:lastRow="0" w:firstColumn="0" w:lastColumn="0" w:oddVBand="0" w:evenVBand="0" w:oddHBand="1" w:evenHBand="0" w:firstRowFirstColumn="0" w:firstRowLastColumn="0" w:lastRowFirstColumn="0" w:lastRowLastColumn="0"/>
-            </w:pPr>
-            <w:r>
-              <w:t>Hover over a key to see the definition; click a key to open the defining document; assistance when creating new references (possibly auto-complete, UI to select from available)</w:t>
+              <w:t>Link to, reference and reuse the same content in different locations.</w:t>
             </w:r>
           </w:p>
         </w:tc>
@@ -2706,6 +3213,9 @@
             <w:shd w:val="clear" w:color="auto" w:fill="D6E3BC" w:themeFill="accent3" w:themeFillTint="66"/>
           </w:tcPr>
           <w:p>
+            <w:pPr>
+              <w:jc w:val="both"/>
+            </w:pPr>
             <w:r>
               <w:t>MF-6</w:t>
             </w:r>
@@ -2713,7 +3223,26 @@
         </w:tc>
         <w:tc>
           <w:tcPr>
-            <w:tcW w:w="7903" w:type="dxa"/>
+            <w:tcW w:w="2977" w:type="dxa"/>
+            <w:tcBorders>
+              <w:right w:val="single" w:sz="8" w:space="0" w:color="9BBB59" w:themeColor="accent3"/>
+            </w:tcBorders>
+          </w:tcPr>
+          <w:p>
+            <w:pPr>
+              <w:cnfStyle w:val="000000000000" w:firstRow="0" w:lastRow="0" w:firstColumn="0" w:lastColumn="0" w:oddVBand="0" w:evenVBand="0" w:oddHBand="0" w:evenHBand="0" w:firstRowFirstColumn="0" w:firstRowLastColumn="0" w:lastRowFirstColumn="0" w:lastRowLastColumn="0"/>
+            </w:pPr>
+            <w:r>
+              <w:t xml:space="preserve">Structure and Organisation Content Decoupled from </w:t>
+            </w:r>
+            <w:r>
+              <w:t>Content</w:t>
+            </w:r>
+          </w:p>
+        </w:tc>
+        <w:tc>
+          <w:tcPr>
+            <w:tcW w:w="4926" w:type="dxa"/>
             <w:tcBorders>
               <w:left w:val="single" w:sz="8" w:space="0" w:color="9BBB59" w:themeColor="accent3"/>
             </w:tcBorders>
@@ -2722,9 +3251,6 @@
             <w:pPr>
               <w:cnfStyle w:val="000000000000" w:firstRow="0" w:lastRow="0" w:firstColumn="0" w:lastColumn="0" w:oddVBand="0" w:evenVBand="0" w:oddHBand="0" w:evenHBand="0" w:firstRowFirstColumn="0" w:firstRowLastColumn="0" w:lastRowFirstColumn="0" w:lastRowLastColumn="0"/>
             </w:pPr>
-            <w:r>
-              <w:t xml:space="preserve">Validation of references. </w:t>
-            </w:r>
           </w:p>
         </w:tc>
       </w:tr>
@@ -2742,6 +3268,9 @@
             <w:shd w:val="clear" w:color="auto" w:fill="D6E3BC" w:themeFill="accent3" w:themeFillTint="66"/>
           </w:tcPr>
           <w:p>
+            <w:pPr>
+              <w:jc w:val="both"/>
+            </w:pPr>
             <w:r>
               <w:t>MF-7</w:t>
             </w:r>
@@ -2749,7 +3278,23 @@
         </w:tc>
         <w:tc>
           <w:tcPr>
-            <w:tcW w:w="7903" w:type="dxa"/>
+            <w:tcW w:w="2977" w:type="dxa"/>
+            <w:tcBorders>
+              <w:right w:val="single" w:sz="8" w:space="0" w:color="9BBB59" w:themeColor="accent3"/>
+            </w:tcBorders>
+          </w:tcPr>
+          <w:p>
+            <w:pPr>
+              <w:cnfStyle w:val="000000100000" w:firstRow="0" w:lastRow="0" w:firstColumn="0" w:lastColumn="0" w:oddVBand="0" w:evenVBand="0" w:oddHBand="1" w:evenHBand="0" w:firstRowFirstColumn="0" w:firstRowLastColumn="0" w:lastRowFirstColumn="0" w:lastRowLastColumn="0"/>
+            </w:pPr>
+            <w:r>
+              <w:t>Version Control</w:t>
+            </w:r>
+          </w:p>
+        </w:tc>
+        <w:tc>
+          <w:tcPr>
+            <w:tcW w:w="4926" w:type="dxa"/>
             <w:tcBorders>
               <w:left w:val="single" w:sz="8" w:space="0" w:color="9BBB59" w:themeColor="accent3"/>
             </w:tcBorders>
@@ -2758,11 +3303,6 @@
             <w:pPr>
               <w:cnfStyle w:val="000000100000" w:firstRow="0" w:lastRow="0" w:firstColumn="0" w:lastColumn="0" w:oddVBand="0" w:evenVBand="0" w:oddHBand="1" w:evenHBand="0" w:firstRowFirstColumn="0" w:firstRowLastColumn="0" w:lastRowFirstColumn="0" w:lastRowLastColumn="0"/>
             </w:pPr>
-            <w:r>
-              <w:t>View a map of all document references.</w:t>
-            </w:r>
-            <w:bookmarkStart w:id="9" w:name="_GoBack"/>
-            <w:bookmarkEnd w:id="9"/>
           </w:p>
         </w:tc>
       </w:tr>
@@ -2777,15 +3317,33 @@
             <w:shd w:val="clear" w:color="auto" w:fill="D6E3BC" w:themeFill="accent3" w:themeFillTint="66"/>
           </w:tcPr>
           <w:p>
-            <w:r>
-              <w:lastRenderedPageBreak/>
+            <w:pPr>
+              <w:jc w:val="both"/>
+            </w:pPr>
+            <w:r>
               <w:t>MF-8</w:t>
             </w:r>
           </w:p>
         </w:tc>
         <w:tc>
           <w:tcPr>
-            <w:tcW w:w="7903" w:type="dxa"/>
+            <w:tcW w:w="2977" w:type="dxa"/>
+            <w:tcBorders>
+              <w:right w:val="single" w:sz="8" w:space="0" w:color="9BBB59" w:themeColor="accent3"/>
+            </w:tcBorders>
+          </w:tcPr>
+          <w:p>
+            <w:pPr>
+              <w:cnfStyle w:val="000000000000" w:firstRow="0" w:lastRow="0" w:firstColumn="0" w:lastColumn="0" w:oddVBand="0" w:evenVBand="0" w:oddHBand="0" w:evenHBand="0" w:firstRowFirstColumn="0" w:firstRowLastColumn="0" w:lastRowFirstColumn="0" w:lastRowLastColumn="0"/>
+            </w:pPr>
+            <w:r>
+              <w:t>Collaboration</w:t>
+            </w:r>
+          </w:p>
+        </w:tc>
+        <w:tc>
+          <w:tcPr>
+            <w:tcW w:w="4926" w:type="dxa"/>
             <w:tcBorders>
               <w:left w:val="single" w:sz="8" w:space="0" w:color="9BBB59" w:themeColor="accent3"/>
             </w:tcBorders>
@@ -2794,9 +3352,6 @@
             <w:pPr>
               <w:cnfStyle w:val="000000000000" w:firstRow="0" w:lastRow="0" w:firstColumn="0" w:lastColumn="0" w:oddVBand="0" w:evenVBand="0" w:oddHBand="0" w:evenHBand="0" w:firstRowFirstColumn="0" w:firstRowLastColumn="0" w:lastRowFirstColumn="0" w:lastRowLastColumn="0"/>
             </w:pPr>
-            <w:r>
-              <w:t>View and search history of all changes.</w:t>
-            </w:r>
           </w:p>
         </w:tc>
       </w:tr>
@@ -2814,6 +3369,9 @@
             <w:shd w:val="clear" w:color="auto" w:fill="D6E3BC" w:themeFill="accent3" w:themeFillTint="66"/>
           </w:tcPr>
           <w:p>
+            <w:pPr>
+              <w:jc w:val="both"/>
+            </w:pPr>
             <w:r>
               <w:t>MF-9</w:t>
             </w:r>
@@ -2821,7 +3379,23 @@
         </w:tc>
         <w:tc>
           <w:tcPr>
-            <w:tcW w:w="7903" w:type="dxa"/>
+            <w:tcW w:w="2977" w:type="dxa"/>
+            <w:tcBorders>
+              <w:right w:val="single" w:sz="8" w:space="0" w:color="9BBB59" w:themeColor="accent3"/>
+            </w:tcBorders>
+          </w:tcPr>
+          <w:p>
+            <w:pPr>
+              <w:cnfStyle w:val="000000100000" w:firstRow="0" w:lastRow="0" w:firstColumn="0" w:lastColumn="0" w:oddVBand="0" w:evenVBand="0" w:oddHBand="1" w:evenHBand="0" w:firstRowFirstColumn="0" w:firstRowLastColumn="0" w:lastRowFirstColumn="0" w:lastRowLastColumn="0"/>
+            </w:pPr>
+            <w:r>
+              <w:t>Workflow</w:t>
+            </w:r>
+          </w:p>
+        </w:tc>
+        <w:tc>
+          <w:tcPr>
+            <w:tcW w:w="4926" w:type="dxa"/>
             <w:tcBorders>
               <w:left w:val="single" w:sz="8" w:space="0" w:color="9BBB59" w:themeColor="accent3"/>
             </w:tcBorders>
@@ -2830,9 +3404,6 @@
             <w:pPr>
               <w:cnfStyle w:val="000000100000" w:firstRow="0" w:lastRow="0" w:firstColumn="0" w:lastColumn="0" w:oddVBand="0" w:evenVBand="0" w:oddHBand="1" w:evenHBand="0" w:firstRowFirstColumn="0" w:firstRowLastColumn="0" w:lastRowFirstColumn="0" w:lastRowLastColumn="0"/>
             </w:pPr>
-            <w:r>
-              <w:t>Tag versions of documents.</w:t>
-            </w:r>
           </w:p>
         </w:tc>
       </w:tr>
@@ -2847,6 +3418,9 @@
             <w:shd w:val="clear" w:color="auto" w:fill="D6E3BC" w:themeFill="accent3" w:themeFillTint="66"/>
           </w:tcPr>
           <w:p>
+            <w:pPr>
+              <w:jc w:val="both"/>
+            </w:pPr>
             <w:r>
               <w:t>MF-10</w:t>
             </w:r>
@@ -2854,7 +3428,23 @@
         </w:tc>
         <w:tc>
           <w:tcPr>
-            <w:tcW w:w="7903" w:type="dxa"/>
+            <w:tcW w:w="2977" w:type="dxa"/>
+            <w:tcBorders>
+              <w:right w:val="single" w:sz="8" w:space="0" w:color="9BBB59" w:themeColor="accent3"/>
+            </w:tcBorders>
+          </w:tcPr>
+          <w:p>
+            <w:pPr>
+              <w:cnfStyle w:val="000000000000" w:firstRow="0" w:lastRow="0" w:firstColumn="0" w:lastColumn="0" w:oddVBand="0" w:evenVBand="0" w:oddHBand="0" w:evenHBand="0" w:firstRowFirstColumn="0" w:firstRowLastColumn="0" w:lastRowFirstColumn="0" w:lastRowLastColumn="0"/>
+            </w:pPr>
+            <w:r>
+              <w:t>External Files</w:t>
+            </w:r>
+          </w:p>
+        </w:tc>
+        <w:tc>
+          <w:tcPr>
+            <w:tcW w:w="4926" w:type="dxa"/>
             <w:tcBorders>
               <w:left w:val="single" w:sz="8" w:space="0" w:color="9BBB59" w:themeColor="accent3"/>
             </w:tcBorders>
@@ -2863,17 +3453,6 @@
             <w:pPr>
               <w:cnfStyle w:val="000000000000" w:firstRow="0" w:lastRow="0" w:firstColumn="0" w:lastColumn="0" w:oddVBand="0" w:evenVBand="0" w:oddHBand="0" w:evenHBand="0" w:firstRowFirstColumn="0" w:firstRowLastColumn="0" w:lastRowFirstColumn="0" w:lastRowLastColumn="0"/>
             </w:pPr>
-            <w:r>
-              <w:t xml:space="preserve">View documents according to a </w:t>
-            </w:r>
-            <w:proofErr w:type="gramStart"/>
-            <w:r>
-              <w:t>tag,</w:t>
-            </w:r>
-            <w:proofErr w:type="gramEnd"/>
-            <w:r>
-              <w:t xml:space="preserve"> or as-at a specific point in time.</w:t>
-            </w:r>
           </w:p>
         </w:tc>
       </w:tr>
@@ -2891,6 +3470,9 @@
             <w:shd w:val="clear" w:color="auto" w:fill="D6E3BC" w:themeFill="accent3" w:themeFillTint="66"/>
           </w:tcPr>
           <w:p>
+            <w:pPr>
+              <w:jc w:val="both"/>
+            </w:pPr>
             <w:r>
               <w:t>MF-11</w:t>
             </w:r>
@@ -2898,7 +3480,20 @@
         </w:tc>
         <w:tc>
           <w:tcPr>
-            <w:tcW w:w="7903" w:type="dxa"/>
+            <w:tcW w:w="2977" w:type="dxa"/>
+            <w:tcBorders>
+              <w:right w:val="single" w:sz="8" w:space="0" w:color="9BBB59" w:themeColor="accent3"/>
+            </w:tcBorders>
+          </w:tcPr>
+          <w:p>
+            <w:pPr>
+              <w:cnfStyle w:val="000000100000" w:firstRow="0" w:lastRow="0" w:firstColumn="0" w:lastColumn="0" w:oddVBand="0" w:evenVBand="0" w:oddHBand="1" w:evenHBand="0" w:firstRowFirstColumn="0" w:firstRowLastColumn="0" w:lastRowFirstColumn="0" w:lastRowLastColumn="0"/>
+            </w:pPr>
+          </w:p>
+        </w:tc>
+        <w:tc>
+          <w:tcPr>
+            <w:tcW w:w="4926" w:type="dxa"/>
             <w:tcBorders>
               <w:left w:val="single" w:sz="8" w:space="0" w:color="9BBB59" w:themeColor="accent3"/>
             </w:tcBorders>
@@ -2907,9 +3502,6 @@
             <w:pPr>
               <w:cnfStyle w:val="000000100000" w:firstRow="0" w:lastRow="0" w:firstColumn="0" w:lastColumn="0" w:oddVBand="0" w:evenVBand="0" w:oddHBand="1" w:evenHBand="0" w:firstRowFirstColumn="0" w:firstRowLastColumn="0" w:lastRowFirstColumn="0" w:lastRowLastColumn="0"/>
             </w:pPr>
-            <w:r>
-              <w:t>Include system-maintained metadata in a document. (Example: revision history)</w:t>
-            </w:r>
           </w:p>
         </w:tc>
       </w:tr>
@@ -2924,6 +3516,9 @@
             <w:shd w:val="clear" w:color="auto" w:fill="D6E3BC" w:themeFill="accent3" w:themeFillTint="66"/>
           </w:tcPr>
           <w:p>
+            <w:pPr>
+              <w:jc w:val="both"/>
+            </w:pPr>
             <w:r>
               <w:t>MF-12</w:t>
             </w:r>
@@ -2931,7 +3526,20 @@
         </w:tc>
         <w:tc>
           <w:tcPr>
-            <w:tcW w:w="7903" w:type="dxa"/>
+            <w:tcW w:w="2977" w:type="dxa"/>
+            <w:tcBorders>
+              <w:right w:val="single" w:sz="8" w:space="0" w:color="9BBB59" w:themeColor="accent3"/>
+            </w:tcBorders>
+          </w:tcPr>
+          <w:p>
+            <w:pPr>
+              <w:cnfStyle w:val="000000000000" w:firstRow="0" w:lastRow="0" w:firstColumn="0" w:lastColumn="0" w:oddVBand="0" w:evenVBand="0" w:oddHBand="0" w:evenHBand="0" w:firstRowFirstColumn="0" w:firstRowLastColumn="0" w:lastRowFirstColumn="0" w:lastRowLastColumn="0"/>
+            </w:pPr>
+          </w:p>
+        </w:tc>
+        <w:tc>
+          <w:tcPr>
+            <w:tcW w:w="4926" w:type="dxa"/>
             <w:tcBorders>
               <w:left w:val="single" w:sz="8" w:space="0" w:color="9BBB59" w:themeColor="accent3"/>
             </w:tcBorders>
@@ -2940,20 +3548,6 @@
             <w:pPr>
               <w:cnfStyle w:val="000000000000" w:firstRow="0" w:lastRow="0" w:firstColumn="0" w:lastColumn="0" w:oddVBand="0" w:evenVBand="0" w:oddHBand="0" w:evenHBand="0" w:firstRowFirstColumn="0" w:firstRowLastColumn="0" w:lastRowFirstColumn="0" w:lastRowLastColumn="0"/>
             </w:pPr>
-            <w:r>
-              <w:t xml:space="preserve">Track and view </w:t>
-            </w:r>
-            <w:r>
-              <w:t xml:space="preserve">TODOs and TBDs. (Optionally filter and aggregate by document, assignee, </w:t>
-            </w:r>
-            <w:proofErr w:type="gramStart"/>
-            <w:r>
-              <w:t>inception</w:t>
-            </w:r>
-            <w:proofErr w:type="gramEnd"/>
-            <w:r>
-              <w:t>/target date.)</w:t>
-            </w:r>
           </w:p>
         </w:tc>
       </w:tr>
@@ -2971,6 +3565,9 @@
             <w:shd w:val="clear" w:color="auto" w:fill="D6E3BC" w:themeFill="accent3" w:themeFillTint="66"/>
           </w:tcPr>
           <w:p>
+            <w:pPr>
+              <w:jc w:val="both"/>
+            </w:pPr>
             <w:r>
               <w:t>MF-13</w:t>
             </w:r>
@@ -2978,7 +3575,20 @@
         </w:tc>
         <w:tc>
           <w:tcPr>
-            <w:tcW w:w="7903" w:type="dxa"/>
+            <w:tcW w:w="2977" w:type="dxa"/>
+            <w:tcBorders>
+              <w:right w:val="single" w:sz="8" w:space="0" w:color="9BBB59" w:themeColor="accent3"/>
+            </w:tcBorders>
+          </w:tcPr>
+          <w:p>
+            <w:pPr>
+              <w:cnfStyle w:val="000000100000" w:firstRow="0" w:lastRow="0" w:firstColumn="0" w:lastColumn="0" w:oddVBand="0" w:evenVBand="0" w:oddHBand="1" w:evenHBand="0" w:firstRowFirstColumn="0" w:firstRowLastColumn="0" w:lastRowFirstColumn="0" w:lastRowLastColumn="0"/>
+            </w:pPr>
+          </w:p>
+        </w:tc>
+        <w:tc>
+          <w:tcPr>
+            <w:tcW w:w="4926" w:type="dxa"/>
             <w:tcBorders>
               <w:left w:val="single" w:sz="8" w:space="0" w:color="9BBB59" w:themeColor="accent3"/>
             </w:tcBorders>
@@ -2987,18 +3597,6 @@
             <w:pPr>
               <w:cnfStyle w:val="000000100000" w:firstRow="0" w:lastRow="0" w:firstColumn="0" w:lastColumn="0" w:oddVBand="0" w:evenVBand="0" w:oddHBand="1" w:evenHBand="0" w:firstRowFirstColumn="0" w:firstRowLastColumn="0" w:lastRowFirstColumn="0" w:lastRowLastColumn="0"/>
             </w:pPr>
-            <w:r>
-              <w:t xml:space="preserve">View </w:t>
-            </w:r>
-            <w:r>
-              <w:t xml:space="preserve">help for a section of a document. This can be provided by the template and can also show </w:t>
-            </w:r>
-            <w:r>
-              <w:t xml:space="preserve">examples from other docs </w:t>
-            </w:r>
-            <w:r>
-              <w:t>in the system (provided the user has access).</w:t>
-            </w:r>
           </w:p>
         </w:tc>
       </w:tr>
@@ -3013,6 +3611,9 @@
             <w:shd w:val="clear" w:color="auto" w:fill="D6E3BC" w:themeFill="accent3" w:themeFillTint="66"/>
           </w:tcPr>
           <w:p>
+            <w:pPr>
+              <w:jc w:val="both"/>
+            </w:pPr>
             <w:r>
               <w:t>MF-14</w:t>
             </w:r>
@@ -3020,7 +3621,20 @@
         </w:tc>
         <w:tc>
           <w:tcPr>
-            <w:tcW w:w="7903" w:type="dxa"/>
+            <w:tcW w:w="2977" w:type="dxa"/>
+            <w:tcBorders>
+              <w:right w:val="single" w:sz="8" w:space="0" w:color="9BBB59" w:themeColor="accent3"/>
+            </w:tcBorders>
+          </w:tcPr>
+          <w:p>
+            <w:pPr>
+              <w:cnfStyle w:val="000000000000" w:firstRow="0" w:lastRow="0" w:firstColumn="0" w:lastColumn="0" w:oddVBand="0" w:evenVBand="0" w:oddHBand="0" w:evenHBand="0" w:firstRowFirstColumn="0" w:firstRowLastColumn="0" w:lastRowFirstColumn="0" w:lastRowLastColumn="0"/>
+            </w:pPr>
+          </w:p>
+        </w:tc>
+        <w:tc>
+          <w:tcPr>
+            <w:tcW w:w="4926" w:type="dxa"/>
             <w:tcBorders>
               <w:left w:val="single" w:sz="8" w:space="0" w:color="9BBB59" w:themeColor="accent3"/>
             </w:tcBorders>
@@ -3029,9 +3643,6 @@
             <w:pPr>
               <w:cnfStyle w:val="000000000000" w:firstRow="0" w:lastRow="0" w:firstColumn="0" w:lastColumn="0" w:oddVBand="0" w:evenVBand="0" w:oddHBand="0" w:evenHBand="0" w:firstRowFirstColumn="0" w:firstRowLastColumn="0" w:lastRowFirstColumn="0" w:lastRowLastColumn="0"/>
             </w:pPr>
-            <w:r>
-              <w:t>Store diagrams in whatever format the user likes, together with a graphic copy that is embedded into documents.</w:t>
-            </w:r>
           </w:p>
         </w:tc>
       </w:tr>
@@ -3049,6 +3660,9 @@
             <w:shd w:val="clear" w:color="auto" w:fill="D6E3BC" w:themeFill="accent3" w:themeFillTint="66"/>
           </w:tcPr>
           <w:p>
+            <w:pPr>
+              <w:jc w:val="both"/>
+            </w:pPr>
             <w:r>
               <w:t>MF-15</w:t>
             </w:r>
@@ -3056,7 +3670,20 @@
         </w:tc>
         <w:tc>
           <w:tcPr>
-            <w:tcW w:w="7903" w:type="dxa"/>
+            <w:tcW w:w="2977" w:type="dxa"/>
+            <w:tcBorders>
+              <w:right w:val="single" w:sz="8" w:space="0" w:color="9BBB59" w:themeColor="accent3"/>
+            </w:tcBorders>
+          </w:tcPr>
+          <w:p>
+            <w:pPr>
+              <w:cnfStyle w:val="000000100000" w:firstRow="0" w:lastRow="0" w:firstColumn="0" w:lastColumn="0" w:oddVBand="0" w:evenVBand="0" w:oddHBand="1" w:evenHBand="0" w:firstRowFirstColumn="0" w:firstRowLastColumn="0" w:lastRowFirstColumn="0" w:lastRowLastColumn="0"/>
+            </w:pPr>
+          </w:p>
+        </w:tc>
+        <w:tc>
+          <w:tcPr>
+            <w:tcW w:w="4926" w:type="dxa"/>
             <w:tcBorders>
               <w:left w:val="single" w:sz="8" w:space="0" w:color="9BBB59" w:themeColor="accent3"/>
             </w:tcBorders>
@@ -3065,9 +3692,6 @@
             <w:pPr>
               <w:cnfStyle w:val="000000100000" w:firstRow="0" w:lastRow="0" w:firstColumn="0" w:lastColumn="0" w:oddVBand="0" w:evenVBand="0" w:oddHBand="1" w:evenHBand="0" w:firstRowFirstColumn="0" w:firstRowLastColumn="0" w:lastRowFirstColumn="0" w:lastRowLastColumn="0"/>
             </w:pPr>
-            <w:r>
-              <w:t>Control who has view, read and write access to documents.</w:t>
-            </w:r>
           </w:p>
         </w:tc>
       </w:tr>
@@ -3082,6 +3706,9 @@
             <w:shd w:val="clear" w:color="auto" w:fill="D6E3BC" w:themeFill="accent3" w:themeFillTint="66"/>
           </w:tcPr>
           <w:p>
+            <w:pPr>
+              <w:jc w:val="both"/>
+            </w:pPr>
             <w:r>
               <w:t>MF-16</w:t>
             </w:r>
@@ -3089,7 +3716,20 @@
         </w:tc>
         <w:tc>
           <w:tcPr>
-            <w:tcW w:w="7903" w:type="dxa"/>
+            <w:tcW w:w="2977" w:type="dxa"/>
+            <w:tcBorders>
+              <w:right w:val="single" w:sz="8" w:space="0" w:color="9BBB59" w:themeColor="accent3"/>
+            </w:tcBorders>
+          </w:tcPr>
+          <w:p>
+            <w:pPr>
+              <w:cnfStyle w:val="000000000000" w:firstRow="0" w:lastRow="0" w:firstColumn="0" w:lastColumn="0" w:oddVBand="0" w:evenVBand="0" w:oddHBand="0" w:evenHBand="0" w:firstRowFirstColumn="0" w:firstRowLastColumn="0" w:lastRowFirstColumn="0" w:lastRowLastColumn="0"/>
+            </w:pPr>
+          </w:p>
+        </w:tc>
+        <w:tc>
+          <w:tcPr>
+            <w:tcW w:w="4926" w:type="dxa"/>
             <w:tcBorders>
               <w:left w:val="single" w:sz="8" w:space="0" w:color="9BBB59" w:themeColor="accent3"/>
             </w:tcBorders>
@@ -3098,9 +3738,6 @@
             <w:pPr>
               <w:cnfStyle w:val="000000000000" w:firstRow="0" w:lastRow="0" w:firstColumn="0" w:lastColumn="0" w:oddVBand="0" w:evenVBand="0" w:oddHBand="0" w:evenHBand="0" w:firstRowFirstColumn="0" w:firstRowLastColumn="0" w:lastRowFirstColumn="0" w:lastRowLastColumn="0"/>
             </w:pPr>
-            <w:r>
-              <w:t>Request and track sign-off from specified users.</w:t>
-            </w:r>
           </w:p>
         </w:tc>
       </w:tr>
@@ -3118,6 +3755,9 @@
             <w:shd w:val="clear" w:color="auto" w:fill="D6E3BC" w:themeFill="accent3" w:themeFillTint="66"/>
           </w:tcPr>
           <w:p>
+            <w:pPr>
+              <w:jc w:val="both"/>
+            </w:pPr>
             <w:r>
               <w:t>MF-17</w:t>
             </w:r>
@@ -3125,7 +3765,20 @@
         </w:tc>
         <w:tc>
           <w:tcPr>
-            <w:tcW w:w="7903" w:type="dxa"/>
+            <w:tcW w:w="2977" w:type="dxa"/>
+            <w:tcBorders>
+              <w:right w:val="single" w:sz="8" w:space="0" w:color="9BBB59" w:themeColor="accent3"/>
+            </w:tcBorders>
+          </w:tcPr>
+          <w:p>
+            <w:pPr>
+              <w:cnfStyle w:val="000000100000" w:firstRow="0" w:lastRow="0" w:firstColumn="0" w:lastColumn="0" w:oddVBand="0" w:evenVBand="0" w:oddHBand="1" w:evenHBand="0" w:firstRowFirstColumn="0" w:firstRowLastColumn="0" w:lastRowFirstColumn="0" w:lastRowLastColumn="0"/>
+            </w:pPr>
+          </w:p>
+        </w:tc>
+        <w:tc>
+          <w:tcPr>
+            <w:tcW w:w="4926" w:type="dxa"/>
             <w:tcBorders>
               <w:left w:val="single" w:sz="8" w:space="0" w:color="9BBB59" w:themeColor="accent3"/>
             </w:tcBorders>
@@ -3134,12 +3787,6 @@
             <w:pPr>
               <w:cnfStyle w:val="000000100000" w:firstRow="0" w:lastRow="0" w:firstColumn="0" w:lastColumn="0" w:oddVBand="0" w:evenVBand="0" w:oddHBand="1" w:evenHBand="0" w:firstRowFirstColumn="0" w:firstRowLastColumn="0" w:lastRowFirstColumn="0" w:lastRowLastColumn="0"/>
             </w:pPr>
-            <w:r>
-              <w:t xml:space="preserve">Print a </w:t>
-            </w:r>
-            <w:r>
-              <w:t>selection of documents, and optionally all referenced documents.</w:t>
-            </w:r>
           </w:p>
         </w:tc>
       </w:tr>
@@ -3154,6 +3801,9 @@
             <w:shd w:val="clear" w:color="auto" w:fill="D6E3BC" w:themeFill="accent3" w:themeFillTint="66"/>
           </w:tcPr>
           <w:p>
+            <w:pPr>
+              <w:jc w:val="both"/>
+            </w:pPr>
             <w:r>
               <w:t>MF-18</w:t>
             </w:r>
@@ -3161,7 +3811,20 @@
         </w:tc>
         <w:tc>
           <w:tcPr>
-            <w:tcW w:w="7903" w:type="dxa"/>
+            <w:tcW w:w="2977" w:type="dxa"/>
+            <w:tcBorders>
+              <w:right w:val="single" w:sz="8" w:space="0" w:color="9BBB59" w:themeColor="accent3"/>
+            </w:tcBorders>
+          </w:tcPr>
+          <w:p>
+            <w:pPr>
+              <w:cnfStyle w:val="000000000000" w:firstRow="0" w:lastRow="0" w:firstColumn="0" w:lastColumn="0" w:oddVBand="0" w:evenVBand="0" w:oddHBand="0" w:evenHBand="0" w:firstRowFirstColumn="0" w:firstRowLastColumn="0" w:lastRowFirstColumn="0" w:lastRowLastColumn="0"/>
+            </w:pPr>
+          </w:p>
+        </w:tc>
+        <w:tc>
+          <w:tcPr>
+            <w:tcW w:w="4926" w:type="dxa"/>
             <w:tcBorders>
               <w:left w:val="single" w:sz="8" w:space="0" w:color="9BBB59" w:themeColor="accent3"/>
             </w:tcBorders>
@@ -3170,9 +3833,6 @@
             <w:pPr>
               <w:cnfStyle w:val="000000000000" w:firstRow="0" w:lastRow="0" w:firstColumn="0" w:lastColumn="0" w:oddVBand="0" w:evenVBand="0" w:oddHBand="0" w:evenHBand="0" w:firstRowFirstColumn="0" w:firstRowLastColumn="0" w:lastRowFirstColumn="0" w:lastRowLastColumn="0"/>
             </w:pPr>
-            <w:r>
-              <w:t>Export to Acrobat Reader (PDF) and Microsoft Word (DOCX).</w:t>
-            </w:r>
           </w:p>
         </w:tc>
       </w:tr>
@@ -3190,6 +3850,9 @@
             <w:shd w:val="clear" w:color="auto" w:fill="D6E3BC" w:themeFill="accent3" w:themeFillTint="66"/>
           </w:tcPr>
           <w:p>
+            <w:pPr>
+              <w:jc w:val="both"/>
+            </w:pPr>
             <w:r>
               <w:t>MF-19</w:t>
             </w:r>
@@ -3197,7 +3860,20 @@
         </w:tc>
         <w:tc>
           <w:tcPr>
-            <w:tcW w:w="7903" w:type="dxa"/>
+            <w:tcW w:w="2977" w:type="dxa"/>
+            <w:tcBorders>
+              <w:right w:val="single" w:sz="8" w:space="0" w:color="9BBB59" w:themeColor="accent3"/>
+            </w:tcBorders>
+          </w:tcPr>
+          <w:p>
+            <w:pPr>
+              <w:cnfStyle w:val="000000100000" w:firstRow="0" w:lastRow="0" w:firstColumn="0" w:lastColumn="0" w:oddVBand="0" w:evenVBand="0" w:oddHBand="1" w:evenHBand="0" w:firstRowFirstColumn="0" w:firstRowLastColumn="0" w:lastRowFirstColumn="0" w:lastRowLastColumn="0"/>
+            </w:pPr>
+          </w:p>
+        </w:tc>
+        <w:tc>
+          <w:tcPr>
+            <w:tcW w:w="4926" w:type="dxa"/>
             <w:tcBorders>
               <w:left w:val="single" w:sz="8" w:space="0" w:color="9BBB59" w:themeColor="accent3"/>
             </w:tcBorders>
@@ -3206,12 +3882,6 @@
             <w:pPr>
               <w:cnfStyle w:val="000000100000" w:firstRow="0" w:lastRow="0" w:firstColumn="0" w:lastColumn="0" w:oddVBand="0" w:evenVBand="0" w:oddHBand="1" w:evenHBand="0" w:firstRowFirstColumn="0" w:firstRowLastColumn="0" w:lastRowFirstColumn="0" w:lastRowLastColumn="0"/>
             </w:pPr>
-            <w:r>
-              <w:t xml:space="preserve">Users can propose changes </w:t>
-            </w:r>
-            <w:r>
-              <w:t>which relevant users can accept/reject.</w:t>
-            </w:r>
           </w:p>
         </w:tc>
       </w:tr>
@@ -3226,6 +3896,9 @@
             <w:shd w:val="clear" w:color="auto" w:fill="D6E3BC" w:themeFill="accent3" w:themeFillTint="66"/>
           </w:tcPr>
           <w:p>
+            <w:pPr>
+              <w:jc w:val="both"/>
+            </w:pPr>
             <w:r>
               <w:t>MF-20</w:t>
             </w:r>
@@ -3233,7 +3906,20 @@
         </w:tc>
         <w:tc>
           <w:tcPr>
-            <w:tcW w:w="7903" w:type="dxa"/>
+            <w:tcW w:w="2977" w:type="dxa"/>
+            <w:tcBorders>
+              <w:right w:val="single" w:sz="8" w:space="0" w:color="9BBB59" w:themeColor="accent3"/>
+            </w:tcBorders>
+          </w:tcPr>
+          <w:p>
+            <w:pPr>
+              <w:cnfStyle w:val="000000000000" w:firstRow="0" w:lastRow="0" w:firstColumn="0" w:lastColumn="0" w:oddVBand="0" w:evenVBand="0" w:oddHBand="0" w:evenHBand="0" w:firstRowFirstColumn="0" w:firstRowLastColumn="0" w:lastRowFirstColumn="0" w:lastRowLastColumn="0"/>
+            </w:pPr>
+          </w:p>
+        </w:tc>
+        <w:tc>
+          <w:tcPr>
+            <w:tcW w:w="4926" w:type="dxa"/>
             <w:tcBorders>
               <w:left w:val="single" w:sz="8" w:space="0" w:color="9BBB59" w:themeColor="accent3"/>
             </w:tcBorders>
@@ -3242,18 +3928,6 @@
             <w:pPr>
               <w:cnfStyle w:val="000000000000" w:firstRow="0" w:lastRow="0" w:firstColumn="0" w:lastColumn="0" w:oddVBand="0" w:evenVBand="0" w:oddHBand="0" w:evenHBand="0" w:firstRowFirstColumn="0" w:firstRowLastColumn="0" w:lastRowFirstColumn="0" w:lastRowLastColumn="0"/>
             </w:pPr>
-            <w:r>
-              <w:t xml:space="preserve">Broadcast </w:t>
-            </w:r>
-            <w:r>
-              <w:t xml:space="preserve">document changes to users. </w:t>
-            </w:r>
-            <w:r>
-              <w:t>Notifications</w:t>
-            </w:r>
-            <w:r>
-              <w:t xml:space="preserve"> can be after a change is made, or periodically such as a weekly change email.</w:t>
-            </w:r>
           </w:p>
         </w:tc>
       </w:tr>
@@ -3271,6 +3945,9 @@
             <w:shd w:val="clear" w:color="auto" w:fill="D6E3BC" w:themeFill="accent3" w:themeFillTint="66"/>
           </w:tcPr>
           <w:p>
+            <w:pPr>
+              <w:jc w:val="both"/>
+            </w:pPr>
             <w:r>
               <w:t>MF-21</w:t>
             </w:r>
@@ -3278,7 +3955,20 @@
         </w:tc>
         <w:tc>
           <w:tcPr>
-            <w:tcW w:w="7903" w:type="dxa"/>
+            <w:tcW w:w="2977" w:type="dxa"/>
+            <w:tcBorders>
+              <w:right w:val="single" w:sz="8" w:space="0" w:color="9BBB59" w:themeColor="accent3"/>
+            </w:tcBorders>
+          </w:tcPr>
+          <w:p>
+            <w:pPr>
+              <w:cnfStyle w:val="000000100000" w:firstRow="0" w:lastRow="0" w:firstColumn="0" w:lastColumn="0" w:oddVBand="0" w:evenVBand="0" w:oddHBand="1" w:evenHBand="0" w:firstRowFirstColumn="0" w:firstRowLastColumn="0" w:lastRowFirstColumn="0" w:lastRowLastColumn="0"/>
+            </w:pPr>
+          </w:p>
+        </w:tc>
+        <w:tc>
+          <w:tcPr>
+            <w:tcW w:w="4926" w:type="dxa"/>
             <w:tcBorders>
               <w:left w:val="single" w:sz="8" w:space="0" w:color="9BBB59" w:themeColor="accent3"/>
             </w:tcBorders>
@@ -3287,9 +3977,6 @@
             <w:pPr>
               <w:cnfStyle w:val="000000100000" w:firstRow="0" w:lastRow="0" w:firstColumn="0" w:lastColumn="0" w:oddVBand="0" w:evenVBand="0" w:oddHBand="1" w:evenHBand="0" w:firstRowFirstColumn="0" w:firstRowLastColumn="0" w:lastRowFirstColumn="0" w:lastRowLastColumn="0"/>
             </w:pPr>
-            <w:r>
-              <w:t>Users can review sections of documents. Who and what can be defined in rules, and explicitly requested.</w:t>
-            </w:r>
           </w:p>
         </w:tc>
       </w:tr>
@@ -3304,11 +3991,12 @@
         </w:numPr>
         <w:ind w:left="431" w:hanging="431"/>
       </w:pPr>
-      <w:bookmarkStart w:id="10" w:name="_Toc303807215"/>
+      <w:bookmarkStart w:id="9" w:name="_Toc303807215"/>
       <w:r>
+        <w:lastRenderedPageBreak/>
         <w:t>Assumptions and Dependencies</w:t>
       </w:r>
-      <w:bookmarkEnd w:id="10"/>
+      <w:bookmarkEnd w:id="9"/>
     </w:p>
     <w:p>
       <w:r>
@@ -3323,11 +4011,11 @@
           <w:numId w:val="11"/>
         </w:numPr>
       </w:pPr>
-      <w:bookmarkStart w:id="11" w:name="_Toc303807216"/>
+      <w:bookmarkStart w:id="10" w:name="_Toc303807216"/>
       <w:r>
         <w:t>Scope and Limitations</w:t>
       </w:r>
-      <w:bookmarkEnd w:id="11"/>
+      <w:bookmarkEnd w:id="10"/>
     </w:p>
     <w:p>
       <w:pPr>
@@ -3338,7 +4026,7 @@
         </w:numPr>
         <w:ind w:left="431" w:hanging="431"/>
       </w:pPr>
-      <w:bookmarkStart w:id="12" w:name="_Toc303807217"/>
+      <w:bookmarkStart w:id="11" w:name="_Toc303807217"/>
       <w:r>
         <w:t>Scope of</w:t>
       </w:r>
@@ -3354,7 +4042,7 @@
       <w:r>
         <w:t>s</w:t>
       </w:r>
-      <w:bookmarkEnd w:id="12"/>
+      <w:bookmarkEnd w:id="11"/>
     </w:p>
     <w:tbl>
       <w:tblPr>
@@ -5098,7 +5786,6 @@
           </w:tcPr>
           <w:p>
             <w:r>
-              <w:lastRenderedPageBreak/>
               <w:t>MF-12</w:t>
             </w:r>
           </w:p>
@@ -6363,11 +7050,11 @@
         </w:numPr>
         <w:ind w:left="431" w:hanging="431"/>
       </w:pPr>
-      <w:bookmarkStart w:id="13" w:name="_Toc303807218"/>
+      <w:bookmarkStart w:id="12" w:name="_Toc303807218"/>
       <w:r>
         <w:t>Limitations and Exclusions</w:t>
       </w:r>
-      <w:bookmarkEnd w:id="13"/>
+      <w:bookmarkEnd w:id="12"/>
     </w:p>
     <w:tbl>
       <w:tblPr>
@@ -6446,11 +7133,12 @@
           <w:numId w:val="11"/>
         </w:numPr>
       </w:pPr>
-      <w:bookmarkStart w:id="14" w:name="_Toc303807219"/>
+      <w:bookmarkStart w:id="13" w:name="_Toc303807219"/>
       <w:r>
+        <w:lastRenderedPageBreak/>
         <w:t>Business Context</w:t>
       </w:r>
-      <w:bookmarkEnd w:id="14"/>
+      <w:bookmarkEnd w:id="13"/>
     </w:p>
     <w:p>
       <w:pPr>
@@ -6461,11 +7149,11 @@
         </w:numPr>
         <w:ind w:left="431" w:hanging="431"/>
       </w:pPr>
-      <w:bookmarkStart w:id="15" w:name="_Toc303807220"/>
+      <w:bookmarkStart w:id="14" w:name="_Toc303807220"/>
       <w:r>
         <w:t>Stakeholder Profiles</w:t>
       </w:r>
-      <w:bookmarkEnd w:id="15"/>
+      <w:bookmarkEnd w:id="14"/>
     </w:p>
     <w:p>
       <w:r>
@@ -6481,11 +7169,11 @@
         </w:numPr>
         <w:ind w:left="431" w:hanging="431"/>
       </w:pPr>
-      <w:bookmarkStart w:id="16" w:name="_Toc303807221"/>
+      <w:bookmarkStart w:id="15" w:name="_Toc303807221"/>
       <w:r>
         <w:t>Project Priorities</w:t>
       </w:r>
-      <w:bookmarkEnd w:id="16"/>
+      <w:bookmarkEnd w:id="15"/>
     </w:p>
     <w:tbl>
       <w:tblPr>
@@ -6918,11 +7606,11 @@
         </w:numPr>
         <w:ind w:left="431" w:hanging="431"/>
       </w:pPr>
-      <w:bookmarkStart w:id="17" w:name="_Toc303807222"/>
+      <w:bookmarkStart w:id="16" w:name="_Toc303807222"/>
       <w:r>
         <w:t>Operating Environment</w:t>
       </w:r>
-      <w:bookmarkEnd w:id="17"/>
+      <w:bookmarkEnd w:id="16"/>
     </w:p>
     <w:p>
       <w:r>
@@ -6938,7 +7626,6 @@
         </w:numPr>
       </w:pPr>
       <w:r>
-        <w:lastRenderedPageBreak/>
         <w:t xml:space="preserve">Users will be distributed geographically across all </w:t>
       </w:r>
       <w:proofErr w:type="spellStart"/>
@@ -6989,13 +7676,7 @@
         </w:numPr>
       </w:pPr>
       <w:r>
-        <w:t>A</w:t>
-      </w:r>
-      <w:r>
-        <w:t xml:space="preserve">s users </w:t>
-      </w:r>
-      <w:r>
-        <w:t>will be hosting their IP online,</w:t>
+        <w:t>As users will be hosting their IP online,</w:t>
       </w:r>
     </w:p>
     <w:p>
@@ -7156,6 +7837,7 @@
         </w:numPr>
       </w:pPr>
       <w:r>
+        <w:lastRenderedPageBreak/>
         <w:t>Scalability?</w:t>
       </w:r>
     </w:p>
@@ -7171,6 +7853,999 @@
         <w:t>Portability</w:t>
       </w:r>
     </w:p>
+    <w:p>
+      <w:r>
+        <w:br w:type="page"/>
+      </w:r>
+    </w:p>
+    <w:p>
+      <w:pPr>
+        <w:spacing w:after="0" w:line="240" w:lineRule="auto"/>
+      </w:pPr>
+      <w:r>
+        <w:lastRenderedPageBreak/>
+        <w:t>NOTES</w:t>
+      </w:r>
+    </w:p>
+    <w:p>
+      <w:pPr>
+        <w:pStyle w:val="ListParagraph"/>
+        <w:numPr>
+          <w:ilvl w:val="0"/>
+          <w:numId w:val="14"/>
+        </w:numPr>
+        <w:spacing w:after="0" w:line="240" w:lineRule="auto"/>
+      </w:pPr>
+      <w:r>
+        <w:t>Data dictionary / glossary for things like REVGEN_STAGING_INPUT. Provide auto-complete and allow rename to update all usages.</w:t>
+      </w:r>
+    </w:p>
+    <w:p>
+      <w:pPr>
+        <w:pStyle w:val="ListParagraph"/>
+        <w:numPr>
+          <w:ilvl w:val="0"/>
+          <w:numId w:val="14"/>
+        </w:numPr>
+        <w:spacing w:after="0" w:line="240" w:lineRule="auto"/>
+      </w:pPr>
+      <w:r>
+        <w:t>Link to other sections using their name (like confluence links). Rename to update all usages</w:t>
+      </w:r>
+    </w:p>
+    <w:p>
+      <w:pPr>
+        <w:pStyle w:val="ListParagraph"/>
+        <w:numPr>
+          <w:ilvl w:val="0"/>
+          <w:numId w:val="14"/>
+        </w:numPr>
+        <w:spacing w:after="0" w:line="240" w:lineRule="auto"/>
+      </w:pPr>
+      <w:r>
+        <w:t>Be able to mark sections as complete and hide.</w:t>
+      </w:r>
+      <w:r>
+        <w:t xml:space="preserve"> Maybe with checklist?</w:t>
+      </w:r>
+    </w:p>
+    <w:p>
+      <w:pPr>
+        <w:pStyle w:val="ListParagraph"/>
+        <w:numPr>
+          <w:ilvl w:val="0"/>
+          <w:numId w:val="14"/>
+        </w:numPr>
+        <w:spacing w:after="0" w:line="240" w:lineRule="auto"/>
+      </w:pPr>
+      <w:r>
+        <w:t xml:space="preserve">Use maven style versioning (although replace SNAPSHOT with INCOMPLETE, WIP </w:t>
+      </w:r>
+      <w:proofErr w:type="spellStart"/>
+      <w:r>
+        <w:t>etc</w:t>
+      </w:r>
+      <w:proofErr w:type="spellEnd"/>
+      <w:r>
+        <w:t xml:space="preserve">) </w:t>
+      </w:r>
+      <w:r>
+        <w:t>and expose a tag to put in docs.</w:t>
+      </w:r>
+    </w:p>
+    <w:p>
+      <w:pPr>
+        <w:pStyle w:val="ListParagraph"/>
+        <w:numPr>
+          <w:ilvl w:val="0"/>
+          <w:numId w:val="14"/>
+        </w:numPr>
+        <w:spacing w:after="0" w:line="240" w:lineRule="auto"/>
+      </w:pPr>
+      <w:hyperlink r:id="rId7" w:history="1">
+        <w:r>
+          <w:rPr>
+            <w:rStyle w:val="Hyperlink"/>
+          </w:rPr>
+          <w:t>file:///C:/1/Software%20Requirements/LiB0060.html</w:t>
+        </w:r>
+      </w:hyperlink>
+    </w:p>
+    <w:p>
+      <w:pPr>
+        <w:pStyle w:val="ListParagraph"/>
+        <w:numPr>
+          <w:ilvl w:val="0"/>
+          <w:numId w:val="14"/>
+        </w:numPr>
+        <w:spacing w:after="0" w:line="240" w:lineRule="auto"/>
+      </w:pPr>
+      <w:r>
+        <w:t>Traceability matrix</w:t>
+      </w:r>
+    </w:p>
+    <w:p>
+      <w:pPr>
+        <w:pStyle w:val="ListParagraph"/>
+        <w:numPr>
+          <w:ilvl w:val="0"/>
+          <w:numId w:val="14"/>
+        </w:numPr>
+        <w:spacing w:after="0" w:line="240" w:lineRule="auto"/>
+      </w:pPr>
+      <w:r>
+        <w:t>I18n</w:t>
+      </w:r>
+    </w:p>
+    <w:p>
+      <w:pPr>
+        <w:pStyle w:val="ListParagraph"/>
+        <w:numPr>
+          <w:ilvl w:val="0"/>
+          <w:numId w:val="14"/>
+        </w:numPr>
+        <w:spacing w:after="0" w:line="240" w:lineRule="auto"/>
+      </w:pPr>
+      <w:r>
+        <w:t xml:space="preserve">Live </w:t>
+      </w:r>
+      <w:bookmarkStart w:id="17" w:name="_GoBack"/>
+      <w:bookmarkEnd w:id="17"/>
+      <w:r>
+        <w:t>updates</w:t>
+      </w:r>
+    </w:p>
+    <w:p>
+      <w:pPr>
+        <w:spacing w:after="0" w:line="240" w:lineRule="auto"/>
+      </w:pPr>
+    </w:p>
+    <w:tbl>
+      <w:tblPr>
+        <w:tblStyle w:val="LightList-Accent3"/>
+        <w:tblW w:w="0" w:type="auto"/>
+        <w:tblLook w:val="0480" w:firstRow="0" w:lastRow="0" w:firstColumn="1" w:lastColumn="0" w:noHBand="0" w:noVBand="1"/>
+      </w:tblPr>
+      <w:tblGrid>
+        <w:gridCol w:w="817"/>
+        <w:gridCol w:w="7903"/>
+      </w:tblGrid>
+      <w:tr>
+        <w:trPr>
+          <w:cnfStyle w:val="000000100000" w:firstRow="0" w:lastRow="0" w:firstColumn="0" w:lastColumn="0" w:oddVBand="0" w:evenVBand="0" w:oddHBand="1" w:evenHBand="0" w:firstRowFirstColumn="0" w:firstRowLastColumn="0" w:lastRowFirstColumn="0" w:lastRowLastColumn="0"/>
+        </w:trPr>
+        <w:tc>
+          <w:tcPr>
+            <w:cnfStyle w:val="001000000000" w:firstRow="0" w:lastRow="0" w:firstColumn="1" w:lastColumn="0" w:oddVBand="0" w:evenVBand="0" w:oddHBand="0" w:evenHBand="0" w:firstRowFirstColumn="0" w:firstRowLastColumn="0" w:lastRowFirstColumn="0" w:lastRowLastColumn="0"/>
+            <w:tcW w:w="817" w:type="dxa"/>
+            <w:tcBorders>
+              <w:right w:val="single" w:sz="8" w:space="0" w:color="9BBB59" w:themeColor="accent3"/>
+            </w:tcBorders>
+            <w:shd w:val="clear" w:color="auto" w:fill="D6E3BC" w:themeFill="accent3" w:themeFillTint="66"/>
+          </w:tcPr>
+          <w:p>
+            <w:pPr>
+              <w:jc w:val="both"/>
+            </w:pPr>
+            <w:r>
+              <w:t>MF-1</w:t>
+            </w:r>
+          </w:p>
+        </w:tc>
+        <w:tc>
+          <w:tcPr>
+            <w:tcW w:w="7903" w:type="dxa"/>
+            <w:tcBorders>
+              <w:left w:val="single" w:sz="8" w:space="0" w:color="9BBB59" w:themeColor="accent3"/>
+            </w:tcBorders>
+          </w:tcPr>
+          <w:p>
+            <w:pPr>
+              <w:jc w:val="both"/>
+              <w:cnfStyle w:val="000000100000" w:firstRow="0" w:lastRow="0" w:firstColumn="0" w:lastColumn="0" w:oddVBand="0" w:evenVBand="0" w:oddHBand="1" w:evenHBand="0" w:firstRowFirstColumn="0" w:firstRowLastColumn="0" w:lastRowFirstColumn="0" w:lastRowLastColumn="0"/>
+            </w:pPr>
+            <w:r>
+              <w:t>Create, edit, view online requirements docs.</w:t>
+            </w:r>
+          </w:p>
+        </w:tc>
+      </w:tr>
+      <w:tr>
+        <w:tc>
+          <w:tcPr>
+            <w:cnfStyle w:val="001000000000" w:firstRow="0" w:lastRow="0" w:firstColumn="1" w:lastColumn="0" w:oddVBand="0" w:evenVBand="0" w:oddHBand="0" w:evenHBand="0" w:firstRowFirstColumn="0" w:firstRowLastColumn="0" w:lastRowFirstColumn="0" w:lastRowLastColumn="0"/>
+            <w:tcW w:w="817" w:type="dxa"/>
+            <w:tcBorders>
+              <w:right w:val="single" w:sz="8" w:space="0" w:color="9BBB59" w:themeColor="accent3"/>
+            </w:tcBorders>
+            <w:shd w:val="clear" w:color="auto" w:fill="D6E3BC" w:themeFill="accent3" w:themeFillTint="66"/>
+          </w:tcPr>
+          <w:p>
+            <w:pPr>
+              <w:jc w:val="both"/>
+            </w:pPr>
+            <w:r>
+              <w:t>MF-2</w:t>
+            </w:r>
+          </w:p>
+        </w:tc>
+        <w:tc>
+          <w:tcPr>
+            <w:tcW w:w="7903" w:type="dxa"/>
+            <w:tcBorders>
+              <w:left w:val="single" w:sz="8" w:space="0" w:color="9BBB59" w:themeColor="accent3"/>
+            </w:tcBorders>
+          </w:tcPr>
+          <w:p>
+            <w:pPr>
+              <w:jc w:val="both"/>
+              <w:cnfStyle w:val="000000000000" w:firstRow="0" w:lastRow="0" w:firstColumn="0" w:lastColumn="0" w:oddVBand="0" w:evenVBand="0" w:oddHBand="0" w:evenHBand="0" w:firstRowFirstColumn="0" w:firstRowLastColumn="0" w:lastRowFirstColumn="0" w:lastRowLastColumn="0"/>
+            </w:pPr>
+            <w:r>
+              <w:t>Group docs together, usually based on project.</w:t>
+            </w:r>
+          </w:p>
+        </w:tc>
+      </w:tr>
+      <w:tr>
+        <w:trPr>
+          <w:cnfStyle w:val="000000100000" w:firstRow="0" w:lastRow="0" w:firstColumn="0" w:lastColumn="0" w:oddVBand="0" w:evenVBand="0" w:oddHBand="1" w:evenHBand="0" w:firstRowFirstColumn="0" w:firstRowLastColumn="0" w:lastRowFirstColumn="0" w:lastRowLastColumn="0"/>
+        </w:trPr>
+        <w:tc>
+          <w:tcPr>
+            <w:cnfStyle w:val="001000000000" w:firstRow="0" w:lastRow="0" w:firstColumn="1" w:lastColumn="0" w:oddVBand="0" w:evenVBand="0" w:oddHBand="0" w:evenHBand="0" w:firstRowFirstColumn="0" w:firstRowLastColumn="0" w:lastRowFirstColumn="0" w:lastRowLastColumn="0"/>
+            <w:tcW w:w="817" w:type="dxa"/>
+            <w:tcBorders>
+              <w:right w:val="single" w:sz="8" w:space="0" w:color="9BBB59" w:themeColor="accent3"/>
+            </w:tcBorders>
+            <w:shd w:val="clear" w:color="auto" w:fill="D6E3BC" w:themeFill="accent3" w:themeFillTint="66"/>
+          </w:tcPr>
+          <w:p>
+            <w:pPr>
+              <w:jc w:val="both"/>
+            </w:pPr>
+            <w:r>
+              <w:t>MF-3</w:t>
+            </w:r>
+          </w:p>
+        </w:tc>
+        <w:tc>
+          <w:tcPr>
+            <w:tcW w:w="7903" w:type="dxa"/>
+            <w:tcBorders>
+              <w:left w:val="single" w:sz="8" w:space="0" w:color="9BBB59" w:themeColor="accent3"/>
+            </w:tcBorders>
+          </w:tcPr>
+          <w:p>
+            <w:pPr>
+              <w:jc w:val="both"/>
+              <w:cnfStyle w:val="000000100000" w:firstRow="0" w:lastRow="0" w:firstColumn="0" w:lastColumn="0" w:oddVBand="0" w:evenVBand="0" w:oddHBand="1" w:evenHBand="0" w:firstRowFirstColumn="0" w:firstRowLastColumn="0" w:lastRowFirstColumn="0" w:lastRowLastColumn="0"/>
+            </w:pPr>
+            <w:r>
+              <w:t>Search all docs and audit history in a single action.</w:t>
+            </w:r>
+          </w:p>
+        </w:tc>
+      </w:tr>
+      <w:tr>
+        <w:tc>
+          <w:tcPr>
+            <w:cnfStyle w:val="001000000000" w:firstRow="0" w:lastRow="0" w:firstColumn="1" w:lastColumn="0" w:oddVBand="0" w:evenVBand="0" w:oddHBand="0" w:evenHBand="0" w:firstRowFirstColumn="0" w:firstRowLastColumn="0" w:lastRowFirstColumn="0" w:lastRowLastColumn="0"/>
+            <w:tcW w:w="817" w:type="dxa"/>
+            <w:tcBorders>
+              <w:right w:val="single" w:sz="8" w:space="0" w:color="9BBB59" w:themeColor="accent3"/>
+            </w:tcBorders>
+            <w:shd w:val="clear" w:color="auto" w:fill="D6E3BC" w:themeFill="accent3" w:themeFillTint="66"/>
+          </w:tcPr>
+          <w:p>
+            <w:pPr>
+              <w:jc w:val="both"/>
+            </w:pPr>
+            <w:r>
+              <w:t>MF-4</w:t>
+            </w:r>
+          </w:p>
+        </w:tc>
+        <w:tc>
+          <w:tcPr>
+            <w:tcW w:w="7903" w:type="dxa"/>
+            <w:tcBorders>
+              <w:left w:val="single" w:sz="8" w:space="0" w:color="9BBB59" w:themeColor="accent3"/>
+            </w:tcBorders>
+          </w:tcPr>
+          <w:p>
+            <w:pPr>
+              <w:jc w:val="both"/>
+              <w:cnfStyle w:val="000000000000" w:firstRow="0" w:lastRow="0" w:firstColumn="0" w:lastColumn="0" w:oddVBand="0" w:evenVBand="0" w:oddHBand="0" w:evenHBand="0" w:firstRowFirstColumn="0" w:firstRowLastColumn="0" w:lastRowFirstColumn="0" w:lastRowLastColumn="0"/>
+            </w:pPr>
+            <w:r>
+              <w:t>Create templates which users can use to create new docs.</w:t>
+            </w:r>
+          </w:p>
+        </w:tc>
+      </w:tr>
+      <w:tr>
+        <w:trPr>
+          <w:cnfStyle w:val="000000100000" w:firstRow="0" w:lastRow="0" w:firstColumn="0" w:lastColumn="0" w:oddVBand="0" w:evenVBand="0" w:oddHBand="1" w:evenHBand="0" w:firstRowFirstColumn="0" w:firstRowLastColumn="0" w:lastRowFirstColumn="0" w:lastRowLastColumn="0"/>
+        </w:trPr>
+        <w:tc>
+          <w:tcPr>
+            <w:cnfStyle w:val="001000000000" w:firstRow="0" w:lastRow="0" w:firstColumn="1" w:lastColumn="0" w:oddVBand="0" w:evenVBand="0" w:oddHBand="0" w:evenHBand="0" w:firstRowFirstColumn="0" w:firstRowLastColumn="0" w:lastRowFirstColumn="0" w:lastRowLastColumn="0"/>
+            <w:tcW w:w="817" w:type="dxa"/>
+            <w:tcBorders>
+              <w:right w:val="single" w:sz="8" w:space="0" w:color="9BBB59" w:themeColor="accent3"/>
+            </w:tcBorders>
+            <w:shd w:val="clear" w:color="auto" w:fill="D6E3BC" w:themeFill="accent3" w:themeFillTint="66"/>
+          </w:tcPr>
+          <w:p>
+            <w:pPr>
+              <w:jc w:val="both"/>
+            </w:pPr>
+            <w:r>
+              <w:t>MF-5</w:t>
+            </w:r>
+          </w:p>
+        </w:tc>
+        <w:tc>
+          <w:tcPr>
+            <w:tcW w:w="7903" w:type="dxa"/>
+            <w:tcBorders>
+              <w:left w:val="single" w:sz="8" w:space="0" w:color="9BBB59" w:themeColor="accent3"/>
+            </w:tcBorders>
+          </w:tcPr>
+          <w:p>
+            <w:pPr>
+              <w:jc w:val="both"/>
+              <w:cnfStyle w:val="000000100000" w:firstRow="0" w:lastRow="0" w:firstColumn="0" w:lastColumn="0" w:oddVBand="0" w:evenVBand="0" w:oddHBand="1" w:evenHBand="0" w:firstRowFirstColumn="0" w:firstRowLastColumn="0" w:lastRowFirstColumn="0" w:lastRowLastColumn="0"/>
+            </w:pPr>
+            <w:r>
+              <w:t>Strong linking of requirement items.</w:t>
+            </w:r>
+          </w:p>
+          <w:p>
+            <w:pPr>
+              <w:jc w:val="both"/>
+              <w:cnfStyle w:val="000000100000" w:firstRow="0" w:lastRow="0" w:firstColumn="0" w:lastColumn="0" w:oddVBand="0" w:evenVBand="0" w:oddHBand="1" w:evenHBand="0" w:firstRowFirstColumn="0" w:firstRowLastColumn="0" w:lastRowFirstColumn="0" w:lastRowLastColumn="0"/>
+            </w:pPr>
+            <w:r>
+              <w:t>Hover over a key to see the definition; click a key to open the defining document; assistance when creating new references (possibly auto-complete, UI to select from available)</w:t>
+            </w:r>
+          </w:p>
+        </w:tc>
+      </w:tr>
+      <w:tr>
+        <w:tc>
+          <w:tcPr>
+            <w:cnfStyle w:val="001000000000" w:firstRow="0" w:lastRow="0" w:firstColumn="1" w:lastColumn="0" w:oddVBand="0" w:evenVBand="0" w:oddHBand="0" w:evenHBand="0" w:firstRowFirstColumn="0" w:firstRowLastColumn="0" w:lastRowFirstColumn="0" w:lastRowLastColumn="0"/>
+            <w:tcW w:w="817" w:type="dxa"/>
+            <w:tcBorders>
+              <w:right w:val="single" w:sz="8" w:space="0" w:color="9BBB59" w:themeColor="accent3"/>
+            </w:tcBorders>
+            <w:shd w:val="clear" w:color="auto" w:fill="D6E3BC" w:themeFill="accent3" w:themeFillTint="66"/>
+          </w:tcPr>
+          <w:p>
+            <w:pPr>
+              <w:jc w:val="both"/>
+            </w:pPr>
+            <w:r>
+              <w:t>MF-6</w:t>
+            </w:r>
+          </w:p>
+        </w:tc>
+        <w:tc>
+          <w:tcPr>
+            <w:tcW w:w="7903" w:type="dxa"/>
+            <w:tcBorders>
+              <w:left w:val="single" w:sz="8" w:space="0" w:color="9BBB59" w:themeColor="accent3"/>
+            </w:tcBorders>
+          </w:tcPr>
+          <w:p>
+            <w:pPr>
+              <w:jc w:val="both"/>
+              <w:cnfStyle w:val="000000000000" w:firstRow="0" w:lastRow="0" w:firstColumn="0" w:lastColumn="0" w:oddVBand="0" w:evenVBand="0" w:oddHBand="0" w:evenHBand="0" w:firstRowFirstColumn="0" w:firstRowLastColumn="0" w:lastRowFirstColumn="0" w:lastRowLastColumn="0"/>
+            </w:pPr>
+            <w:r>
+              <w:t xml:space="preserve">Validation of references. </w:t>
+            </w:r>
+          </w:p>
+        </w:tc>
+      </w:tr>
+      <w:tr>
+        <w:trPr>
+          <w:cnfStyle w:val="000000100000" w:firstRow="0" w:lastRow="0" w:firstColumn="0" w:lastColumn="0" w:oddVBand="0" w:evenVBand="0" w:oddHBand="1" w:evenHBand="0" w:firstRowFirstColumn="0" w:firstRowLastColumn="0" w:lastRowFirstColumn="0" w:lastRowLastColumn="0"/>
+        </w:trPr>
+        <w:tc>
+          <w:tcPr>
+            <w:cnfStyle w:val="001000000000" w:firstRow="0" w:lastRow="0" w:firstColumn="1" w:lastColumn="0" w:oddVBand="0" w:evenVBand="0" w:oddHBand="0" w:evenHBand="0" w:firstRowFirstColumn="0" w:firstRowLastColumn="0" w:lastRowFirstColumn="0" w:lastRowLastColumn="0"/>
+            <w:tcW w:w="817" w:type="dxa"/>
+            <w:tcBorders>
+              <w:right w:val="single" w:sz="8" w:space="0" w:color="9BBB59" w:themeColor="accent3"/>
+            </w:tcBorders>
+            <w:shd w:val="clear" w:color="auto" w:fill="D6E3BC" w:themeFill="accent3" w:themeFillTint="66"/>
+          </w:tcPr>
+          <w:p>
+            <w:pPr>
+              <w:jc w:val="both"/>
+            </w:pPr>
+            <w:r>
+              <w:t>MF-7</w:t>
+            </w:r>
+          </w:p>
+        </w:tc>
+        <w:tc>
+          <w:tcPr>
+            <w:tcW w:w="7903" w:type="dxa"/>
+            <w:tcBorders>
+              <w:left w:val="single" w:sz="8" w:space="0" w:color="9BBB59" w:themeColor="accent3"/>
+            </w:tcBorders>
+          </w:tcPr>
+          <w:p>
+            <w:pPr>
+              <w:jc w:val="both"/>
+              <w:cnfStyle w:val="000000100000" w:firstRow="0" w:lastRow="0" w:firstColumn="0" w:lastColumn="0" w:oddVBand="0" w:evenVBand="0" w:oddHBand="1" w:evenHBand="0" w:firstRowFirstColumn="0" w:firstRowLastColumn="0" w:lastRowFirstColumn="0" w:lastRowLastColumn="0"/>
+            </w:pPr>
+            <w:r>
+              <w:t>View a map of all document references.</w:t>
+            </w:r>
+          </w:p>
+        </w:tc>
+      </w:tr>
+      <w:tr>
+        <w:tc>
+          <w:tcPr>
+            <w:cnfStyle w:val="001000000000" w:firstRow="0" w:lastRow="0" w:firstColumn="1" w:lastColumn="0" w:oddVBand="0" w:evenVBand="0" w:oddHBand="0" w:evenHBand="0" w:firstRowFirstColumn="0" w:firstRowLastColumn="0" w:lastRowFirstColumn="0" w:lastRowLastColumn="0"/>
+            <w:tcW w:w="817" w:type="dxa"/>
+            <w:tcBorders>
+              <w:right w:val="single" w:sz="8" w:space="0" w:color="9BBB59" w:themeColor="accent3"/>
+            </w:tcBorders>
+            <w:shd w:val="clear" w:color="auto" w:fill="D6E3BC" w:themeFill="accent3" w:themeFillTint="66"/>
+          </w:tcPr>
+          <w:p>
+            <w:pPr>
+              <w:jc w:val="both"/>
+            </w:pPr>
+            <w:r>
+              <w:t>MF-8</w:t>
+            </w:r>
+          </w:p>
+        </w:tc>
+        <w:tc>
+          <w:tcPr>
+            <w:tcW w:w="7903" w:type="dxa"/>
+            <w:tcBorders>
+              <w:left w:val="single" w:sz="8" w:space="0" w:color="9BBB59" w:themeColor="accent3"/>
+            </w:tcBorders>
+          </w:tcPr>
+          <w:p>
+            <w:pPr>
+              <w:jc w:val="both"/>
+              <w:cnfStyle w:val="000000000000" w:firstRow="0" w:lastRow="0" w:firstColumn="0" w:lastColumn="0" w:oddVBand="0" w:evenVBand="0" w:oddHBand="0" w:evenHBand="0" w:firstRowFirstColumn="0" w:firstRowLastColumn="0" w:lastRowFirstColumn="0" w:lastRowLastColumn="0"/>
+            </w:pPr>
+            <w:r>
+              <w:t>View and search history of all changes.</w:t>
+            </w:r>
+          </w:p>
+        </w:tc>
+      </w:tr>
+      <w:tr>
+        <w:trPr>
+          <w:cnfStyle w:val="000000100000" w:firstRow="0" w:lastRow="0" w:firstColumn="0" w:lastColumn="0" w:oddVBand="0" w:evenVBand="0" w:oddHBand="1" w:evenHBand="0" w:firstRowFirstColumn="0" w:firstRowLastColumn="0" w:lastRowFirstColumn="0" w:lastRowLastColumn="0"/>
+        </w:trPr>
+        <w:tc>
+          <w:tcPr>
+            <w:cnfStyle w:val="001000000000" w:firstRow="0" w:lastRow="0" w:firstColumn="1" w:lastColumn="0" w:oddVBand="0" w:evenVBand="0" w:oddHBand="0" w:evenHBand="0" w:firstRowFirstColumn="0" w:firstRowLastColumn="0" w:lastRowFirstColumn="0" w:lastRowLastColumn="0"/>
+            <w:tcW w:w="817" w:type="dxa"/>
+            <w:tcBorders>
+              <w:right w:val="single" w:sz="8" w:space="0" w:color="9BBB59" w:themeColor="accent3"/>
+            </w:tcBorders>
+            <w:shd w:val="clear" w:color="auto" w:fill="D6E3BC" w:themeFill="accent3" w:themeFillTint="66"/>
+          </w:tcPr>
+          <w:p>
+            <w:pPr>
+              <w:jc w:val="both"/>
+            </w:pPr>
+            <w:r>
+              <w:t>MF-9</w:t>
+            </w:r>
+          </w:p>
+        </w:tc>
+        <w:tc>
+          <w:tcPr>
+            <w:tcW w:w="7903" w:type="dxa"/>
+            <w:tcBorders>
+              <w:left w:val="single" w:sz="8" w:space="0" w:color="9BBB59" w:themeColor="accent3"/>
+            </w:tcBorders>
+          </w:tcPr>
+          <w:p>
+            <w:pPr>
+              <w:jc w:val="both"/>
+              <w:cnfStyle w:val="000000100000" w:firstRow="0" w:lastRow="0" w:firstColumn="0" w:lastColumn="0" w:oddVBand="0" w:evenVBand="0" w:oddHBand="1" w:evenHBand="0" w:firstRowFirstColumn="0" w:firstRowLastColumn="0" w:lastRowFirstColumn="0" w:lastRowLastColumn="0"/>
+            </w:pPr>
+            <w:r>
+              <w:t>Tag versions of documents.</w:t>
+            </w:r>
+          </w:p>
+        </w:tc>
+      </w:tr>
+      <w:tr>
+        <w:tc>
+          <w:tcPr>
+            <w:cnfStyle w:val="001000000000" w:firstRow="0" w:lastRow="0" w:firstColumn="1" w:lastColumn="0" w:oddVBand="0" w:evenVBand="0" w:oddHBand="0" w:evenHBand="0" w:firstRowFirstColumn="0" w:firstRowLastColumn="0" w:lastRowFirstColumn="0" w:lastRowLastColumn="0"/>
+            <w:tcW w:w="817" w:type="dxa"/>
+            <w:tcBorders>
+              <w:right w:val="single" w:sz="8" w:space="0" w:color="9BBB59" w:themeColor="accent3"/>
+            </w:tcBorders>
+            <w:shd w:val="clear" w:color="auto" w:fill="D6E3BC" w:themeFill="accent3" w:themeFillTint="66"/>
+          </w:tcPr>
+          <w:p>
+            <w:pPr>
+              <w:jc w:val="both"/>
+            </w:pPr>
+            <w:r>
+              <w:t>MF-10</w:t>
+            </w:r>
+          </w:p>
+        </w:tc>
+        <w:tc>
+          <w:tcPr>
+            <w:tcW w:w="7903" w:type="dxa"/>
+            <w:tcBorders>
+              <w:left w:val="single" w:sz="8" w:space="0" w:color="9BBB59" w:themeColor="accent3"/>
+            </w:tcBorders>
+          </w:tcPr>
+          <w:p>
+            <w:pPr>
+              <w:jc w:val="both"/>
+              <w:cnfStyle w:val="000000000000" w:firstRow="0" w:lastRow="0" w:firstColumn="0" w:lastColumn="0" w:oddVBand="0" w:evenVBand="0" w:oddHBand="0" w:evenHBand="0" w:firstRowFirstColumn="0" w:firstRowLastColumn="0" w:lastRowFirstColumn="0" w:lastRowLastColumn="0"/>
+            </w:pPr>
+            <w:r>
+              <w:t xml:space="preserve">View documents according to a </w:t>
+            </w:r>
+            <w:proofErr w:type="gramStart"/>
+            <w:r>
+              <w:t>tag,</w:t>
+            </w:r>
+            <w:proofErr w:type="gramEnd"/>
+            <w:r>
+              <w:t xml:space="preserve"> or as-at a specific point in time.</w:t>
+            </w:r>
+          </w:p>
+        </w:tc>
+      </w:tr>
+      <w:tr>
+        <w:trPr>
+          <w:cnfStyle w:val="000000100000" w:firstRow="0" w:lastRow="0" w:firstColumn="0" w:lastColumn="0" w:oddVBand="0" w:evenVBand="0" w:oddHBand="1" w:evenHBand="0" w:firstRowFirstColumn="0" w:firstRowLastColumn="0" w:lastRowFirstColumn="0" w:lastRowLastColumn="0"/>
+        </w:trPr>
+        <w:tc>
+          <w:tcPr>
+            <w:cnfStyle w:val="001000000000" w:firstRow="0" w:lastRow="0" w:firstColumn="1" w:lastColumn="0" w:oddVBand="0" w:evenVBand="0" w:oddHBand="0" w:evenHBand="0" w:firstRowFirstColumn="0" w:firstRowLastColumn="0" w:lastRowFirstColumn="0" w:lastRowLastColumn="0"/>
+            <w:tcW w:w="817" w:type="dxa"/>
+            <w:tcBorders>
+              <w:right w:val="single" w:sz="8" w:space="0" w:color="9BBB59" w:themeColor="accent3"/>
+            </w:tcBorders>
+            <w:shd w:val="clear" w:color="auto" w:fill="D6E3BC" w:themeFill="accent3" w:themeFillTint="66"/>
+          </w:tcPr>
+          <w:p>
+            <w:pPr>
+              <w:jc w:val="both"/>
+            </w:pPr>
+            <w:r>
+              <w:t>MF-11</w:t>
+            </w:r>
+          </w:p>
+        </w:tc>
+        <w:tc>
+          <w:tcPr>
+            <w:tcW w:w="7903" w:type="dxa"/>
+            <w:tcBorders>
+              <w:left w:val="single" w:sz="8" w:space="0" w:color="9BBB59" w:themeColor="accent3"/>
+            </w:tcBorders>
+          </w:tcPr>
+          <w:p>
+            <w:pPr>
+              <w:jc w:val="both"/>
+              <w:cnfStyle w:val="000000100000" w:firstRow="0" w:lastRow="0" w:firstColumn="0" w:lastColumn="0" w:oddVBand="0" w:evenVBand="0" w:oddHBand="1" w:evenHBand="0" w:firstRowFirstColumn="0" w:firstRowLastColumn="0" w:lastRowFirstColumn="0" w:lastRowLastColumn="0"/>
+            </w:pPr>
+            <w:r>
+              <w:t>Include system-maintained metadata in a document. (Example: revision history)</w:t>
+            </w:r>
+          </w:p>
+        </w:tc>
+      </w:tr>
+      <w:tr>
+        <w:tc>
+          <w:tcPr>
+            <w:cnfStyle w:val="001000000000" w:firstRow="0" w:lastRow="0" w:firstColumn="1" w:lastColumn="0" w:oddVBand="0" w:evenVBand="0" w:oddHBand="0" w:evenHBand="0" w:firstRowFirstColumn="0" w:firstRowLastColumn="0" w:lastRowFirstColumn="0" w:lastRowLastColumn="0"/>
+            <w:tcW w:w="817" w:type="dxa"/>
+            <w:tcBorders>
+              <w:right w:val="single" w:sz="8" w:space="0" w:color="9BBB59" w:themeColor="accent3"/>
+            </w:tcBorders>
+            <w:shd w:val="clear" w:color="auto" w:fill="D6E3BC" w:themeFill="accent3" w:themeFillTint="66"/>
+          </w:tcPr>
+          <w:p>
+            <w:pPr>
+              <w:jc w:val="both"/>
+            </w:pPr>
+            <w:r>
+              <w:t>MF-12</w:t>
+            </w:r>
+          </w:p>
+        </w:tc>
+        <w:tc>
+          <w:tcPr>
+            <w:tcW w:w="7903" w:type="dxa"/>
+            <w:tcBorders>
+              <w:left w:val="single" w:sz="8" w:space="0" w:color="9BBB59" w:themeColor="accent3"/>
+            </w:tcBorders>
+          </w:tcPr>
+          <w:p>
+            <w:pPr>
+              <w:jc w:val="both"/>
+              <w:cnfStyle w:val="000000000000" w:firstRow="0" w:lastRow="0" w:firstColumn="0" w:lastColumn="0" w:oddVBand="0" w:evenVBand="0" w:oddHBand="0" w:evenHBand="0" w:firstRowFirstColumn="0" w:firstRowLastColumn="0" w:lastRowFirstColumn="0" w:lastRowLastColumn="0"/>
+            </w:pPr>
+            <w:r>
+              <w:t xml:space="preserve">Track and view TODOs and TBDs. (Optionally filter and aggregate by document, assignee, </w:t>
+            </w:r>
+            <w:proofErr w:type="gramStart"/>
+            <w:r>
+              <w:t>inception</w:t>
+            </w:r>
+            <w:proofErr w:type="gramEnd"/>
+            <w:r>
+              <w:t>/target date.)</w:t>
+            </w:r>
+          </w:p>
+        </w:tc>
+      </w:tr>
+      <w:tr>
+        <w:trPr>
+          <w:cnfStyle w:val="000000100000" w:firstRow="0" w:lastRow="0" w:firstColumn="0" w:lastColumn="0" w:oddVBand="0" w:evenVBand="0" w:oddHBand="1" w:evenHBand="0" w:firstRowFirstColumn="0" w:firstRowLastColumn="0" w:lastRowFirstColumn="0" w:lastRowLastColumn="0"/>
+        </w:trPr>
+        <w:tc>
+          <w:tcPr>
+            <w:cnfStyle w:val="001000000000" w:firstRow="0" w:lastRow="0" w:firstColumn="1" w:lastColumn="0" w:oddVBand="0" w:evenVBand="0" w:oddHBand="0" w:evenHBand="0" w:firstRowFirstColumn="0" w:firstRowLastColumn="0" w:lastRowFirstColumn="0" w:lastRowLastColumn="0"/>
+            <w:tcW w:w="817" w:type="dxa"/>
+            <w:tcBorders>
+              <w:right w:val="single" w:sz="8" w:space="0" w:color="9BBB59" w:themeColor="accent3"/>
+            </w:tcBorders>
+            <w:shd w:val="clear" w:color="auto" w:fill="D6E3BC" w:themeFill="accent3" w:themeFillTint="66"/>
+          </w:tcPr>
+          <w:p>
+            <w:pPr>
+              <w:jc w:val="both"/>
+            </w:pPr>
+            <w:r>
+              <w:t>MF-13</w:t>
+            </w:r>
+          </w:p>
+        </w:tc>
+        <w:tc>
+          <w:tcPr>
+            <w:tcW w:w="7903" w:type="dxa"/>
+            <w:tcBorders>
+              <w:left w:val="single" w:sz="8" w:space="0" w:color="9BBB59" w:themeColor="accent3"/>
+            </w:tcBorders>
+          </w:tcPr>
+          <w:p>
+            <w:pPr>
+              <w:jc w:val="both"/>
+              <w:cnfStyle w:val="000000100000" w:firstRow="0" w:lastRow="0" w:firstColumn="0" w:lastColumn="0" w:oddVBand="0" w:evenVBand="0" w:oddHBand="1" w:evenHBand="0" w:firstRowFirstColumn="0" w:firstRowLastColumn="0" w:lastRowFirstColumn="0" w:lastRowLastColumn="0"/>
+            </w:pPr>
+            <w:r>
+              <w:t>View help for a section of a document. This can be provided by the template and can also show examples from other docs in the system (provided the user has access).</w:t>
+            </w:r>
+          </w:p>
+        </w:tc>
+      </w:tr>
+      <w:tr>
+        <w:tc>
+          <w:tcPr>
+            <w:cnfStyle w:val="001000000000" w:firstRow="0" w:lastRow="0" w:firstColumn="1" w:lastColumn="0" w:oddVBand="0" w:evenVBand="0" w:oddHBand="0" w:evenHBand="0" w:firstRowFirstColumn="0" w:firstRowLastColumn="0" w:lastRowFirstColumn="0" w:lastRowLastColumn="0"/>
+            <w:tcW w:w="817" w:type="dxa"/>
+            <w:tcBorders>
+              <w:right w:val="single" w:sz="8" w:space="0" w:color="9BBB59" w:themeColor="accent3"/>
+            </w:tcBorders>
+            <w:shd w:val="clear" w:color="auto" w:fill="D6E3BC" w:themeFill="accent3" w:themeFillTint="66"/>
+          </w:tcPr>
+          <w:p>
+            <w:pPr>
+              <w:jc w:val="both"/>
+            </w:pPr>
+            <w:r>
+              <w:t>MF-14</w:t>
+            </w:r>
+          </w:p>
+        </w:tc>
+        <w:tc>
+          <w:tcPr>
+            <w:tcW w:w="7903" w:type="dxa"/>
+            <w:tcBorders>
+              <w:left w:val="single" w:sz="8" w:space="0" w:color="9BBB59" w:themeColor="accent3"/>
+            </w:tcBorders>
+          </w:tcPr>
+          <w:p>
+            <w:pPr>
+              <w:jc w:val="both"/>
+              <w:cnfStyle w:val="000000000000" w:firstRow="0" w:lastRow="0" w:firstColumn="0" w:lastColumn="0" w:oddVBand="0" w:evenVBand="0" w:oddHBand="0" w:evenHBand="0" w:firstRowFirstColumn="0" w:firstRowLastColumn="0" w:lastRowFirstColumn="0" w:lastRowLastColumn="0"/>
+            </w:pPr>
+            <w:r>
+              <w:t>Store diagrams in whatever format the user likes, together with a graphic copy that is embedded into documents.</w:t>
+            </w:r>
+          </w:p>
+        </w:tc>
+      </w:tr>
+      <w:tr>
+        <w:trPr>
+          <w:cnfStyle w:val="000000100000" w:firstRow="0" w:lastRow="0" w:firstColumn="0" w:lastColumn="0" w:oddVBand="0" w:evenVBand="0" w:oddHBand="1" w:evenHBand="0" w:firstRowFirstColumn="0" w:firstRowLastColumn="0" w:lastRowFirstColumn="0" w:lastRowLastColumn="0"/>
+        </w:trPr>
+        <w:tc>
+          <w:tcPr>
+            <w:cnfStyle w:val="001000000000" w:firstRow="0" w:lastRow="0" w:firstColumn="1" w:lastColumn="0" w:oddVBand="0" w:evenVBand="0" w:oddHBand="0" w:evenHBand="0" w:firstRowFirstColumn="0" w:firstRowLastColumn="0" w:lastRowFirstColumn="0" w:lastRowLastColumn="0"/>
+            <w:tcW w:w="817" w:type="dxa"/>
+            <w:tcBorders>
+              <w:right w:val="single" w:sz="8" w:space="0" w:color="9BBB59" w:themeColor="accent3"/>
+            </w:tcBorders>
+            <w:shd w:val="clear" w:color="auto" w:fill="D6E3BC" w:themeFill="accent3" w:themeFillTint="66"/>
+          </w:tcPr>
+          <w:p>
+            <w:pPr>
+              <w:jc w:val="both"/>
+            </w:pPr>
+            <w:r>
+              <w:t>MF-15</w:t>
+            </w:r>
+          </w:p>
+        </w:tc>
+        <w:tc>
+          <w:tcPr>
+            <w:tcW w:w="7903" w:type="dxa"/>
+            <w:tcBorders>
+              <w:left w:val="single" w:sz="8" w:space="0" w:color="9BBB59" w:themeColor="accent3"/>
+            </w:tcBorders>
+          </w:tcPr>
+          <w:p>
+            <w:pPr>
+              <w:jc w:val="both"/>
+              <w:cnfStyle w:val="000000100000" w:firstRow="0" w:lastRow="0" w:firstColumn="0" w:lastColumn="0" w:oddVBand="0" w:evenVBand="0" w:oddHBand="1" w:evenHBand="0" w:firstRowFirstColumn="0" w:firstRowLastColumn="0" w:lastRowFirstColumn="0" w:lastRowLastColumn="0"/>
+            </w:pPr>
+            <w:r>
+              <w:t>Control who has view, read and write access to documents.</w:t>
+            </w:r>
+          </w:p>
+        </w:tc>
+      </w:tr>
+      <w:tr>
+        <w:tc>
+          <w:tcPr>
+            <w:cnfStyle w:val="001000000000" w:firstRow="0" w:lastRow="0" w:firstColumn="1" w:lastColumn="0" w:oddVBand="0" w:evenVBand="0" w:oddHBand="0" w:evenHBand="0" w:firstRowFirstColumn="0" w:firstRowLastColumn="0" w:lastRowFirstColumn="0" w:lastRowLastColumn="0"/>
+            <w:tcW w:w="817" w:type="dxa"/>
+            <w:tcBorders>
+              <w:right w:val="single" w:sz="8" w:space="0" w:color="9BBB59" w:themeColor="accent3"/>
+            </w:tcBorders>
+            <w:shd w:val="clear" w:color="auto" w:fill="D6E3BC" w:themeFill="accent3" w:themeFillTint="66"/>
+          </w:tcPr>
+          <w:p>
+            <w:pPr>
+              <w:jc w:val="both"/>
+            </w:pPr>
+            <w:r>
+              <w:t>MF-16</w:t>
+            </w:r>
+          </w:p>
+        </w:tc>
+        <w:tc>
+          <w:tcPr>
+            <w:tcW w:w="7903" w:type="dxa"/>
+            <w:tcBorders>
+              <w:left w:val="single" w:sz="8" w:space="0" w:color="9BBB59" w:themeColor="accent3"/>
+            </w:tcBorders>
+          </w:tcPr>
+          <w:p>
+            <w:pPr>
+              <w:jc w:val="both"/>
+              <w:cnfStyle w:val="000000000000" w:firstRow="0" w:lastRow="0" w:firstColumn="0" w:lastColumn="0" w:oddVBand="0" w:evenVBand="0" w:oddHBand="0" w:evenHBand="0" w:firstRowFirstColumn="0" w:firstRowLastColumn="0" w:lastRowFirstColumn="0" w:lastRowLastColumn="0"/>
+            </w:pPr>
+            <w:r>
+              <w:t>Request and track sign-off from specified users.</w:t>
+            </w:r>
+          </w:p>
+        </w:tc>
+      </w:tr>
+      <w:tr>
+        <w:trPr>
+          <w:cnfStyle w:val="000000100000" w:firstRow="0" w:lastRow="0" w:firstColumn="0" w:lastColumn="0" w:oddVBand="0" w:evenVBand="0" w:oddHBand="1" w:evenHBand="0" w:firstRowFirstColumn="0" w:firstRowLastColumn="0" w:lastRowFirstColumn="0" w:lastRowLastColumn="0"/>
+        </w:trPr>
+        <w:tc>
+          <w:tcPr>
+            <w:cnfStyle w:val="001000000000" w:firstRow="0" w:lastRow="0" w:firstColumn="1" w:lastColumn="0" w:oddVBand="0" w:evenVBand="0" w:oddHBand="0" w:evenHBand="0" w:firstRowFirstColumn="0" w:firstRowLastColumn="0" w:lastRowFirstColumn="0" w:lastRowLastColumn="0"/>
+            <w:tcW w:w="817" w:type="dxa"/>
+            <w:tcBorders>
+              <w:right w:val="single" w:sz="8" w:space="0" w:color="9BBB59" w:themeColor="accent3"/>
+            </w:tcBorders>
+            <w:shd w:val="clear" w:color="auto" w:fill="D6E3BC" w:themeFill="accent3" w:themeFillTint="66"/>
+          </w:tcPr>
+          <w:p>
+            <w:pPr>
+              <w:jc w:val="both"/>
+            </w:pPr>
+            <w:r>
+              <w:t>MF-17</w:t>
+            </w:r>
+          </w:p>
+        </w:tc>
+        <w:tc>
+          <w:tcPr>
+            <w:tcW w:w="7903" w:type="dxa"/>
+            <w:tcBorders>
+              <w:left w:val="single" w:sz="8" w:space="0" w:color="9BBB59" w:themeColor="accent3"/>
+            </w:tcBorders>
+          </w:tcPr>
+          <w:p>
+            <w:pPr>
+              <w:jc w:val="both"/>
+              <w:cnfStyle w:val="000000100000" w:firstRow="0" w:lastRow="0" w:firstColumn="0" w:lastColumn="0" w:oddVBand="0" w:evenVBand="0" w:oddHBand="1" w:evenHBand="0" w:firstRowFirstColumn="0" w:firstRowLastColumn="0" w:lastRowFirstColumn="0" w:lastRowLastColumn="0"/>
+            </w:pPr>
+            <w:r>
+              <w:t>Print a selection of documents, and optionally all referenced documents.</w:t>
+            </w:r>
+          </w:p>
+        </w:tc>
+      </w:tr>
+      <w:tr>
+        <w:tc>
+          <w:tcPr>
+            <w:cnfStyle w:val="001000000000" w:firstRow="0" w:lastRow="0" w:firstColumn="1" w:lastColumn="0" w:oddVBand="0" w:evenVBand="0" w:oddHBand="0" w:evenHBand="0" w:firstRowFirstColumn="0" w:firstRowLastColumn="0" w:lastRowFirstColumn="0" w:lastRowLastColumn="0"/>
+            <w:tcW w:w="817" w:type="dxa"/>
+            <w:tcBorders>
+              <w:right w:val="single" w:sz="8" w:space="0" w:color="9BBB59" w:themeColor="accent3"/>
+            </w:tcBorders>
+            <w:shd w:val="clear" w:color="auto" w:fill="D6E3BC" w:themeFill="accent3" w:themeFillTint="66"/>
+          </w:tcPr>
+          <w:p>
+            <w:pPr>
+              <w:jc w:val="both"/>
+            </w:pPr>
+            <w:r>
+              <w:t>MF-18</w:t>
+            </w:r>
+          </w:p>
+        </w:tc>
+        <w:tc>
+          <w:tcPr>
+            <w:tcW w:w="7903" w:type="dxa"/>
+            <w:tcBorders>
+              <w:left w:val="single" w:sz="8" w:space="0" w:color="9BBB59" w:themeColor="accent3"/>
+            </w:tcBorders>
+          </w:tcPr>
+          <w:p>
+            <w:pPr>
+              <w:jc w:val="both"/>
+              <w:cnfStyle w:val="000000000000" w:firstRow="0" w:lastRow="0" w:firstColumn="0" w:lastColumn="0" w:oddVBand="0" w:evenVBand="0" w:oddHBand="0" w:evenHBand="0" w:firstRowFirstColumn="0" w:firstRowLastColumn="0" w:lastRowFirstColumn="0" w:lastRowLastColumn="0"/>
+            </w:pPr>
+            <w:r>
+              <w:t>Export to Acrobat Reader (PDF) and Microsoft Word (DOCX).</w:t>
+            </w:r>
+          </w:p>
+        </w:tc>
+      </w:tr>
+      <w:tr>
+        <w:trPr>
+          <w:cnfStyle w:val="000000100000" w:firstRow="0" w:lastRow="0" w:firstColumn="0" w:lastColumn="0" w:oddVBand="0" w:evenVBand="0" w:oddHBand="1" w:evenHBand="0" w:firstRowFirstColumn="0" w:firstRowLastColumn="0" w:lastRowFirstColumn="0" w:lastRowLastColumn="0"/>
+        </w:trPr>
+        <w:tc>
+          <w:tcPr>
+            <w:cnfStyle w:val="001000000000" w:firstRow="0" w:lastRow="0" w:firstColumn="1" w:lastColumn="0" w:oddVBand="0" w:evenVBand="0" w:oddHBand="0" w:evenHBand="0" w:firstRowFirstColumn="0" w:firstRowLastColumn="0" w:lastRowFirstColumn="0" w:lastRowLastColumn="0"/>
+            <w:tcW w:w="817" w:type="dxa"/>
+            <w:tcBorders>
+              <w:right w:val="single" w:sz="8" w:space="0" w:color="9BBB59" w:themeColor="accent3"/>
+            </w:tcBorders>
+            <w:shd w:val="clear" w:color="auto" w:fill="D6E3BC" w:themeFill="accent3" w:themeFillTint="66"/>
+          </w:tcPr>
+          <w:p>
+            <w:pPr>
+              <w:jc w:val="both"/>
+            </w:pPr>
+            <w:r>
+              <w:t>MF-19</w:t>
+            </w:r>
+          </w:p>
+        </w:tc>
+        <w:tc>
+          <w:tcPr>
+            <w:tcW w:w="7903" w:type="dxa"/>
+            <w:tcBorders>
+              <w:left w:val="single" w:sz="8" w:space="0" w:color="9BBB59" w:themeColor="accent3"/>
+            </w:tcBorders>
+          </w:tcPr>
+          <w:p>
+            <w:pPr>
+              <w:jc w:val="both"/>
+              <w:cnfStyle w:val="000000100000" w:firstRow="0" w:lastRow="0" w:firstColumn="0" w:lastColumn="0" w:oddVBand="0" w:evenVBand="0" w:oddHBand="1" w:evenHBand="0" w:firstRowFirstColumn="0" w:firstRowLastColumn="0" w:lastRowFirstColumn="0" w:lastRowLastColumn="0"/>
+            </w:pPr>
+            <w:r>
+              <w:t>Users can propose changes which relevant users can accept/reject.</w:t>
+            </w:r>
+          </w:p>
+        </w:tc>
+      </w:tr>
+      <w:tr>
+        <w:tc>
+          <w:tcPr>
+            <w:cnfStyle w:val="001000000000" w:firstRow="0" w:lastRow="0" w:firstColumn="1" w:lastColumn="0" w:oddVBand="0" w:evenVBand="0" w:oddHBand="0" w:evenHBand="0" w:firstRowFirstColumn="0" w:firstRowLastColumn="0" w:lastRowFirstColumn="0" w:lastRowLastColumn="0"/>
+            <w:tcW w:w="817" w:type="dxa"/>
+            <w:tcBorders>
+              <w:right w:val="single" w:sz="8" w:space="0" w:color="9BBB59" w:themeColor="accent3"/>
+            </w:tcBorders>
+            <w:shd w:val="clear" w:color="auto" w:fill="D6E3BC" w:themeFill="accent3" w:themeFillTint="66"/>
+          </w:tcPr>
+          <w:p>
+            <w:pPr>
+              <w:jc w:val="both"/>
+            </w:pPr>
+            <w:r>
+              <w:t>MF-20</w:t>
+            </w:r>
+          </w:p>
+        </w:tc>
+        <w:tc>
+          <w:tcPr>
+            <w:tcW w:w="7903" w:type="dxa"/>
+            <w:tcBorders>
+              <w:left w:val="single" w:sz="8" w:space="0" w:color="9BBB59" w:themeColor="accent3"/>
+            </w:tcBorders>
+          </w:tcPr>
+          <w:p>
+            <w:pPr>
+              <w:jc w:val="both"/>
+              <w:cnfStyle w:val="000000000000" w:firstRow="0" w:lastRow="0" w:firstColumn="0" w:lastColumn="0" w:oddVBand="0" w:evenVBand="0" w:oddHBand="0" w:evenHBand="0" w:firstRowFirstColumn="0" w:firstRowLastColumn="0" w:lastRowFirstColumn="0" w:lastRowLastColumn="0"/>
+            </w:pPr>
+            <w:r>
+              <w:t>Broadcast document changes to users. Notifications can be after a change is made, or periodically such as a weekly change email.</w:t>
+            </w:r>
+          </w:p>
+        </w:tc>
+      </w:tr>
+      <w:tr>
+        <w:trPr>
+          <w:cnfStyle w:val="000000100000" w:firstRow="0" w:lastRow="0" w:firstColumn="0" w:lastColumn="0" w:oddVBand="0" w:evenVBand="0" w:oddHBand="1" w:evenHBand="0" w:firstRowFirstColumn="0" w:firstRowLastColumn="0" w:lastRowFirstColumn="0" w:lastRowLastColumn="0"/>
+        </w:trPr>
+        <w:tc>
+          <w:tcPr>
+            <w:cnfStyle w:val="001000000000" w:firstRow="0" w:lastRow="0" w:firstColumn="1" w:lastColumn="0" w:oddVBand="0" w:evenVBand="0" w:oddHBand="0" w:evenHBand="0" w:firstRowFirstColumn="0" w:firstRowLastColumn="0" w:lastRowFirstColumn="0" w:lastRowLastColumn="0"/>
+            <w:tcW w:w="817" w:type="dxa"/>
+            <w:tcBorders>
+              <w:right w:val="single" w:sz="8" w:space="0" w:color="9BBB59" w:themeColor="accent3"/>
+            </w:tcBorders>
+            <w:shd w:val="clear" w:color="auto" w:fill="D6E3BC" w:themeFill="accent3" w:themeFillTint="66"/>
+          </w:tcPr>
+          <w:p>
+            <w:pPr>
+              <w:jc w:val="both"/>
+            </w:pPr>
+            <w:r>
+              <w:t>MF-21</w:t>
+            </w:r>
+          </w:p>
+        </w:tc>
+        <w:tc>
+          <w:tcPr>
+            <w:tcW w:w="7903" w:type="dxa"/>
+            <w:tcBorders>
+              <w:left w:val="single" w:sz="8" w:space="0" w:color="9BBB59" w:themeColor="accent3"/>
+            </w:tcBorders>
+          </w:tcPr>
+          <w:p>
+            <w:pPr>
+              <w:jc w:val="both"/>
+              <w:cnfStyle w:val="000000100000" w:firstRow="0" w:lastRow="0" w:firstColumn="0" w:lastColumn="0" w:oddVBand="0" w:evenVBand="0" w:oddHBand="1" w:evenHBand="0" w:firstRowFirstColumn="0" w:firstRowLastColumn="0" w:lastRowFirstColumn="0" w:lastRowLastColumn="0"/>
+            </w:pPr>
+            <w:r>
+              <w:t>Users can review sections of documents. Who and what can be defined in rules, and explicitly requested.</w:t>
+            </w:r>
+          </w:p>
+        </w:tc>
+      </w:tr>
+    </w:tbl>
     <w:p>
       <w:pPr>
         <w:spacing w:after="0" w:line="240" w:lineRule="auto"/>
@@ -12307,7 +13982,7 @@
 </file>
 
 <file path=customXml/itemProps1.xml><?xml version="1.0" encoding="utf-8"?>
-<ds:datastoreItem xmlns:ds="http://schemas.openxmlformats.org/officeDocument/2006/customXml" ds:itemID="{B0F488EC-D04C-4779-AB11-7DBE509D490E}">
+<ds:datastoreItem xmlns:ds="http://schemas.openxmlformats.org/officeDocument/2006/customXml" ds:itemID="{E2762B09-95EE-4BE7-A130-6B2CDEC3CBFC}">
   <ds:schemaRefs>
     <ds:schemaRef ds:uri="http://schemas.openxmlformats.org/officeDocument/2006/bibliography"/>
   </ds:schemaRefs>

</xml_diff>